<commit_message>
avanzando con el modulo de generar acta, funciona poco y es lento
</commit_message>
<xml_diff>
--- a/plantillas/entrega.docx
+++ b/plantillas/entrega.docx
@@ -1,6 +1,6 @@
 
 <file path=word/document.xml><?xml version="1.0" encoding="utf-8"?>
-<w:document xmlns:wpc="http://schemas.microsoft.com/office/word/2010/wordprocessingCanvas" xmlns:cx="http://schemas.microsoft.com/office/drawing/2014/chartex" xmlns:mc="http://schemas.openxmlformats.org/markup-compatibility/2006" xmlns:o="urn:schemas-microsoft-com:office:office" xmlns:r="http://schemas.openxmlformats.org/officeDocument/2006/relationships" xmlns:m="http://schemas.openxmlformats.org/officeDocument/2006/math" xmlns:v="urn:schemas-microsoft-com:vml" xmlns:wp14="http://schemas.microsoft.com/office/word/2010/wordprocessingDrawing" xmlns:wp="http://schemas.openxmlformats.org/drawingml/2006/wordprocessingDrawing" xmlns:w10="urn:schemas-microsoft-com:office:word" xmlns:w="http://schemas.openxmlformats.org/wordprocessingml/2006/main" xmlns:w14="http://schemas.microsoft.com/office/word/2010/wordml" xmlns:w15="http://schemas.microsoft.com/office/word/2012/wordml" xmlns:w16se="http://schemas.microsoft.com/office/word/2015/wordml/symex" xmlns:wpg="http://schemas.microsoft.com/office/word/2010/wordprocessingGroup" xmlns:wpi="http://schemas.microsoft.com/office/word/2010/wordprocessingInk" xmlns:wne="http://schemas.microsoft.com/office/word/2006/wordml" xmlns:wps="http://schemas.microsoft.com/office/word/2010/wordprocessingShape" mc:Ignorable="w14 w15 w16se wp14">
+<w:document xmlns:wpc="http://schemas.microsoft.com/office/word/2010/wordprocessingCanvas" xmlns:cx="http://schemas.microsoft.com/office/drawing/2014/chartex" xmlns:cx1="http://schemas.microsoft.com/office/drawing/2015/9/8/chartex" xmlns:cx2="http://schemas.microsoft.com/office/drawing/2015/10/21/chartex" xmlns:cx3="http://schemas.microsoft.com/office/drawing/2016/5/9/chartex" xmlns:cx4="http://schemas.microsoft.com/office/drawing/2016/5/10/chartex" xmlns:cx5="http://schemas.microsoft.com/office/drawing/2016/5/11/chartex" xmlns:cx6="http://schemas.microsoft.com/office/drawing/2016/5/12/chartex" xmlns:cx7="http://schemas.microsoft.com/office/drawing/2016/5/13/chartex" xmlns:cx8="http://schemas.microsoft.com/office/drawing/2016/5/14/chartex" xmlns:mc="http://schemas.openxmlformats.org/markup-compatibility/2006" xmlns:aink="http://schemas.microsoft.com/office/drawing/2016/ink" xmlns:am3d="http://schemas.microsoft.com/office/drawing/2017/model3d" xmlns:o="urn:schemas-microsoft-com:office:office" xmlns:oel="http://schemas.microsoft.com/office/2019/extlst" xmlns:r="http://schemas.openxmlformats.org/officeDocument/2006/relationships" xmlns:m="http://schemas.openxmlformats.org/officeDocument/2006/math" xmlns:v="urn:schemas-microsoft-com:vml" xmlns:wp14="http://schemas.microsoft.com/office/word/2010/wordprocessingDrawing" xmlns:wp="http://schemas.openxmlformats.org/drawingml/2006/wordprocessingDrawing" xmlns:w10="urn:schemas-microsoft-com:office:word" xmlns:w="http://schemas.openxmlformats.org/wordprocessingml/2006/main" xmlns:w14="http://schemas.microsoft.com/office/word/2010/wordml" xmlns:w15="http://schemas.microsoft.com/office/word/2012/wordml" xmlns:w16cex="http://schemas.microsoft.com/office/word/2018/wordml/cex" xmlns:w16cid="http://schemas.microsoft.com/office/word/2016/wordml/cid" xmlns:w16="http://schemas.microsoft.com/office/word/2018/wordml" xmlns:w16du="http://schemas.microsoft.com/office/word/2023/wordml/word16du" xmlns:w16sdtdh="http://schemas.microsoft.com/office/word/2020/wordml/sdtdatahash" xmlns:w16sdtfl="http://schemas.microsoft.com/office/word/2024/wordml/sdtformatlock" xmlns:w16se="http://schemas.microsoft.com/office/word/2015/wordml/symex" xmlns:wpg="http://schemas.microsoft.com/office/word/2010/wordprocessingGroup" xmlns:wpi="http://schemas.microsoft.com/office/word/2010/wordprocessingInk" xmlns:wne="http://schemas.microsoft.com/office/word/2006/wordml" xmlns:wps="http://schemas.microsoft.com/office/word/2010/wordprocessingShape" mc:Ignorable="w14 w15 w16se w16cid w16 w16cex w16sdtdh w16sdtfl w16du wp14">
   <w:body>
     <w:p>
       <w:pPr>
@@ -10,8 +10,6 @@
           <w:rFonts w:ascii="Times New Roman"/>
         </w:rPr>
       </w:pPr>
-      <w:bookmarkStart w:id="0" w:name="_GoBack"/>
-      <w:bookmarkEnd w:id="0"/>
       <w:r>
         <w:rPr>
           <w:rFonts w:ascii="Times New Roman"/>
@@ -21,7 +19,7 @@
         <mc:AlternateContent>
           <mc:Choice Requires="wpg">
             <w:drawing>
-              <wp:inline distT="0" distB="0" distL="0" distR="0">
+              <wp:inline distT="0" distB="0" distL="0" distR="0" wp14:anchorId="2AA2B908" wp14:editId="3FA13E4D">
                 <wp:extent cx="5765800" cy="1136650"/>
                 <wp:effectExtent l="0" t="0" r="0" b="0"/>
                 <wp:docPr id="4" name="Group 4"/>
@@ -644,7 +642,7 @@
           </mc:Choice>
           <mc:Fallback>
             <w:pict>
-              <v:group id="Group 4" o:spid="_x0000_s1026" style="width:454pt;height:89.5pt;mso-position-horizontal-relative:char;mso-position-vertical-relative:line" coordsize="57658,11366" o:gfxdata="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">
+              <v:group w14:anchorId="2AA2B908" id="Group 4" o:spid="_x0000_s1026" style="width:454pt;height:89.5pt;mso-position-horizontal-relative:char;mso-position-vertical-relative:line" coordsize="57658,11366" o:gfxdata="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">
                 <v:shape id="Graphic 5" o:spid="_x0000_s1027" style="position:absolute;left:63;top:63;width:57531;height:11240;visibility:visible;mso-wrap-style:square;v-text-anchor:top" coordsize="5753100,1123950" o:gfxdata="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" path="m,187325l6692,137541,25577,92709,54863,54864,92773,25526,137528,6730,187325,,5565775,r49783,6730l5660390,25526r37845,29338l5727573,92709r18796,44832l5753100,187325r,749300l5746369,986408r-18796,44705l5698235,1069085r-37845,29211l5615558,1117219r-49783,6731l187325,1123950r-49797,-6731l92773,1098296,54863,1069085,25577,1031113,6692,986408,,936625,,187325xe" filled="f" strokecolor="#2c528f" strokeweight="1pt">
                   <v:path arrowok="t"/>
                 </v:shape>
@@ -1283,18 +1281,35 @@
       </w:r>
       <w:r>
         <w:rPr>
-          <w:spacing w:val="-2"/>
-          <w:sz w:val="20"/>
-        </w:rPr>
-        <w:t xml:space="preserve"> {{</w:t>
-      </w:r>
-      <w:r>
-        <w:rPr>
-          <w:rFonts w:ascii="Arial" w:hAnsi="Arial"/>
-          <w:b/>
-          <w:sz w:val="20"/>
-        </w:rPr>
-        <w:t>Admin}}</w:t>
+          <w:sz w:val="20"/>
+        </w:rPr>
+        <w:t xml:space="preserve"> </w:t>
+      </w:r>
+      <w:r>
+        <w:rPr>
+          <w:b/>
+          <w:bCs/>
+          <w:sz w:val="20"/>
+        </w:rPr>
+        <w:t>{{</w:t>
+      </w:r>
+      <w:proofErr w:type="spellStart"/>
+      <w:r>
+        <w:rPr>
+          <w:b/>
+          <w:bCs/>
+          <w:sz w:val="20"/>
+        </w:rPr>
+        <w:t>recibido_por</w:t>
+      </w:r>
+      <w:proofErr w:type="spellEnd"/>
+      <w:r>
+        <w:rPr>
+          <w:b/>
+          <w:bCs/>
+          <w:sz w:val="20"/>
+        </w:rPr>
+        <w:t>}}</w:t>
       </w:r>
       <w:r>
         <w:rPr>
@@ -1381,28 +1396,95 @@
         <w:t>269-DOC-26</w:t>
       </w:r>
       <w:r>
-        <w:t xml:space="preserve">, de fecha </w:t>
-      </w:r>
-      <w:r>
-        <w:t>05</w:t>
-      </w:r>
-      <w:r>
-        <w:t xml:space="preserve">/03/2025, el </w:t>
-      </w:r>
-      <w:r>
-        <w:t>D</w:t>
-      </w:r>
-      <w:r>
-        <w:t>r</w:t>
-      </w:r>
-      <w:r>
-        <w:t>.</w:t>
-      </w:r>
-      <w:r>
-        <w:t xml:space="preserve"> Walter Suarez Farias, </w:t>
-      </w:r>
-      <w:r>
-        <w:t>PROFESOR AUXILIAR 1 TIEMPO COMPLETO</w:t>
+        <w:t>, de fecha</w:t>
+      </w:r>
+      <w:r>
+        <w:t xml:space="preserve"> </w:t>
+      </w:r>
+      <w:r>
+        <w:rPr>
+          <w:b/>
+          <w:bCs/>
+        </w:rPr>
+        <w:t>{{</w:t>
+      </w:r>
+      <w:proofErr w:type="spellStart"/>
+      <w:r>
+        <w:rPr>
+          <w:b/>
+          <w:bCs/>
+        </w:rPr>
+        <w:t>fecha_corte</w:t>
+      </w:r>
+      <w:proofErr w:type="spellEnd"/>
+      <w:r>
+        <w:rPr>
+          <w:b/>
+          <w:bCs/>
+        </w:rPr>
+        <w:t>}}</w:t>
+      </w:r>
+      <w:r>
+        <w:t xml:space="preserve">, el </w:t>
+      </w:r>
+      <w:r>
+        <w:rPr>
+          <w:b/>
+          <w:bCs/>
+        </w:rPr>
+        <w:t>{{</w:t>
+      </w:r>
+      <w:proofErr w:type="spellStart"/>
+      <w:r>
+        <w:rPr>
+          <w:b/>
+          <w:bCs/>
+        </w:rPr>
+        <w:t>entregado_por</w:t>
+      </w:r>
+      <w:proofErr w:type="spellEnd"/>
+      <w:r>
+        <w:rPr>
+          <w:b/>
+          <w:bCs/>
+        </w:rPr>
+        <w:t>}}</w:t>
+      </w:r>
+      <w:r>
+        <w:t xml:space="preserve">, </w:t>
+      </w:r>
+      <w:r>
+        <w:rPr>
+          <w:b/>
+          <w:bCs/>
+        </w:rPr>
+        <w:t>{{</w:t>
+      </w:r>
+      <w:proofErr w:type="spellStart"/>
+      <w:r>
+        <w:rPr>
+          <w:b/>
+          <w:bCs/>
+        </w:rPr>
+        <w:t>rol_recibe</w:t>
+      </w:r>
+      <w:proofErr w:type="spellEnd"/>
+      <w:r>
+        <w:rPr>
+          <w:b/>
+          <w:bCs/>
+        </w:rPr>
+        <w:t>}}</w:t>
+      </w:r>
+      <w:r>
+        <w:rPr>
+          <w:b/>
+          <w:bCs/>
+        </w:rPr>
+        <w:t xml:space="preserve"> </w:t>
+      </w:r>
+      <w:r>
+        <w:t>1 TIEMPO COMPLETO</w:t>
       </w:r>
       <w:r>
         <w:t>, cumple sus funciones en la Facultad de Jurisprudencia, Ciencias Sociales y Políticas.</w:t>
@@ -1430,13 +1512,71 @@
         <w:t>UG-R-2026-0184-M</w:t>
       </w:r>
       <w:r>
-        <w:t xml:space="preserve">, de fecha 5 de marzo 2026, </w:t>
+        <w:t xml:space="preserve">, de </w:t>
+      </w:r>
+      <w:r>
+        <w:rPr>
+          <w:b/>
+          <w:bCs/>
+        </w:rPr>
+        <w:t>{{</w:t>
+      </w:r>
+      <w:proofErr w:type="spellStart"/>
+      <w:r>
+        <w:rPr>
+          <w:b/>
+          <w:bCs/>
+        </w:rPr>
+        <w:t>fecha_emision</w:t>
+      </w:r>
+      <w:proofErr w:type="spellEnd"/>
+      <w:r>
+        <w:rPr>
+          <w:b/>
+          <w:bCs/>
+        </w:rPr>
+        <w:t>}}</w:t>
+      </w:r>
+      <w:r>
+        <w:t xml:space="preserve">, </w:t>
       </w:r>
       <w:r>
         <w:rPr>
           <w:highlight w:val="yellow"/>
         </w:rPr>
-        <w:t>suscrito por el Dra. Sofia Lovato Torres, Rectora (subrogante), en el que acepta la renuncia y agradece al Dr. Walter Suarez Farias, al cargo de Director de la Facultad de Jurisprudencia, Ciencias Políticas.</w:t>
+        <w:t xml:space="preserve">suscrito por el Dra. Sofia Lovato Torres, Rectora (subrogante), en el que acepta la renuncia y agradece al Dr. Walter Suarez Farias, al cargo de </w:t>
+      </w:r>
+      <w:r>
+        <w:rPr>
+          <w:b/>
+          <w:bCs/>
+          <w:highlight w:val="yellow"/>
+        </w:rPr>
+        <w:t>{{</w:t>
+      </w:r>
+      <w:proofErr w:type="spellStart"/>
+      <w:r>
+        <w:rPr>
+          <w:b/>
+          <w:bCs/>
+          <w:highlight w:val="yellow"/>
+        </w:rPr>
+        <w:t>accion_personal</w:t>
+      </w:r>
+      <w:proofErr w:type="spellEnd"/>
+      <w:r>
+        <w:rPr>
+          <w:b/>
+          <w:bCs/>
+          <w:highlight w:val="yellow"/>
+        </w:rPr>
+        <w:t>}}</w:t>
+      </w:r>
+      <w:r>
+        <w:rPr>
+          <w:highlight w:val="yellow"/>
+        </w:rPr>
+        <w:t>.</w:t>
       </w:r>
     </w:p>
     <w:p>
@@ -1618,7 +1758,33 @@
         <w:t xml:space="preserve"> </w:t>
       </w:r>
       <w:r>
-        <w:t>Manejo y Control de los Bienes e Inventarios del Sector Público, en sus Artículos:</w:t>
+        <w:t xml:space="preserve">Manejo y Control de los Bienes e Inventarios del </w:t>
+      </w:r>
+      <w:r>
+        <w:rPr>
+          <w:b/>
+          <w:bCs/>
+        </w:rPr>
+        <w:t>{{</w:t>
+      </w:r>
+      <w:proofErr w:type="spellStart"/>
+      <w:r>
+        <w:rPr>
+          <w:b/>
+          <w:bCs/>
+        </w:rPr>
+        <w:t>area_trabajo</w:t>
+      </w:r>
+      <w:proofErr w:type="spellEnd"/>
+      <w:r>
+        <w:rPr>
+          <w:b/>
+          <w:bCs/>
+        </w:rPr>
+        <w:t>}}</w:t>
+      </w:r>
+      <w:r>
+        <w:t>, en sus Artículos:</w:t>
       </w:r>
     </w:p>
     <w:p>
@@ -2677,7 +2843,21 @@
         <w:rPr>
           <w:sz w:val="20"/>
         </w:rPr>
-        <w:t>El Guardalmacén, o quien haga sus veces entregará los registros de bienes y/o inventarios al titular de cada área, para, su control y custodia; y, una copia de los mismos los entregará al Custodio Administrativo del área.</w:t>
+        <w:t xml:space="preserve">El Guardalmacén, o quien haga sus veces entregará los registros de bienes y/o inventarios al titular de cada área, para, su control y custodia; y, una copia de </w:t>
+      </w:r>
+      <w:proofErr w:type="gramStart"/>
+      <w:r>
+        <w:rPr>
+          <w:sz w:val="20"/>
+        </w:rPr>
+        <w:t>los mismos</w:t>
+      </w:r>
+      <w:proofErr w:type="gramEnd"/>
+      <w:r>
+        <w:rPr>
+          <w:sz w:val="20"/>
+        </w:rPr>
+        <w:t xml:space="preserve"> los entregará al Custodio Administrativo del área.</w:t>
       </w:r>
     </w:p>
     <w:p>
@@ -3028,16 +3208,7 @@
         <w:tblLook w:val="0000" w:firstRow="0" w:lastRow="0" w:firstColumn="0" w:lastColumn="0" w:noHBand="0" w:noVBand="0"/>
       </w:tblPr>
       <w:tblGrid>
-        <w:gridCol w:w="351"/>
-        <w:gridCol w:w="619"/>
-        <w:gridCol w:w="782"/>
-        <w:gridCol w:w="612"/>
-        <w:gridCol w:w="2888"/>
-        <w:gridCol w:w="641"/>
-        <w:gridCol w:w="1109"/>
-        <w:gridCol w:w="1064"/>
-        <w:gridCol w:w="1075"/>
-        <w:gridCol w:w="756"/>
+        <w:gridCol w:w="7572"/>
       </w:tblGrid>
       <w:tr>
         <w:trPr>
@@ -3045,7 +3216,7 @@
         </w:trPr>
         <w:tc>
           <w:tcPr>
-            <w:tcW w:w="351" w:type="dxa"/>
+            <w:tcW w:w="7572" w:type="dxa"/>
             <w:shd w:val="clear" w:color="auto" w:fill="9BC2E6"/>
           </w:tcPr>
           <w:p>
@@ -3058,311 +3229,6 @@
                 <w:sz w:val="14"/>
               </w:rPr>
             </w:pPr>
-            <w:r>
-              <w:rPr>
-                <w:b/>
-                <w:spacing w:val="-4"/>
-                <w:sz w:val="14"/>
-              </w:rPr>
-              <w:t>ITEM</w:t>
-            </w:r>
-          </w:p>
-        </w:tc>
-        <w:tc>
-          <w:tcPr>
-            <w:tcW w:w="619" w:type="dxa"/>
-            <w:shd w:val="clear" w:color="auto" w:fill="9BC2E6"/>
-          </w:tcPr>
-          <w:p>
-            <w:pPr>
-              <w:pStyle w:val="TableParagraph"/>
-              <w:spacing w:before="116"/>
-              <w:ind w:left="49"/>
-              <w:rPr>
-                <w:b/>
-                <w:sz w:val="14"/>
-              </w:rPr>
-            </w:pPr>
-            <w:r>
-              <w:rPr>
-                <w:b/>
-                <w:w w:val="70"/>
-                <w:sz w:val="14"/>
-              </w:rPr>
-              <w:t>COD</w:t>
-            </w:r>
-            <w:r>
-              <w:rPr>
-                <w:b/>
-                <w:spacing w:val="1"/>
-                <w:sz w:val="14"/>
-              </w:rPr>
-              <w:t xml:space="preserve"> </w:t>
-            </w:r>
-            <w:r>
-              <w:rPr>
-                <w:b/>
-                <w:spacing w:val="-5"/>
-                <w:w w:val="90"/>
-                <w:sz w:val="14"/>
-              </w:rPr>
-              <w:t>INV</w:t>
-            </w:r>
-          </w:p>
-        </w:tc>
-        <w:tc>
-          <w:tcPr>
-            <w:tcW w:w="782" w:type="dxa"/>
-            <w:shd w:val="clear" w:color="auto" w:fill="9BC2E6"/>
-          </w:tcPr>
-          <w:p>
-            <w:pPr>
-              <w:pStyle w:val="TableParagraph"/>
-              <w:spacing w:before="116"/>
-              <w:ind w:left="48" w:right="31"/>
-              <w:rPr>
-                <w:b/>
-                <w:sz w:val="14"/>
-              </w:rPr>
-            </w:pPr>
-            <w:r>
-              <w:rPr>
-                <w:b/>
-                <w:w w:val="70"/>
-                <w:sz w:val="14"/>
-              </w:rPr>
-              <w:t>COD</w:t>
-            </w:r>
-            <w:r>
-              <w:rPr>
-                <w:b/>
-                <w:spacing w:val="3"/>
-                <w:sz w:val="14"/>
-              </w:rPr>
-              <w:t xml:space="preserve"> </w:t>
-            </w:r>
-            <w:r>
-              <w:rPr>
-                <w:b/>
-                <w:spacing w:val="-2"/>
-                <w:w w:val="85"/>
-                <w:sz w:val="14"/>
-              </w:rPr>
-              <w:t>ESBAY</w:t>
-            </w:r>
-          </w:p>
-        </w:tc>
-        <w:tc>
-          <w:tcPr>
-            <w:tcW w:w="612" w:type="dxa"/>
-            <w:shd w:val="clear" w:color="auto" w:fill="9BC2E6"/>
-          </w:tcPr>
-          <w:p>
-            <w:pPr>
-              <w:pStyle w:val="TableParagraph"/>
-              <w:spacing w:before="116"/>
-              <w:ind w:left="62"/>
-              <w:rPr>
-                <w:b/>
-                <w:sz w:val="14"/>
-              </w:rPr>
-            </w:pPr>
-            <w:r>
-              <w:rPr>
-                <w:b/>
-                <w:spacing w:val="-4"/>
-                <w:sz w:val="14"/>
-              </w:rPr>
-              <w:t>CANT</w:t>
-            </w:r>
-          </w:p>
-        </w:tc>
-        <w:tc>
-          <w:tcPr>
-            <w:tcW w:w="2888" w:type="dxa"/>
-            <w:shd w:val="clear" w:color="auto" w:fill="9BC2E6"/>
-          </w:tcPr>
-          <w:p>
-            <w:pPr>
-              <w:pStyle w:val="TableParagraph"/>
-              <w:spacing w:before="116"/>
-              <w:ind w:left="60" w:right="10"/>
-              <w:rPr>
-                <w:b/>
-                <w:sz w:val="14"/>
-              </w:rPr>
-            </w:pPr>
-            <w:r>
-              <w:rPr>
-                <w:b/>
-                <w:spacing w:val="-2"/>
-                <w:sz w:val="14"/>
-              </w:rPr>
-              <w:t>DESCRIPCION</w:t>
-            </w:r>
-          </w:p>
-        </w:tc>
-        <w:tc>
-          <w:tcPr>
-            <w:tcW w:w="641" w:type="dxa"/>
-            <w:shd w:val="clear" w:color="auto" w:fill="9BC2E6"/>
-          </w:tcPr>
-          <w:p>
-            <w:pPr>
-              <w:pStyle w:val="TableParagraph"/>
-              <w:spacing w:before="116"/>
-              <w:ind w:left="57" w:right="7"/>
-              <w:rPr>
-                <w:b/>
-                <w:sz w:val="14"/>
-              </w:rPr>
-            </w:pPr>
-            <w:r>
-              <w:rPr>
-                <w:b/>
-                <w:spacing w:val="-2"/>
-                <w:sz w:val="14"/>
-              </w:rPr>
-              <w:t>MARCA</w:t>
-            </w:r>
-          </w:p>
-        </w:tc>
-        <w:tc>
-          <w:tcPr>
-            <w:tcW w:w="1109" w:type="dxa"/>
-            <w:shd w:val="clear" w:color="auto" w:fill="9BC2E6"/>
-          </w:tcPr>
-          <w:p>
-            <w:pPr>
-              <w:pStyle w:val="TableParagraph"/>
-              <w:spacing w:before="116"/>
-              <w:ind w:left="59" w:right="3"/>
-              <w:rPr>
-                <w:b/>
-                <w:sz w:val="14"/>
-              </w:rPr>
-            </w:pPr>
-            <w:r>
-              <w:rPr>
-                <w:b/>
-                <w:spacing w:val="-2"/>
-                <w:sz w:val="14"/>
-              </w:rPr>
-              <w:t>MODELO</w:t>
-            </w:r>
-          </w:p>
-        </w:tc>
-        <w:tc>
-          <w:tcPr>
-            <w:tcW w:w="1064" w:type="dxa"/>
-            <w:shd w:val="clear" w:color="auto" w:fill="9BC2E6"/>
-          </w:tcPr>
-          <w:p>
-            <w:pPr>
-              <w:pStyle w:val="TableParagraph"/>
-              <w:spacing w:before="116"/>
-              <w:ind w:left="70"/>
-              <w:rPr>
-                <w:b/>
-                <w:sz w:val="14"/>
-              </w:rPr>
-            </w:pPr>
-            <w:r>
-              <w:rPr>
-                <w:b/>
-                <w:spacing w:val="-2"/>
-                <w:sz w:val="14"/>
-              </w:rPr>
-              <w:t>SERIE</w:t>
-            </w:r>
-          </w:p>
-        </w:tc>
-        <w:tc>
-          <w:tcPr>
-            <w:tcW w:w="1075" w:type="dxa"/>
-            <w:shd w:val="clear" w:color="auto" w:fill="9BC2E6"/>
-          </w:tcPr>
-          <w:p>
-            <w:pPr>
-              <w:pStyle w:val="TableParagraph"/>
-              <w:spacing w:before="12"/>
-              <w:ind w:left="326"/>
-              <w:jc w:val="left"/>
-              <w:rPr>
-                <w:b/>
-                <w:sz w:val="14"/>
-              </w:rPr>
-            </w:pPr>
-            <w:r>
-              <w:rPr>
-                <w:b/>
-                <w:w w:val="75"/>
-                <w:sz w:val="14"/>
-              </w:rPr>
-              <w:t>FECHA</w:t>
-            </w:r>
-            <w:r>
-              <w:rPr>
-                <w:b/>
-                <w:spacing w:val="-2"/>
-                <w:sz w:val="14"/>
-              </w:rPr>
-              <w:t xml:space="preserve"> </w:t>
-            </w:r>
-            <w:r>
-              <w:rPr>
-                <w:b/>
-                <w:spacing w:val="-5"/>
-                <w:w w:val="90"/>
-                <w:sz w:val="14"/>
-              </w:rPr>
-              <w:t>DE</w:t>
-            </w:r>
-          </w:p>
-          <w:p>
-            <w:pPr>
-              <w:pStyle w:val="TableParagraph"/>
-              <w:spacing w:before="25"/>
-              <w:ind w:left="246"/>
-              <w:jc w:val="left"/>
-              <w:rPr>
-                <w:b/>
-                <w:sz w:val="14"/>
-              </w:rPr>
-            </w:pPr>
-            <w:r>
-              <w:rPr>
-                <w:b/>
-                <w:spacing w:val="-2"/>
-                <w:sz w:val="14"/>
-              </w:rPr>
-              <w:t>ADQUISCION</w:t>
-            </w:r>
-          </w:p>
-        </w:tc>
-        <w:tc>
-          <w:tcPr>
-            <w:tcW w:w="756" w:type="dxa"/>
-            <w:shd w:val="clear" w:color="auto" w:fill="9BC2E6"/>
-          </w:tcPr>
-          <w:p>
-            <w:pPr>
-              <w:pStyle w:val="TableParagraph"/>
-              <w:spacing w:before="116"/>
-              <w:ind w:left="69"/>
-              <w:rPr>
-                <w:b/>
-                <w:sz w:val="14"/>
-              </w:rPr>
-            </w:pPr>
-            <w:r>
-              <w:rPr>
-                <w:b/>
-                <w:spacing w:val="-2"/>
-                <w:sz w:val="14"/>
-              </w:rPr>
-              <w:t>ESTADO</w:t>
-            </w:r>
           </w:p>
         </w:tc>
       </w:tr>
@@ -3372,7 +3238,7 @@
         </w:trPr>
         <w:tc>
           <w:tcPr>
-            <w:tcW w:w="351" w:type="dxa"/>
+            <w:tcW w:w="7572" w:type="dxa"/>
           </w:tcPr>
           <w:p>
             <w:pPr>
@@ -3391,323 +3257,11 @@
               <w:pStyle w:val="TableParagraph"/>
               <w:spacing w:before="1"/>
               <w:ind w:left="71"/>
+              <w:jc w:val="left"/>
               <w:rPr>
                 <w:sz w:val="14"/>
               </w:rPr>
             </w:pPr>
-            <w:r>
-              <w:rPr>
-                <w:spacing w:val="-10"/>
-                <w:sz w:val="14"/>
-              </w:rPr>
-              <w:t>1</w:t>
-            </w:r>
-          </w:p>
-        </w:tc>
-        <w:tc>
-          <w:tcPr>
-            <w:tcW w:w="619" w:type="dxa"/>
-          </w:tcPr>
-          <w:p>
-            <w:pPr>
-              <w:pStyle w:val="TableParagraph"/>
-              <w:spacing w:before="31"/>
-              <w:jc w:val="left"/>
-              <w:rPr>
-                <w:rFonts w:ascii="Arial"/>
-                <w:b/>
-                <w:sz w:val="14"/>
-              </w:rPr>
-            </w:pPr>
-          </w:p>
-          <w:p>
-            <w:pPr>
-              <w:pStyle w:val="TableParagraph"/>
-              <w:spacing w:before="1"/>
-              <w:ind w:left="50"/>
-              <w:rPr>
-                <w:sz w:val="14"/>
-              </w:rPr>
-            </w:pPr>
-            <w:r>
-              <w:rPr>
-                <w:spacing w:val="-5"/>
-                <w:sz w:val="14"/>
-              </w:rPr>
-              <w:t>S/C</w:t>
-            </w:r>
-          </w:p>
-        </w:tc>
-        <w:tc>
-          <w:tcPr>
-            <w:tcW w:w="782" w:type="dxa"/>
-          </w:tcPr>
-          <w:p>
-            <w:pPr>
-              <w:pStyle w:val="TableParagraph"/>
-              <w:spacing w:before="31"/>
-              <w:jc w:val="left"/>
-              <w:rPr>
-                <w:rFonts w:ascii="Arial"/>
-                <w:b/>
-                <w:sz w:val="14"/>
-              </w:rPr>
-            </w:pPr>
-          </w:p>
-          <w:p>
-            <w:pPr>
-              <w:pStyle w:val="TableParagraph"/>
-              <w:spacing w:before="1"/>
-              <w:ind w:left="48" w:right="23"/>
-              <w:rPr>
-                <w:sz w:val="14"/>
-              </w:rPr>
-            </w:pPr>
-            <w:r>
-              <w:rPr>
-                <w:spacing w:val="-2"/>
-                <w:sz w:val="14"/>
-              </w:rPr>
-              <w:t>S/COD</w:t>
-            </w:r>
-          </w:p>
-        </w:tc>
-        <w:tc>
-          <w:tcPr>
-            <w:tcW w:w="612" w:type="dxa"/>
-          </w:tcPr>
-          <w:p>
-            <w:pPr>
-              <w:pStyle w:val="TableParagraph"/>
-              <w:spacing w:before="31"/>
-              <w:jc w:val="left"/>
-              <w:rPr>
-                <w:rFonts w:ascii="Arial"/>
-                <w:b/>
-                <w:sz w:val="14"/>
-              </w:rPr>
-            </w:pPr>
-          </w:p>
-          <w:p>
-            <w:pPr>
-              <w:pStyle w:val="TableParagraph"/>
-              <w:spacing w:before="1"/>
-              <w:ind w:left="62" w:right="3"/>
-              <w:rPr>
-                <w:sz w:val="14"/>
-              </w:rPr>
-            </w:pPr>
-            <w:r>
-              <w:rPr>
-                <w:spacing w:val="-10"/>
-                <w:sz w:val="14"/>
-              </w:rPr>
-              <w:t>1</w:t>
-            </w:r>
-          </w:p>
-        </w:tc>
-        <w:tc>
-          <w:tcPr>
-            <w:tcW w:w="2888" w:type="dxa"/>
-          </w:tcPr>
-          <w:p>
-            <w:pPr>
-              <w:pStyle w:val="TableParagraph"/>
-              <w:spacing w:before="31"/>
-              <w:jc w:val="left"/>
-              <w:rPr>
-                <w:rFonts w:ascii="Arial"/>
-                <w:b/>
-                <w:sz w:val="14"/>
-              </w:rPr>
-            </w:pPr>
-          </w:p>
-          <w:p>
-            <w:pPr>
-              <w:pStyle w:val="TableParagraph"/>
-              <w:spacing w:before="1"/>
-              <w:ind w:left="60" w:right="37"/>
-              <w:rPr>
-                <w:sz w:val="14"/>
-              </w:rPr>
-            </w:pPr>
-            <w:r>
-              <w:rPr>
-                <w:spacing w:val="-2"/>
-                <w:sz w:val="14"/>
-              </w:rPr>
-              <w:t>MONITOR</w:t>
-            </w:r>
-          </w:p>
-        </w:tc>
-        <w:tc>
-          <w:tcPr>
-            <w:tcW w:w="641" w:type="dxa"/>
-          </w:tcPr>
-          <w:p>
-            <w:pPr>
-              <w:pStyle w:val="TableParagraph"/>
-              <w:spacing w:before="31"/>
-              <w:jc w:val="left"/>
-              <w:rPr>
-                <w:rFonts w:ascii="Arial"/>
-                <w:b/>
-                <w:sz w:val="14"/>
-              </w:rPr>
-            </w:pPr>
-          </w:p>
-          <w:p>
-            <w:pPr>
-              <w:pStyle w:val="TableParagraph"/>
-              <w:spacing w:before="1"/>
-              <w:ind w:left="57" w:right="30"/>
-              <w:rPr>
-                <w:sz w:val="14"/>
-              </w:rPr>
-            </w:pPr>
-            <w:r>
-              <w:rPr>
-                <w:spacing w:val="-2"/>
-                <w:sz w:val="14"/>
-              </w:rPr>
-              <w:t>QUASAD</w:t>
-            </w:r>
-          </w:p>
-        </w:tc>
-        <w:tc>
-          <w:tcPr>
-            <w:tcW w:w="1109" w:type="dxa"/>
-          </w:tcPr>
-          <w:p>
-            <w:pPr>
-              <w:pStyle w:val="TableParagraph"/>
-              <w:spacing w:before="31"/>
-              <w:jc w:val="left"/>
-              <w:rPr>
-                <w:rFonts w:ascii="Arial"/>
-                <w:b/>
-                <w:sz w:val="14"/>
-              </w:rPr>
-            </w:pPr>
-          </w:p>
-          <w:p>
-            <w:pPr>
-              <w:pStyle w:val="TableParagraph"/>
-              <w:spacing w:before="1"/>
-              <w:ind w:left="40"/>
-              <w:rPr>
-                <w:sz w:val="14"/>
-              </w:rPr>
-            </w:pPr>
-            <w:r>
-              <w:rPr>
-                <w:spacing w:val="-5"/>
-                <w:sz w:val="14"/>
-              </w:rPr>
-              <w:t>S/M</w:t>
-            </w:r>
-          </w:p>
-        </w:tc>
-        <w:tc>
-          <w:tcPr>
-            <w:tcW w:w="1064" w:type="dxa"/>
-          </w:tcPr>
-          <w:p>
-            <w:pPr>
-              <w:pStyle w:val="TableParagraph"/>
-              <w:spacing w:before="31"/>
-              <w:jc w:val="left"/>
-              <w:rPr>
-                <w:rFonts w:ascii="Arial"/>
-                <w:b/>
-                <w:sz w:val="14"/>
-              </w:rPr>
-            </w:pPr>
-          </w:p>
-          <w:p>
-            <w:pPr>
-              <w:pStyle w:val="TableParagraph"/>
-              <w:spacing w:before="1"/>
-              <w:ind w:left="62"/>
-              <w:rPr>
-                <w:sz w:val="14"/>
-              </w:rPr>
-            </w:pPr>
-            <w:r>
-              <w:rPr>
-                <w:spacing w:val="-5"/>
-                <w:sz w:val="14"/>
-              </w:rPr>
-              <w:t>S/S</w:t>
-            </w:r>
-          </w:p>
-        </w:tc>
-        <w:tc>
-          <w:tcPr>
-            <w:tcW w:w="1075" w:type="dxa"/>
-          </w:tcPr>
-          <w:p>
-            <w:pPr>
-              <w:pStyle w:val="TableParagraph"/>
-              <w:spacing w:before="31"/>
-              <w:jc w:val="left"/>
-              <w:rPr>
-                <w:rFonts w:ascii="Arial"/>
-                <w:b/>
-                <w:sz w:val="14"/>
-              </w:rPr>
-            </w:pPr>
-          </w:p>
-          <w:p>
-            <w:pPr>
-              <w:pStyle w:val="TableParagraph"/>
-              <w:spacing w:before="1"/>
-              <w:ind w:left="60"/>
-              <w:rPr>
-                <w:sz w:val="14"/>
-              </w:rPr>
-            </w:pPr>
-            <w:r>
-              <w:rPr>
-                <w:spacing w:val="-5"/>
-                <w:sz w:val="14"/>
-              </w:rPr>
-              <w:t>S/F</w:t>
-            </w:r>
-          </w:p>
-        </w:tc>
-        <w:tc>
-          <w:tcPr>
-            <w:tcW w:w="756" w:type="dxa"/>
-          </w:tcPr>
-          <w:p>
-            <w:pPr>
-              <w:pStyle w:val="TableParagraph"/>
-              <w:spacing w:before="31"/>
-              <w:jc w:val="left"/>
-              <w:rPr>
-                <w:rFonts w:ascii="Arial"/>
-                <w:b/>
-                <w:sz w:val="14"/>
-              </w:rPr>
-            </w:pPr>
-          </w:p>
-          <w:p>
-            <w:pPr>
-              <w:pStyle w:val="TableParagraph"/>
-              <w:spacing w:before="1"/>
-              <w:ind w:left="69" w:right="27"/>
-              <w:rPr>
-                <w:sz w:val="14"/>
-              </w:rPr>
-            </w:pPr>
-            <w:r>
-              <w:rPr>
-                <w:spacing w:val="-2"/>
-                <w:sz w:val="14"/>
-              </w:rPr>
-              <w:t>BUENO</w:t>
-            </w:r>
           </w:p>
         </w:tc>
       </w:tr>
@@ -3717,7 +3271,7 @@
         </w:trPr>
         <w:tc>
           <w:tcPr>
-            <w:tcW w:w="351" w:type="dxa"/>
+            <w:tcW w:w="7572" w:type="dxa"/>
           </w:tcPr>
           <w:p>
             <w:pPr>
@@ -3740,2520 +3294,60 @@
                 <w:sz w:val="14"/>
               </w:rPr>
             </w:pPr>
-            <w:r>
-              <w:rPr>
-                <w:spacing w:val="-10"/>
-                <w:sz w:val="14"/>
-              </w:rPr>
-              <w:t>2</w:t>
-            </w:r>
-          </w:p>
-        </w:tc>
-        <w:tc>
-          <w:tcPr>
-            <w:tcW w:w="619" w:type="dxa"/>
-          </w:tcPr>
-          <w:p>
-            <w:pPr>
-              <w:pStyle w:val="TableParagraph"/>
-              <w:spacing w:before="31"/>
-              <w:jc w:val="left"/>
-              <w:rPr>
-                <w:rFonts w:ascii="Arial"/>
-                <w:b/>
-                <w:sz w:val="14"/>
-              </w:rPr>
-            </w:pPr>
-          </w:p>
-          <w:p>
-            <w:pPr>
-              <w:pStyle w:val="TableParagraph"/>
-              <w:spacing w:before="1"/>
-              <w:ind w:left="50"/>
-              <w:rPr>
-                <w:sz w:val="14"/>
-              </w:rPr>
-            </w:pPr>
-            <w:r>
-              <w:rPr>
-                <w:spacing w:val="-5"/>
-                <w:sz w:val="14"/>
-              </w:rPr>
-              <w:t>S/C</w:t>
-            </w:r>
-          </w:p>
-        </w:tc>
-        <w:tc>
-          <w:tcPr>
-            <w:tcW w:w="782" w:type="dxa"/>
-          </w:tcPr>
-          <w:p>
-            <w:pPr>
-              <w:pStyle w:val="TableParagraph"/>
-              <w:spacing w:before="31"/>
-              <w:jc w:val="left"/>
-              <w:rPr>
-                <w:rFonts w:ascii="Arial"/>
-                <w:b/>
-                <w:sz w:val="14"/>
-              </w:rPr>
-            </w:pPr>
-          </w:p>
-          <w:p>
-            <w:pPr>
-              <w:pStyle w:val="TableParagraph"/>
-              <w:spacing w:before="1"/>
-              <w:ind w:left="48" w:right="23"/>
-              <w:rPr>
-                <w:sz w:val="14"/>
-              </w:rPr>
-            </w:pPr>
-            <w:r>
-              <w:rPr>
-                <w:spacing w:val="-2"/>
-                <w:sz w:val="14"/>
-              </w:rPr>
-              <w:t>S/COD</w:t>
-            </w:r>
-          </w:p>
-        </w:tc>
-        <w:tc>
-          <w:tcPr>
-            <w:tcW w:w="612" w:type="dxa"/>
-          </w:tcPr>
-          <w:p>
-            <w:pPr>
-              <w:pStyle w:val="TableParagraph"/>
-              <w:spacing w:before="31"/>
-              <w:jc w:val="left"/>
-              <w:rPr>
-                <w:rFonts w:ascii="Arial"/>
-                <w:b/>
-                <w:sz w:val="14"/>
-              </w:rPr>
-            </w:pPr>
-          </w:p>
-          <w:p>
-            <w:pPr>
-              <w:pStyle w:val="TableParagraph"/>
-              <w:spacing w:before="1"/>
-              <w:ind w:left="62" w:right="3"/>
-              <w:rPr>
-                <w:sz w:val="14"/>
-              </w:rPr>
-            </w:pPr>
-            <w:r>
-              <w:rPr>
-                <w:spacing w:val="-10"/>
-                <w:sz w:val="14"/>
-              </w:rPr>
-              <w:t>1</w:t>
-            </w:r>
-          </w:p>
-        </w:tc>
-        <w:tc>
-          <w:tcPr>
-            <w:tcW w:w="2888" w:type="dxa"/>
-          </w:tcPr>
-          <w:p>
-            <w:pPr>
-              <w:pStyle w:val="TableParagraph"/>
-              <w:spacing w:before="31"/>
-              <w:jc w:val="left"/>
-              <w:rPr>
-                <w:rFonts w:ascii="Arial"/>
-                <w:b/>
-                <w:sz w:val="14"/>
-              </w:rPr>
-            </w:pPr>
-          </w:p>
-          <w:p>
-            <w:pPr>
-              <w:pStyle w:val="TableParagraph"/>
-              <w:spacing w:before="1"/>
-              <w:ind w:left="60" w:right="10"/>
-              <w:rPr>
-                <w:sz w:val="14"/>
-              </w:rPr>
-            </w:pPr>
-            <w:r>
-              <w:rPr>
-                <w:spacing w:val="-5"/>
-                <w:sz w:val="14"/>
-              </w:rPr>
-              <w:t>CPU</w:t>
-            </w:r>
-          </w:p>
-        </w:tc>
-        <w:tc>
-          <w:tcPr>
-            <w:tcW w:w="641" w:type="dxa"/>
-          </w:tcPr>
-          <w:p>
-            <w:pPr>
-              <w:pStyle w:val="TableParagraph"/>
-              <w:spacing w:before="31"/>
-              <w:jc w:val="left"/>
-              <w:rPr>
-                <w:rFonts w:ascii="Arial"/>
-                <w:b/>
-                <w:sz w:val="14"/>
-              </w:rPr>
-            </w:pPr>
-          </w:p>
-          <w:p>
-            <w:pPr>
-              <w:pStyle w:val="TableParagraph"/>
-              <w:spacing w:before="1"/>
-              <w:ind w:left="57" w:right="30"/>
-              <w:rPr>
-                <w:sz w:val="14"/>
-              </w:rPr>
-            </w:pPr>
-            <w:r>
-              <w:rPr>
-                <w:spacing w:val="-2"/>
-                <w:sz w:val="14"/>
-              </w:rPr>
-              <w:t>QUASAD</w:t>
-            </w:r>
-          </w:p>
-        </w:tc>
-        <w:tc>
-          <w:tcPr>
-            <w:tcW w:w="1109" w:type="dxa"/>
-          </w:tcPr>
-          <w:p>
-            <w:pPr>
-              <w:pStyle w:val="TableParagraph"/>
-              <w:spacing w:before="31"/>
-              <w:jc w:val="left"/>
-              <w:rPr>
-                <w:rFonts w:ascii="Arial"/>
-                <w:b/>
-                <w:sz w:val="14"/>
-              </w:rPr>
-            </w:pPr>
-          </w:p>
-          <w:p>
-            <w:pPr>
-              <w:pStyle w:val="TableParagraph"/>
-              <w:spacing w:before="1"/>
-              <w:ind w:left="59" w:right="7"/>
-              <w:rPr>
-                <w:sz w:val="14"/>
-              </w:rPr>
-            </w:pPr>
-            <w:r>
-              <w:rPr>
-                <w:spacing w:val="-2"/>
-                <w:w w:val="90"/>
-                <w:sz w:val="14"/>
-              </w:rPr>
-              <w:t>S0PQUAI5B560M06</w:t>
-            </w:r>
-          </w:p>
-        </w:tc>
-        <w:tc>
-          <w:tcPr>
-            <w:tcW w:w="1064" w:type="dxa"/>
-          </w:tcPr>
-          <w:p>
-            <w:pPr>
-              <w:pStyle w:val="TableParagraph"/>
-              <w:spacing w:before="31"/>
-              <w:jc w:val="left"/>
-              <w:rPr>
-                <w:rFonts w:ascii="Arial"/>
-                <w:b/>
-                <w:sz w:val="14"/>
-              </w:rPr>
-            </w:pPr>
-          </w:p>
-          <w:p>
-            <w:pPr>
-              <w:pStyle w:val="TableParagraph"/>
-              <w:spacing w:before="1"/>
-              <w:ind w:left="41"/>
-              <w:rPr>
-                <w:sz w:val="14"/>
-              </w:rPr>
-            </w:pPr>
-            <w:r>
-              <w:rPr>
-                <w:spacing w:val="-2"/>
-                <w:w w:val="90"/>
-                <w:sz w:val="14"/>
-              </w:rPr>
-              <w:t>COPQAI5B5683116</w:t>
-            </w:r>
-          </w:p>
-        </w:tc>
-        <w:tc>
-          <w:tcPr>
-            <w:tcW w:w="1075" w:type="dxa"/>
-          </w:tcPr>
-          <w:p>
-            <w:pPr>
-              <w:pStyle w:val="TableParagraph"/>
-              <w:spacing w:before="31"/>
-              <w:jc w:val="left"/>
-              <w:rPr>
-                <w:rFonts w:ascii="Arial"/>
-                <w:b/>
-                <w:sz w:val="14"/>
-              </w:rPr>
-            </w:pPr>
-          </w:p>
-          <w:p>
-            <w:pPr>
-              <w:pStyle w:val="TableParagraph"/>
-              <w:spacing w:before="1"/>
-              <w:ind w:left="60"/>
-              <w:rPr>
-                <w:sz w:val="14"/>
-              </w:rPr>
-            </w:pPr>
-            <w:r>
-              <w:rPr>
-                <w:spacing w:val="-5"/>
-                <w:sz w:val="14"/>
-              </w:rPr>
-              <w:t>S/F</w:t>
-            </w:r>
-          </w:p>
-        </w:tc>
-        <w:tc>
-          <w:tcPr>
-            <w:tcW w:w="756" w:type="dxa"/>
-          </w:tcPr>
-          <w:p>
-            <w:pPr>
-              <w:pStyle w:val="TableParagraph"/>
-              <w:spacing w:before="31"/>
-              <w:jc w:val="left"/>
-              <w:rPr>
-                <w:rFonts w:ascii="Arial"/>
-                <w:b/>
-                <w:sz w:val="14"/>
-              </w:rPr>
-            </w:pPr>
-          </w:p>
-          <w:p>
-            <w:pPr>
-              <w:pStyle w:val="TableParagraph"/>
-              <w:spacing w:before="1"/>
-              <w:ind w:left="69" w:right="27"/>
-              <w:rPr>
-                <w:sz w:val="14"/>
-              </w:rPr>
-            </w:pPr>
-            <w:r>
-              <w:rPr>
-                <w:spacing w:val="-2"/>
-                <w:sz w:val="14"/>
-              </w:rPr>
-              <w:t>BUENO</w:t>
-            </w:r>
-          </w:p>
-        </w:tc>
-      </w:tr>
-      <w:tr>
-        <w:trPr>
-          <w:trHeight w:val="565"/>
-        </w:trPr>
-        <w:tc>
-          <w:tcPr>
-            <w:tcW w:w="351" w:type="dxa"/>
-          </w:tcPr>
-          <w:p>
-            <w:pPr>
-              <w:pStyle w:val="TableParagraph"/>
-              <w:spacing w:before="31"/>
-              <w:jc w:val="left"/>
-              <w:rPr>
-                <w:rFonts w:ascii="Arial"/>
-                <w:b/>
-                <w:sz w:val="14"/>
-              </w:rPr>
-            </w:pPr>
-          </w:p>
-          <w:p>
-            <w:pPr>
-              <w:pStyle w:val="TableParagraph"/>
-              <w:spacing w:before="1"/>
-              <w:ind w:left="71"/>
-              <w:rPr>
-                <w:sz w:val="14"/>
-              </w:rPr>
-            </w:pPr>
-            <w:r>
-              <w:rPr>
-                <w:spacing w:val="-10"/>
-                <w:sz w:val="14"/>
-              </w:rPr>
-              <w:t>3</w:t>
-            </w:r>
-          </w:p>
-        </w:tc>
-        <w:tc>
-          <w:tcPr>
-            <w:tcW w:w="619" w:type="dxa"/>
-          </w:tcPr>
-          <w:p>
-            <w:pPr>
-              <w:pStyle w:val="TableParagraph"/>
-              <w:spacing w:before="31"/>
-              <w:jc w:val="left"/>
-              <w:rPr>
-                <w:rFonts w:ascii="Arial"/>
-                <w:b/>
-                <w:sz w:val="14"/>
-              </w:rPr>
-            </w:pPr>
-          </w:p>
-          <w:p>
-            <w:pPr>
-              <w:pStyle w:val="TableParagraph"/>
-              <w:spacing w:before="1"/>
-              <w:ind w:left="50"/>
-              <w:rPr>
-                <w:sz w:val="14"/>
-              </w:rPr>
-            </w:pPr>
-            <w:r>
-              <w:rPr>
-                <w:spacing w:val="-5"/>
-                <w:sz w:val="14"/>
-              </w:rPr>
-              <w:t>S/C</w:t>
-            </w:r>
-          </w:p>
-        </w:tc>
-        <w:tc>
-          <w:tcPr>
-            <w:tcW w:w="782" w:type="dxa"/>
-          </w:tcPr>
-          <w:p>
-            <w:pPr>
-              <w:pStyle w:val="TableParagraph"/>
-              <w:spacing w:before="31"/>
-              <w:jc w:val="left"/>
-              <w:rPr>
-                <w:rFonts w:ascii="Arial"/>
-                <w:b/>
-                <w:sz w:val="14"/>
-              </w:rPr>
-            </w:pPr>
-          </w:p>
-          <w:p>
-            <w:pPr>
-              <w:pStyle w:val="TableParagraph"/>
-              <w:spacing w:before="1"/>
-              <w:ind w:left="48" w:right="23"/>
-              <w:rPr>
-                <w:sz w:val="14"/>
-              </w:rPr>
-            </w:pPr>
-            <w:r>
-              <w:rPr>
-                <w:spacing w:val="-2"/>
-                <w:sz w:val="14"/>
-              </w:rPr>
-              <w:t>S/COD</w:t>
-            </w:r>
-          </w:p>
-        </w:tc>
-        <w:tc>
-          <w:tcPr>
-            <w:tcW w:w="612" w:type="dxa"/>
-          </w:tcPr>
-          <w:p>
-            <w:pPr>
-              <w:pStyle w:val="TableParagraph"/>
-              <w:spacing w:before="31"/>
-              <w:jc w:val="left"/>
-              <w:rPr>
-                <w:rFonts w:ascii="Arial"/>
-                <w:b/>
-                <w:sz w:val="14"/>
-              </w:rPr>
-            </w:pPr>
-          </w:p>
-          <w:p>
-            <w:pPr>
-              <w:pStyle w:val="TableParagraph"/>
-              <w:spacing w:before="1"/>
-              <w:ind w:left="62" w:right="3"/>
-              <w:rPr>
-                <w:sz w:val="14"/>
-              </w:rPr>
-            </w:pPr>
-            <w:r>
-              <w:rPr>
-                <w:spacing w:val="-10"/>
-                <w:sz w:val="14"/>
-              </w:rPr>
-              <w:t>1</w:t>
-            </w:r>
-          </w:p>
-        </w:tc>
-        <w:tc>
-          <w:tcPr>
-            <w:tcW w:w="2888" w:type="dxa"/>
-          </w:tcPr>
-          <w:p>
-            <w:pPr>
-              <w:pStyle w:val="TableParagraph"/>
-              <w:spacing w:before="31"/>
-              <w:jc w:val="left"/>
-              <w:rPr>
-                <w:rFonts w:ascii="Arial"/>
-                <w:b/>
-                <w:sz w:val="14"/>
-              </w:rPr>
-            </w:pPr>
-          </w:p>
-          <w:p>
-            <w:pPr>
-              <w:pStyle w:val="TableParagraph"/>
-              <w:spacing w:before="1"/>
-              <w:ind w:left="60" w:right="14"/>
-              <w:rPr>
-                <w:sz w:val="14"/>
-              </w:rPr>
-            </w:pPr>
-            <w:r>
-              <w:rPr>
-                <w:spacing w:val="-2"/>
-                <w:sz w:val="14"/>
-              </w:rPr>
-              <w:t>TECLADO</w:t>
-            </w:r>
-          </w:p>
-        </w:tc>
-        <w:tc>
-          <w:tcPr>
-            <w:tcW w:w="641" w:type="dxa"/>
-          </w:tcPr>
-          <w:p>
-            <w:pPr>
-              <w:pStyle w:val="TableParagraph"/>
-              <w:spacing w:before="31"/>
-              <w:jc w:val="left"/>
-              <w:rPr>
-                <w:rFonts w:ascii="Arial"/>
-                <w:b/>
-                <w:sz w:val="14"/>
-              </w:rPr>
-            </w:pPr>
-          </w:p>
-          <w:p>
-            <w:pPr>
-              <w:pStyle w:val="TableParagraph"/>
-              <w:spacing w:before="1"/>
-              <w:ind w:left="57" w:right="15"/>
-              <w:rPr>
-                <w:sz w:val="14"/>
-              </w:rPr>
-            </w:pPr>
-            <w:r>
-              <w:rPr>
-                <w:spacing w:val="-5"/>
-                <w:sz w:val="14"/>
-              </w:rPr>
-              <w:t>HP</w:t>
-            </w:r>
-          </w:p>
-        </w:tc>
-        <w:tc>
-          <w:tcPr>
-            <w:tcW w:w="1109" w:type="dxa"/>
-          </w:tcPr>
-          <w:p>
-            <w:pPr>
-              <w:pStyle w:val="TableParagraph"/>
-              <w:spacing w:before="31"/>
-              <w:jc w:val="left"/>
-              <w:rPr>
-                <w:rFonts w:ascii="Arial"/>
-                <w:b/>
-                <w:sz w:val="14"/>
-              </w:rPr>
-            </w:pPr>
-          </w:p>
-          <w:p>
-            <w:pPr>
-              <w:pStyle w:val="TableParagraph"/>
-              <w:spacing w:before="1"/>
-              <w:ind w:left="59" w:right="5"/>
-              <w:rPr>
-                <w:sz w:val="14"/>
-              </w:rPr>
-            </w:pPr>
-            <w:r>
-              <w:rPr>
-                <w:w w:val="70"/>
-                <w:sz w:val="14"/>
-              </w:rPr>
-              <w:t>SK-</w:t>
-            </w:r>
-            <w:r>
-              <w:rPr>
-                <w:spacing w:val="-4"/>
-                <w:w w:val="95"/>
-                <w:sz w:val="14"/>
-              </w:rPr>
-              <w:t>2015</w:t>
-            </w:r>
-          </w:p>
-        </w:tc>
-        <w:tc>
-          <w:tcPr>
-            <w:tcW w:w="1064" w:type="dxa"/>
-          </w:tcPr>
-          <w:p>
-            <w:pPr>
-              <w:pStyle w:val="TableParagraph"/>
-              <w:spacing w:before="31"/>
-              <w:jc w:val="left"/>
-              <w:rPr>
-                <w:rFonts w:ascii="Arial"/>
-                <w:b/>
-                <w:sz w:val="14"/>
-              </w:rPr>
-            </w:pPr>
-          </w:p>
-          <w:p>
-            <w:pPr>
-              <w:pStyle w:val="TableParagraph"/>
-              <w:spacing w:before="1"/>
-              <w:ind w:left="40"/>
-              <w:rPr>
-                <w:sz w:val="14"/>
-              </w:rPr>
-            </w:pPr>
-            <w:r>
-              <w:rPr>
-                <w:spacing w:val="-6"/>
-                <w:sz w:val="14"/>
-              </w:rPr>
-              <w:t>BDMEP0CCP65F0S</w:t>
-            </w:r>
-          </w:p>
-        </w:tc>
-        <w:tc>
-          <w:tcPr>
-            <w:tcW w:w="1075" w:type="dxa"/>
-          </w:tcPr>
-          <w:p>
-            <w:pPr>
-              <w:pStyle w:val="TableParagraph"/>
-              <w:spacing w:before="31"/>
-              <w:jc w:val="left"/>
-              <w:rPr>
-                <w:rFonts w:ascii="Arial"/>
-                <w:b/>
-                <w:sz w:val="14"/>
-              </w:rPr>
-            </w:pPr>
-          </w:p>
-          <w:p>
-            <w:pPr>
-              <w:pStyle w:val="TableParagraph"/>
-              <w:spacing w:before="1"/>
-              <w:ind w:left="60"/>
-              <w:rPr>
-                <w:sz w:val="14"/>
-              </w:rPr>
-            </w:pPr>
-            <w:r>
-              <w:rPr>
-                <w:spacing w:val="-5"/>
-                <w:sz w:val="14"/>
-              </w:rPr>
-              <w:t>S/F</w:t>
-            </w:r>
-          </w:p>
-        </w:tc>
-        <w:tc>
-          <w:tcPr>
-            <w:tcW w:w="756" w:type="dxa"/>
-          </w:tcPr>
-          <w:p>
-            <w:pPr>
-              <w:pStyle w:val="TableParagraph"/>
-              <w:spacing w:before="31"/>
-              <w:jc w:val="left"/>
-              <w:rPr>
-                <w:rFonts w:ascii="Arial"/>
-                <w:b/>
-                <w:sz w:val="14"/>
-              </w:rPr>
-            </w:pPr>
-          </w:p>
-          <w:p>
-            <w:pPr>
-              <w:pStyle w:val="TableParagraph"/>
-              <w:spacing w:before="1"/>
-              <w:ind w:left="69" w:right="27"/>
-              <w:rPr>
-                <w:sz w:val="14"/>
-              </w:rPr>
-            </w:pPr>
-            <w:r>
-              <w:rPr>
-                <w:spacing w:val="-2"/>
-                <w:sz w:val="14"/>
-              </w:rPr>
-              <w:t>BUENO</w:t>
-            </w:r>
-          </w:p>
-        </w:tc>
-      </w:tr>
-      <w:tr>
-        <w:trPr>
-          <w:trHeight w:val="570"/>
-        </w:trPr>
-        <w:tc>
-          <w:tcPr>
-            <w:tcW w:w="351" w:type="dxa"/>
-          </w:tcPr>
-          <w:p>
-            <w:pPr>
-              <w:pStyle w:val="TableParagraph"/>
-              <w:spacing w:before="34"/>
-              <w:jc w:val="left"/>
-              <w:rPr>
-                <w:rFonts w:ascii="Arial"/>
-                <w:b/>
-                <w:sz w:val="14"/>
-              </w:rPr>
-            </w:pPr>
-          </w:p>
-          <w:p>
-            <w:pPr>
-              <w:pStyle w:val="TableParagraph"/>
-              <w:ind w:left="71"/>
-              <w:rPr>
-                <w:sz w:val="14"/>
-              </w:rPr>
-            </w:pPr>
-            <w:r>
-              <w:rPr>
-                <w:spacing w:val="-10"/>
-                <w:sz w:val="14"/>
-              </w:rPr>
-              <w:t>4</w:t>
-            </w:r>
-          </w:p>
-        </w:tc>
-        <w:tc>
-          <w:tcPr>
-            <w:tcW w:w="619" w:type="dxa"/>
-          </w:tcPr>
-          <w:p>
-            <w:pPr>
-              <w:pStyle w:val="TableParagraph"/>
-              <w:spacing w:before="34"/>
-              <w:jc w:val="left"/>
-              <w:rPr>
-                <w:rFonts w:ascii="Arial"/>
-                <w:b/>
-                <w:sz w:val="14"/>
-              </w:rPr>
-            </w:pPr>
-          </w:p>
-          <w:p>
-            <w:pPr>
-              <w:pStyle w:val="TableParagraph"/>
-              <w:ind w:left="24"/>
-              <w:rPr>
-                <w:sz w:val="14"/>
-              </w:rPr>
-            </w:pPr>
-            <w:r>
-              <w:rPr>
-                <w:spacing w:val="-2"/>
-                <w:sz w:val="14"/>
-              </w:rPr>
-              <w:t>S/COD</w:t>
-            </w:r>
-          </w:p>
-        </w:tc>
-        <w:tc>
-          <w:tcPr>
-            <w:tcW w:w="782" w:type="dxa"/>
-          </w:tcPr>
-          <w:p>
-            <w:pPr>
-              <w:pStyle w:val="TableParagraph"/>
-              <w:spacing w:before="34"/>
-              <w:jc w:val="left"/>
-              <w:rPr>
-                <w:rFonts w:ascii="Arial"/>
-                <w:b/>
-                <w:sz w:val="14"/>
-              </w:rPr>
-            </w:pPr>
-          </w:p>
-          <w:p>
-            <w:pPr>
-              <w:pStyle w:val="TableParagraph"/>
-              <w:ind w:left="48" w:right="23"/>
-              <w:rPr>
-                <w:sz w:val="14"/>
-              </w:rPr>
-            </w:pPr>
-            <w:r>
-              <w:rPr>
-                <w:spacing w:val="-2"/>
-                <w:sz w:val="14"/>
-              </w:rPr>
-              <w:t>S/COD</w:t>
-            </w:r>
-          </w:p>
-        </w:tc>
-        <w:tc>
-          <w:tcPr>
-            <w:tcW w:w="612" w:type="dxa"/>
-          </w:tcPr>
-          <w:p>
-            <w:pPr>
-              <w:pStyle w:val="TableParagraph"/>
-              <w:spacing w:before="34"/>
-              <w:jc w:val="left"/>
-              <w:rPr>
-                <w:rFonts w:ascii="Arial"/>
-                <w:b/>
-                <w:sz w:val="14"/>
-              </w:rPr>
-            </w:pPr>
-          </w:p>
-          <w:p>
-            <w:pPr>
-              <w:pStyle w:val="TableParagraph"/>
-              <w:ind w:left="62" w:right="3"/>
-              <w:rPr>
-                <w:sz w:val="14"/>
-              </w:rPr>
-            </w:pPr>
-            <w:r>
-              <w:rPr>
-                <w:spacing w:val="-10"/>
-                <w:sz w:val="14"/>
-              </w:rPr>
-              <w:t>1</w:t>
-            </w:r>
-          </w:p>
-        </w:tc>
-        <w:tc>
-          <w:tcPr>
-            <w:tcW w:w="2888" w:type="dxa"/>
-          </w:tcPr>
-          <w:p>
-            <w:pPr>
-              <w:pStyle w:val="TableParagraph"/>
-              <w:spacing w:before="34"/>
-              <w:jc w:val="left"/>
-              <w:rPr>
-                <w:rFonts w:ascii="Arial"/>
-                <w:b/>
-                <w:sz w:val="14"/>
-              </w:rPr>
-            </w:pPr>
-          </w:p>
-          <w:p>
-            <w:pPr>
-              <w:pStyle w:val="TableParagraph"/>
-              <w:ind w:left="60" w:right="18"/>
-              <w:rPr>
-                <w:sz w:val="14"/>
-              </w:rPr>
-            </w:pPr>
-            <w:r>
-              <w:rPr>
-                <w:spacing w:val="-2"/>
-                <w:sz w:val="14"/>
-              </w:rPr>
-              <w:t>MOUSE</w:t>
-            </w:r>
-          </w:p>
-        </w:tc>
-        <w:tc>
-          <w:tcPr>
-            <w:tcW w:w="641" w:type="dxa"/>
-          </w:tcPr>
-          <w:p>
-            <w:pPr>
-              <w:pStyle w:val="TableParagraph"/>
-              <w:spacing w:before="34"/>
-              <w:jc w:val="left"/>
-              <w:rPr>
-                <w:rFonts w:ascii="Arial"/>
-                <w:b/>
-                <w:sz w:val="14"/>
-              </w:rPr>
-            </w:pPr>
-          </w:p>
-          <w:p>
-            <w:pPr>
-              <w:pStyle w:val="TableParagraph"/>
-              <w:ind w:left="57" w:right="30"/>
-              <w:rPr>
-                <w:sz w:val="14"/>
-              </w:rPr>
-            </w:pPr>
-            <w:r>
-              <w:rPr>
-                <w:spacing w:val="-2"/>
-                <w:sz w:val="14"/>
-              </w:rPr>
-              <w:t>QUASAD</w:t>
-            </w:r>
-          </w:p>
-        </w:tc>
-        <w:tc>
-          <w:tcPr>
-            <w:tcW w:w="1109" w:type="dxa"/>
-          </w:tcPr>
-          <w:p>
-            <w:pPr>
-              <w:pStyle w:val="TableParagraph"/>
-              <w:spacing w:before="34"/>
-              <w:jc w:val="left"/>
-              <w:rPr>
-                <w:rFonts w:ascii="Arial"/>
-                <w:b/>
-                <w:sz w:val="14"/>
-              </w:rPr>
-            </w:pPr>
-          </w:p>
-          <w:p>
-            <w:pPr>
-              <w:pStyle w:val="TableParagraph"/>
-              <w:ind w:left="37"/>
-              <w:rPr>
-                <w:sz w:val="14"/>
-              </w:rPr>
-            </w:pPr>
-            <w:r>
-              <w:rPr>
-                <w:spacing w:val="-2"/>
-                <w:sz w:val="14"/>
-              </w:rPr>
-              <w:t>STWM006</w:t>
-            </w:r>
-          </w:p>
-        </w:tc>
-        <w:tc>
-          <w:tcPr>
-            <w:tcW w:w="1064" w:type="dxa"/>
-          </w:tcPr>
-          <w:p>
-            <w:pPr>
-              <w:pStyle w:val="TableParagraph"/>
-              <w:spacing w:before="34"/>
-              <w:jc w:val="left"/>
-              <w:rPr>
-                <w:rFonts w:ascii="Arial"/>
-                <w:b/>
-                <w:sz w:val="14"/>
-              </w:rPr>
-            </w:pPr>
-          </w:p>
-          <w:p>
-            <w:pPr>
-              <w:pStyle w:val="TableParagraph"/>
-              <w:ind w:left="42"/>
-              <w:rPr>
-                <w:sz w:val="14"/>
-              </w:rPr>
-            </w:pPr>
-            <w:r>
-              <w:rPr>
-                <w:spacing w:val="-5"/>
-                <w:sz w:val="14"/>
-              </w:rPr>
-              <w:t>S/S</w:t>
-            </w:r>
-          </w:p>
-        </w:tc>
-        <w:tc>
-          <w:tcPr>
-            <w:tcW w:w="1075" w:type="dxa"/>
-          </w:tcPr>
-          <w:p>
-            <w:pPr>
-              <w:pStyle w:val="TableParagraph"/>
-              <w:spacing w:before="34"/>
-              <w:jc w:val="left"/>
-              <w:rPr>
-                <w:rFonts w:ascii="Arial"/>
-                <w:b/>
-                <w:sz w:val="14"/>
-              </w:rPr>
-            </w:pPr>
-          </w:p>
-          <w:p>
-            <w:pPr>
-              <w:pStyle w:val="TableParagraph"/>
-              <w:ind w:left="60"/>
-              <w:rPr>
-                <w:sz w:val="14"/>
-              </w:rPr>
-            </w:pPr>
-            <w:r>
-              <w:rPr>
-                <w:spacing w:val="-5"/>
-                <w:sz w:val="14"/>
-              </w:rPr>
-              <w:t>S/F</w:t>
-            </w:r>
-          </w:p>
-        </w:tc>
-        <w:tc>
-          <w:tcPr>
-            <w:tcW w:w="756" w:type="dxa"/>
-          </w:tcPr>
-          <w:p>
-            <w:pPr>
-              <w:pStyle w:val="TableParagraph"/>
-              <w:spacing w:before="34"/>
-              <w:jc w:val="left"/>
-              <w:rPr>
-                <w:rFonts w:ascii="Arial"/>
-                <w:b/>
-                <w:sz w:val="14"/>
-              </w:rPr>
-            </w:pPr>
-          </w:p>
-          <w:p>
-            <w:pPr>
-              <w:pStyle w:val="TableParagraph"/>
-              <w:ind w:left="69" w:right="27"/>
-              <w:rPr>
-                <w:sz w:val="14"/>
-              </w:rPr>
-            </w:pPr>
-            <w:r>
-              <w:rPr>
-                <w:spacing w:val="-2"/>
-                <w:sz w:val="14"/>
-              </w:rPr>
-              <w:t>BUENO</w:t>
-            </w:r>
-          </w:p>
-        </w:tc>
-      </w:tr>
-      <w:tr>
-        <w:trPr>
-          <w:trHeight w:val="565"/>
-        </w:trPr>
-        <w:tc>
-          <w:tcPr>
-            <w:tcW w:w="351" w:type="dxa"/>
-          </w:tcPr>
-          <w:p>
-            <w:pPr>
-              <w:pStyle w:val="TableParagraph"/>
-              <w:spacing w:before="31"/>
-              <w:jc w:val="left"/>
-              <w:rPr>
-                <w:rFonts w:ascii="Arial"/>
-                <w:b/>
-                <w:sz w:val="14"/>
-              </w:rPr>
-            </w:pPr>
-          </w:p>
-          <w:p>
-            <w:pPr>
-              <w:pStyle w:val="TableParagraph"/>
-              <w:spacing w:before="1"/>
-              <w:ind w:left="71"/>
-              <w:rPr>
-                <w:sz w:val="14"/>
-              </w:rPr>
-            </w:pPr>
-            <w:r>
-              <w:rPr>
-                <w:spacing w:val="-10"/>
-                <w:sz w:val="14"/>
-              </w:rPr>
-              <w:t>5</w:t>
-            </w:r>
-          </w:p>
-        </w:tc>
-        <w:tc>
-          <w:tcPr>
-            <w:tcW w:w="619" w:type="dxa"/>
-          </w:tcPr>
-          <w:p>
-            <w:pPr>
-              <w:pStyle w:val="TableParagraph"/>
-              <w:spacing w:before="31"/>
-              <w:jc w:val="left"/>
-              <w:rPr>
-                <w:rFonts w:ascii="Arial"/>
-                <w:b/>
-                <w:sz w:val="14"/>
-              </w:rPr>
-            </w:pPr>
-          </w:p>
-          <w:p>
-            <w:pPr>
-              <w:pStyle w:val="TableParagraph"/>
-              <w:spacing w:before="1"/>
-              <w:ind w:left="50"/>
-              <w:rPr>
-                <w:sz w:val="14"/>
-              </w:rPr>
-            </w:pPr>
-            <w:r>
-              <w:rPr>
-                <w:spacing w:val="-5"/>
-                <w:sz w:val="14"/>
-              </w:rPr>
-              <w:t>6137143</w:t>
-            </w:r>
-          </w:p>
-        </w:tc>
-        <w:tc>
-          <w:tcPr>
-            <w:tcW w:w="782" w:type="dxa"/>
-          </w:tcPr>
-          <w:p>
-            <w:pPr>
-              <w:pStyle w:val="TableParagraph"/>
-              <w:spacing w:before="31"/>
-              <w:jc w:val="left"/>
-              <w:rPr>
-                <w:rFonts w:ascii="Arial"/>
-                <w:b/>
-                <w:sz w:val="14"/>
-              </w:rPr>
-            </w:pPr>
-          </w:p>
-          <w:p>
-            <w:pPr>
-              <w:pStyle w:val="TableParagraph"/>
-              <w:spacing w:before="1"/>
-              <w:ind w:left="48" w:right="2"/>
-              <w:rPr>
-                <w:sz w:val="14"/>
-              </w:rPr>
-            </w:pPr>
-            <w:r>
-              <w:rPr>
-                <w:spacing w:val="-5"/>
-                <w:sz w:val="14"/>
-              </w:rPr>
-              <w:t>S/C</w:t>
-            </w:r>
-          </w:p>
-        </w:tc>
-        <w:tc>
-          <w:tcPr>
-            <w:tcW w:w="612" w:type="dxa"/>
-          </w:tcPr>
-          <w:p>
-            <w:pPr>
-              <w:pStyle w:val="TableParagraph"/>
-              <w:spacing w:before="31"/>
-              <w:jc w:val="left"/>
-              <w:rPr>
-                <w:rFonts w:ascii="Arial"/>
-                <w:b/>
-                <w:sz w:val="14"/>
-              </w:rPr>
-            </w:pPr>
-          </w:p>
-          <w:p>
-            <w:pPr>
-              <w:pStyle w:val="TableParagraph"/>
-              <w:spacing w:before="1"/>
-              <w:ind w:left="62" w:right="3"/>
-              <w:rPr>
-                <w:sz w:val="14"/>
-              </w:rPr>
-            </w:pPr>
-            <w:r>
-              <w:rPr>
-                <w:spacing w:val="-10"/>
-                <w:sz w:val="14"/>
-              </w:rPr>
-              <w:t>1</w:t>
-            </w:r>
-          </w:p>
-        </w:tc>
-        <w:tc>
-          <w:tcPr>
-            <w:tcW w:w="2888" w:type="dxa"/>
-          </w:tcPr>
-          <w:p>
-            <w:pPr>
-              <w:pStyle w:val="TableParagraph"/>
-              <w:spacing w:before="8"/>
-              <w:ind w:left="108" w:firstLine="57"/>
-              <w:jc w:val="left"/>
-              <w:rPr>
-                <w:sz w:val="14"/>
-              </w:rPr>
-            </w:pPr>
-            <w:r>
-              <w:rPr>
-                <w:w w:val="80"/>
-                <w:sz w:val="14"/>
-              </w:rPr>
-              <w:t>SILLA</w:t>
-            </w:r>
-            <w:r>
-              <w:rPr>
-                <w:spacing w:val="3"/>
-                <w:sz w:val="14"/>
-              </w:rPr>
-              <w:t xml:space="preserve"> </w:t>
-            </w:r>
-            <w:r>
-              <w:rPr>
-                <w:w w:val="80"/>
-                <w:sz w:val="14"/>
-              </w:rPr>
-              <w:t>CHUKUY</w:t>
-            </w:r>
-            <w:r>
-              <w:rPr>
-                <w:spacing w:val="8"/>
-                <w:sz w:val="14"/>
-              </w:rPr>
-              <w:t xml:space="preserve"> </w:t>
-            </w:r>
-            <w:r>
-              <w:rPr>
-                <w:w w:val="80"/>
-                <w:sz w:val="14"/>
-              </w:rPr>
-              <w:t>TAPIZADO</w:t>
-            </w:r>
-            <w:r>
-              <w:rPr>
-                <w:spacing w:val="6"/>
-                <w:sz w:val="14"/>
-              </w:rPr>
-              <w:t xml:space="preserve"> </w:t>
-            </w:r>
-            <w:r>
-              <w:rPr>
-                <w:w w:val="80"/>
-                <w:sz w:val="14"/>
-              </w:rPr>
-              <w:t>EN</w:t>
-            </w:r>
-            <w:r>
-              <w:rPr>
-                <w:spacing w:val="6"/>
-                <w:sz w:val="14"/>
-              </w:rPr>
-              <w:t xml:space="preserve"> </w:t>
-            </w:r>
-            <w:r>
-              <w:rPr>
-                <w:w w:val="80"/>
-                <w:sz w:val="14"/>
-              </w:rPr>
-              <w:t>ASIENTO</w:t>
-            </w:r>
-            <w:r>
-              <w:rPr>
-                <w:spacing w:val="6"/>
-                <w:sz w:val="14"/>
-              </w:rPr>
-              <w:t xml:space="preserve"> </w:t>
-            </w:r>
-            <w:r>
-              <w:rPr>
-                <w:w w:val="80"/>
-                <w:sz w:val="14"/>
-              </w:rPr>
-              <w:t>Y</w:t>
-            </w:r>
-            <w:r>
-              <w:rPr>
-                <w:spacing w:val="9"/>
-                <w:sz w:val="14"/>
-              </w:rPr>
-              <w:t xml:space="preserve"> </w:t>
-            </w:r>
-            <w:r>
-              <w:rPr>
-                <w:w w:val="80"/>
-                <w:sz w:val="14"/>
-              </w:rPr>
-              <w:t>ESPALDAR</w:t>
-            </w:r>
-            <w:r>
-              <w:rPr>
-                <w:spacing w:val="22"/>
-                <w:sz w:val="14"/>
-              </w:rPr>
-              <w:t xml:space="preserve"> </w:t>
-            </w:r>
-            <w:r>
-              <w:rPr>
-                <w:spacing w:val="-5"/>
-                <w:w w:val="80"/>
-                <w:sz w:val="14"/>
-              </w:rPr>
-              <w:t>DE</w:t>
-            </w:r>
-          </w:p>
-          <w:p>
-            <w:pPr>
-              <w:pStyle w:val="TableParagraph"/>
-              <w:spacing w:before="7" w:line="180" w:lineRule="atLeast"/>
-              <w:ind w:left="934" w:right="57" w:hanging="827"/>
-              <w:jc w:val="left"/>
-              <w:rPr>
-                <w:sz w:val="14"/>
-              </w:rPr>
-            </w:pPr>
-            <w:r>
-              <w:rPr>
-                <w:spacing w:val="-2"/>
-                <w:w w:val="80"/>
-                <w:sz w:val="14"/>
-              </w:rPr>
-              <w:t>CUERINA</w:t>
-            </w:r>
-            <w:r>
-              <w:rPr>
-                <w:spacing w:val="-6"/>
-                <w:w w:val="80"/>
-                <w:sz w:val="14"/>
-              </w:rPr>
-              <w:t xml:space="preserve"> </w:t>
-            </w:r>
-            <w:r>
-              <w:rPr>
-                <w:spacing w:val="-2"/>
-                <w:w w:val="80"/>
-                <w:sz w:val="14"/>
-              </w:rPr>
-              <w:t>COLOR</w:t>
-            </w:r>
-            <w:r>
-              <w:rPr>
-                <w:spacing w:val="-3"/>
-                <w:w w:val="80"/>
-                <w:sz w:val="14"/>
-              </w:rPr>
-              <w:t xml:space="preserve"> </w:t>
-            </w:r>
-            <w:r>
-              <w:rPr>
-                <w:spacing w:val="-2"/>
-                <w:w w:val="80"/>
-                <w:sz w:val="14"/>
-              </w:rPr>
-              <w:t>NEGRO,</w:t>
-            </w:r>
-            <w:r>
-              <w:rPr>
-                <w:spacing w:val="-6"/>
-                <w:sz w:val="14"/>
-              </w:rPr>
-              <w:t xml:space="preserve"> </w:t>
-            </w:r>
-            <w:r>
-              <w:rPr>
-                <w:spacing w:val="-2"/>
-                <w:w w:val="80"/>
-                <w:sz w:val="14"/>
-              </w:rPr>
-              <w:t>APOYABRAZOS</w:t>
-            </w:r>
-            <w:r>
-              <w:rPr>
-                <w:spacing w:val="-9"/>
-                <w:sz w:val="14"/>
-              </w:rPr>
-              <w:t xml:space="preserve"> </w:t>
-            </w:r>
-            <w:r>
-              <w:rPr>
-                <w:spacing w:val="-2"/>
-                <w:w w:val="80"/>
-                <w:sz w:val="14"/>
-              </w:rPr>
-              <w:t>DE</w:t>
-            </w:r>
-            <w:r>
-              <w:rPr>
-                <w:spacing w:val="-5"/>
-                <w:w w:val="80"/>
-                <w:sz w:val="14"/>
-              </w:rPr>
-              <w:t xml:space="preserve"> </w:t>
-            </w:r>
-            <w:r>
-              <w:rPr>
-                <w:spacing w:val="-2"/>
-                <w:w w:val="80"/>
-                <w:sz w:val="14"/>
-              </w:rPr>
-              <w:t>PLÁSTICO</w:t>
-            </w:r>
-            <w:r>
-              <w:rPr>
-                <w:spacing w:val="-6"/>
-                <w:w w:val="80"/>
-                <w:sz w:val="14"/>
-              </w:rPr>
-              <w:t xml:space="preserve"> </w:t>
-            </w:r>
-            <w:r>
-              <w:rPr>
-                <w:spacing w:val="-2"/>
-                <w:w w:val="80"/>
-                <w:sz w:val="14"/>
-              </w:rPr>
-              <w:t>COLOR</w:t>
-            </w:r>
-            <w:r>
-              <w:rPr>
-                <w:spacing w:val="40"/>
-                <w:sz w:val="14"/>
-              </w:rPr>
-              <w:t xml:space="preserve"> </w:t>
-            </w:r>
-            <w:r>
-              <w:rPr>
-                <w:w w:val="90"/>
-                <w:sz w:val="14"/>
-              </w:rPr>
-              <w:t>NEGRO</w:t>
-            </w:r>
-            <w:r>
-              <w:rPr>
-                <w:spacing w:val="-12"/>
-                <w:w w:val="90"/>
-                <w:sz w:val="14"/>
-              </w:rPr>
-              <w:t xml:space="preserve"> </w:t>
-            </w:r>
-            <w:r>
-              <w:rPr>
-                <w:w w:val="90"/>
-                <w:sz w:val="14"/>
-              </w:rPr>
-              <w:t>Y</w:t>
-            </w:r>
-            <w:r>
-              <w:rPr>
-                <w:spacing w:val="-16"/>
-                <w:w w:val="90"/>
-                <w:sz w:val="14"/>
-              </w:rPr>
-              <w:t xml:space="preserve"> </w:t>
-            </w:r>
-            <w:r>
-              <w:rPr>
-                <w:w w:val="90"/>
-                <w:sz w:val="14"/>
-              </w:rPr>
-              <w:t>5</w:t>
-            </w:r>
-            <w:r>
-              <w:rPr>
-                <w:spacing w:val="-5"/>
-                <w:w w:val="90"/>
-                <w:sz w:val="14"/>
-              </w:rPr>
-              <w:t xml:space="preserve"> </w:t>
-            </w:r>
-            <w:r>
-              <w:rPr>
-                <w:w w:val="90"/>
-                <w:sz w:val="14"/>
-              </w:rPr>
-              <w:t>GARRUCHAS</w:t>
-            </w:r>
-          </w:p>
-        </w:tc>
-        <w:tc>
-          <w:tcPr>
-            <w:tcW w:w="641" w:type="dxa"/>
-          </w:tcPr>
-          <w:p>
-            <w:pPr>
-              <w:pStyle w:val="TableParagraph"/>
-              <w:spacing w:before="31"/>
-              <w:jc w:val="left"/>
-              <w:rPr>
-                <w:rFonts w:ascii="Arial"/>
-                <w:b/>
-                <w:sz w:val="14"/>
-              </w:rPr>
-            </w:pPr>
-          </w:p>
-          <w:p>
-            <w:pPr>
-              <w:pStyle w:val="TableParagraph"/>
-              <w:spacing w:before="1"/>
-              <w:ind w:left="57"/>
-              <w:rPr>
-                <w:sz w:val="14"/>
-              </w:rPr>
-            </w:pPr>
-            <w:r>
-              <w:rPr>
-                <w:spacing w:val="-5"/>
-                <w:sz w:val="14"/>
-              </w:rPr>
-              <w:t>S/M</w:t>
-            </w:r>
-          </w:p>
-        </w:tc>
-        <w:tc>
-          <w:tcPr>
-            <w:tcW w:w="1109" w:type="dxa"/>
-          </w:tcPr>
-          <w:p>
-            <w:pPr>
-              <w:pStyle w:val="TableParagraph"/>
-              <w:spacing w:before="31"/>
-              <w:jc w:val="left"/>
-              <w:rPr>
-                <w:rFonts w:ascii="Arial"/>
-                <w:b/>
-                <w:sz w:val="14"/>
-              </w:rPr>
-            </w:pPr>
-          </w:p>
-          <w:p>
-            <w:pPr>
-              <w:pStyle w:val="TableParagraph"/>
-              <w:spacing w:before="1"/>
-              <w:ind w:left="59"/>
-              <w:rPr>
-                <w:sz w:val="14"/>
-              </w:rPr>
-            </w:pPr>
-            <w:r>
-              <w:rPr>
-                <w:spacing w:val="-5"/>
-                <w:sz w:val="14"/>
-              </w:rPr>
-              <w:t>S/M</w:t>
-            </w:r>
-          </w:p>
-        </w:tc>
-        <w:tc>
-          <w:tcPr>
-            <w:tcW w:w="1064" w:type="dxa"/>
-          </w:tcPr>
-          <w:p>
-            <w:pPr>
-              <w:pStyle w:val="TableParagraph"/>
-              <w:spacing w:before="31"/>
-              <w:jc w:val="left"/>
-              <w:rPr>
-                <w:rFonts w:ascii="Arial"/>
-                <w:b/>
-                <w:sz w:val="14"/>
-              </w:rPr>
-            </w:pPr>
-          </w:p>
-          <w:p>
-            <w:pPr>
-              <w:pStyle w:val="TableParagraph"/>
-              <w:spacing w:before="1"/>
-              <w:ind w:left="42"/>
-              <w:rPr>
-                <w:sz w:val="14"/>
-              </w:rPr>
-            </w:pPr>
-            <w:r>
-              <w:rPr>
-                <w:spacing w:val="-5"/>
-                <w:sz w:val="14"/>
-              </w:rPr>
-              <w:t>S/S</w:t>
-            </w:r>
-          </w:p>
-        </w:tc>
-        <w:tc>
-          <w:tcPr>
-            <w:tcW w:w="1075" w:type="dxa"/>
-          </w:tcPr>
-          <w:p>
-            <w:pPr>
-              <w:pStyle w:val="TableParagraph"/>
-              <w:spacing w:before="31"/>
-              <w:jc w:val="left"/>
-              <w:rPr>
-                <w:rFonts w:ascii="Arial"/>
-                <w:b/>
-                <w:sz w:val="14"/>
-              </w:rPr>
-            </w:pPr>
-          </w:p>
-          <w:p>
-            <w:pPr>
-              <w:pStyle w:val="TableParagraph"/>
-              <w:spacing w:before="1"/>
-              <w:ind w:left="60"/>
-              <w:rPr>
-                <w:sz w:val="14"/>
-              </w:rPr>
-            </w:pPr>
-            <w:r>
-              <w:rPr>
-                <w:spacing w:val="-5"/>
-                <w:sz w:val="14"/>
-              </w:rPr>
-              <w:t>S/F</w:t>
-            </w:r>
-          </w:p>
-        </w:tc>
-        <w:tc>
-          <w:tcPr>
-            <w:tcW w:w="756" w:type="dxa"/>
-          </w:tcPr>
-          <w:p>
-            <w:pPr>
-              <w:pStyle w:val="TableParagraph"/>
-              <w:spacing w:before="31"/>
-              <w:jc w:val="left"/>
-              <w:rPr>
-                <w:rFonts w:ascii="Arial"/>
-                <w:b/>
-                <w:sz w:val="14"/>
-              </w:rPr>
-            </w:pPr>
-          </w:p>
-          <w:p>
-            <w:pPr>
-              <w:pStyle w:val="TableParagraph"/>
-              <w:spacing w:before="1"/>
-              <w:ind w:left="69" w:right="27"/>
-              <w:rPr>
-                <w:sz w:val="14"/>
-              </w:rPr>
-            </w:pPr>
-            <w:r>
-              <w:rPr>
-                <w:spacing w:val="-2"/>
-                <w:sz w:val="14"/>
-              </w:rPr>
-              <w:t>BUENO</w:t>
-            </w:r>
-          </w:p>
-        </w:tc>
-      </w:tr>
-      <w:tr>
-        <w:trPr>
-          <w:trHeight w:val="571"/>
-        </w:trPr>
-        <w:tc>
-          <w:tcPr>
-            <w:tcW w:w="351" w:type="dxa"/>
-          </w:tcPr>
-          <w:p>
-            <w:pPr>
-              <w:pStyle w:val="TableParagraph"/>
-              <w:spacing w:before="34"/>
-              <w:jc w:val="left"/>
-              <w:rPr>
-                <w:rFonts w:ascii="Arial"/>
-                <w:b/>
-                <w:sz w:val="14"/>
-              </w:rPr>
-            </w:pPr>
-          </w:p>
-          <w:p>
-            <w:pPr>
-              <w:pStyle w:val="TableParagraph"/>
-              <w:ind w:left="71"/>
-              <w:rPr>
-                <w:sz w:val="14"/>
-              </w:rPr>
-            </w:pPr>
-            <w:r>
-              <w:rPr>
-                <w:spacing w:val="-10"/>
-                <w:sz w:val="14"/>
-              </w:rPr>
-              <w:t>6</w:t>
-            </w:r>
-          </w:p>
-        </w:tc>
-        <w:tc>
-          <w:tcPr>
-            <w:tcW w:w="619" w:type="dxa"/>
-          </w:tcPr>
-          <w:p>
-            <w:pPr>
-              <w:pStyle w:val="TableParagraph"/>
-              <w:spacing w:before="34"/>
-              <w:jc w:val="left"/>
-              <w:rPr>
-                <w:rFonts w:ascii="Arial"/>
-                <w:b/>
-                <w:sz w:val="14"/>
-              </w:rPr>
-            </w:pPr>
-          </w:p>
-          <w:p>
-            <w:pPr>
-              <w:pStyle w:val="TableParagraph"/>
-              <w:ind w:left="50"/>
-              <w:rPr>
-                <w:sz w:val="14"/>
-              </w:rPr>
-            </w:pPr>
-            <w:r>
-              <w:rPr>
-                <w:spacing w:val="-5"/>
-                <w:sz w:val="14"/>
-              </w:rPr>
-              <w:t>S/C</w:t>
-            </w:r>
-          </w:p>
-        </w:tc>
-        <w:tc>
-          <w:tcPr>
-            <w:tcW w:w="782" w:type="dxa"/>
-          </w:tcPr>
-          <w:p>
-            <w:pPr>
-              <w:pStyle w:val="TableParagraph"/>
-              <w:spacing w:before="34"/>
-              <w:jc w:val="left"/>
-              <w:rPr>
-                <w:rFonts w:ascii="Arial"/>
-                <w:b/>
-                <w:sz w:val="14"/>
-              </w:rPr>
-            </w:pPr>
-          </w:p>
-          <w:p>
-            <w:pPr>
-              <w:pStyle w:val="TableParagraph"/>
-              <w:ind w:left="48" w:right="2"/>
-              <w:rPr>
-                <w:sz w:val="14"/>
-              </w:rPr>
-            </w:pPr>
-            <w:r>
-              <w:rPr>
-                <w:spacing w:val="-5"/>
-                <w:sz w:val="14"/>
-              </w:rPr>
-              <w:t>S/C</w:t>
-            </w:r>
-          </w:p>
-        </w:tc>
-        <w:tc>
-          <w:tcPr>
-            <w:tcW w:w="612" w:type="dxa"/>
-          </w:tcPr>
-          <w:p>
-            <w:pPr>
-              <w:pStyle w:val="TableParagraph"/>
-              <w:spacing w:before="34"/>
-              <w:jc w:val="left"/>
-              <w:rPr>
-                <w:rFonts w:ascii="Arial"/>
-                <w:b/>
-                <w:sz w:val="14"/>
-              </w:rPr>
-            </w:pPr>
-          </w:p>
-          <w:p>
-            <w:pPr>
-              <w:pStyle w:val="TableParagraph"/>
-              <w:ind w:left="62" w:right="3"/>
-              <w:rPr>
-                <w:sz w:val="14"/>
-              </w:rPr>
-            </w:pPr>
-            <w:r>
-              <w:rPr>
-                <w:spacing w:val="-10"/>
-                <w:sz w:val="14"/>
-              </w:rPr>
-              <w:t>1</w:t>
-            </w:r>
-          </w:p>
-        </w:tc>
-        <w:tc>
-          <w:tcPr>
-            <w:tcW w:w="2888" w:type="dxa"/>
-          </w:tcPr>
-          <w:p>
-            <w:pPr>
-              <w:pStyle w:val="TableParagraph"/>
-              <w:spacing w:before="10" w:line="256" w:lineRule="auto"/>
-              <w:ind w:left="88" w:right="144" w:firstLine="98"/>
-              <w:jc w:val="left"/>
-              <w:rPr>
-                <w:sz w:val="14"/>
-              </w:rPr>
-            </w:pPr>
-            <w:r>
-              <w:rPr>
-                <w:w w:val="80"/>
-                <w:sz w:val="14"/>
-              </w:rPr>
-              <w:t>SILLA</w:t>
-            </w:r>
-            <w:r>
-              <w:rPr>
-                <w:spacing w:val="-8"/>
-                <w:w w:val="80"/>
-                <w:sz w:val="14"/>
-              </w:rPr>
-              <w:t xml:space="preserve"> </w:t>
-            </w:r>
-            <w:r>
-              <w:rPr>
-                <w:w w:val="80"/>
-                <w:sz w:val="14"/>
-              </w:rPr>
-              <w:t>ESTATICA</w:t>
-            </w:r>
-            <w:r>
-              <w:rPr>
-                <w:spacing w:val="-8"/>
-                <w:w w:val="80"/>
-                <w:sz w:val="14"/>
-              </w:rPr>
-              <w:t xml:space="preserve"> </w:t>
-            </w:r>
-            <w:r>
-              <w:rPr>
-                <w:w w:val="80"/>
-                <w:sz w:val="14"/>
-              </w:rPr>
-              <w:t>COLOR</w:t>
-            </w:r>
-            <w:r>
-              <w:rPr>
-                <w:spacing w:val="-1"/>
-                <w:w w:val="80"/>
-                <w:sz w:val="14"/>
-              </w:rPr>
-              <w:t xml:space="preserve"> </w:t>
-            </w:r>
-            <w:r>
-              <w:rPr>
-                <w:w w:val="80"/>
-                <w:sz w:val="14"/>
-              </w:rPr>
-              <w:t>NEGRO</w:t>
-            </w:r>
-            <w:r>
-              <w:rPr>
-                <w:spacing w:val="-6"/>
-                <w:w w:val="80"/>
-                <w:sz w:val="14"/>
-              </w:rPr>
-              <w:t xml:space="preserve"> </w:t>
-            </w:r>
-            <w:r>
-              <w:rPr>
-                <w:w w:val="80"/>
-                <w:sz w:val="14"/>
-              </w:rPr>
-              <w:t>PATAS</w:t>
-            </w:r>
-            <w:r>
-              <w:rPr>
-                <w:spacing w:val="-2"/>
-                <w:w w:val="80"/>
-                <w:sz w:val="14"/>
-              </w:rPr>
-              <w:t xml:space="preserve"> </w:t>
-            </w:r>
-            <w:r>
-              <w:rPr>
-                <w:w w:val="80"/>
-                <w:sz w:val="14"/>
-              </w:rPr>
-              <w:t>METÀLICAS</w:t>
-            </w:r>
-            <w:r>
-              <w:rPr>
-                <w:spacing w:val="-1"/>
-                <w:w w:val="80"/>
-                <w:sz w:val="14"/>
-              </w:rPr>
-              <w:t xml:space="preserve"> </w:t>
-            </w:r>
-            <w:r>
-              <w:rPr>
-                <w:w w:val="80"/>
-                <w:sz w:val="14"/>
-              </w:rPr>
-              <w:t>TUBO</w:t>
-            </w:r>
-            <w:r>
-              <w:rPr>
-                <w:spacing w:val="40"/>
-                <w:sz w:val="14"/>
-              </w:rPr>
-              <w:t xml:space="preserve"> </w:t>
-            </w:r>
-            <w:r>
-              <w:rPr>
-                <w:w w:val="70"/>
-                <w:sz w:val="14"/>
-              </w:rPr>
-              <w:t>REDONDO</w:t>
-            </w:r>
-            <w:r>
-              <w:rPr>
-                <w:spacing w:val="52"/>
-                <w:sz w:val="14"/>
-              </w:rPr>
-              <w:t xml:space="preserve"> </w:t>
-            </w:r>
-            <w:r>
-              <w:rPr>
-                <w:w w:val="70"/>
-                <w:sz w:val="14"/>
-              </w:rPr>
-              <w:t>FORRADA</w:t>
-            </w:r>
-            <w:r>
-              <w:rPr>
-                <w:spacing w:val="12"/>
-                <w:sz w:val="14"/>
-              </w:rPr>
-              <w:t xml:space="preserve"> </w:t>
-            </w:r>
-            <w:r>
-              <w:rPr>
-                <w:w w:val="70"/>
-                <w:sz w:val="14"/>
-              </w:rPr>
-              <w:t>DE</w:t>
-            </w:r>
-            <w:r>
-              <w:rPr>
-                <w:spacing w:val="5"/>
-                <w:sz w:val="14"/>
-              </w:rPr>
-              <w:t xml:space="preserve"> </w:t>
-            </w:r>
-            <w:r>
-              <w:rPr>
-                <w:w w:val="70"/>
-                <w:sz w:val="14"/>
-              </w:rPr>
-              <w:t>YUTE</w:t>
-            </w:r>
-            <w:r>
-              <w:rPr>
-                <w:spacing w:val="11"/>
-                <w:sz w:val="14"/>
-              </w:rPr>
-              <w:t xml:space="preserve"> </w:t>
-            </w:r>
-            <w:r>
-              <w:rPr>
-                <w:w w:val="70"/>
-                <w:sz w:val="14"/>
-              </w:rPr>
-              <w:t>NEGRO</w:t>
-            </w:r>
-            <w:r>
-              <w:rPr>
-                <w:spacing w:val="10"/>
-                <w:sz w:val="14"/>
-              </w:rPr>
-              <w:t xml:space="preserve"> </w:t>
-            </w:r>
-            <w:r>
-              <w:rPr>
-                <w:w w:val="70"/>
-                <w:sz w:val="14"/>
-              </w:rPr>
-              <w:t>ESPALDAR</w:t>
-            </w:r>
-            <w:r>
-              <w:rPr>
-                <w:spacing w:val="22"/>
-                <w:sz w:val="14"/>
-              </w:rPr>
-              <w:t xml:space="preserve"> </w:t>
-            </w:r>
-            <w:r>
-              <w:rPr>
-                <w:spacing w:val="-2"/>
-                <w:w w:val="70"/>
-                <w:sz w:val="14"/>
-              </w:rPr>
-              <w:t>OVALADO.</w:t>
-            </w:r>
-          </w:p>
-        </w:tc>
-        <w:tc>
-          <w:tcPr>
-            <w:tcW w:w="641" w:type="dxa"/>
-          </w:tcPr>
-          <w:p>
-            <w:pPr>
-              <w:pStyle w:val="TableParagraph"/>
-              <w:spacing w:before="34"/>
-              <w:jc w:val="left"/>
-              <w:rPr>
-                <w:rFonts w:ascii="Arial"/>
-                <w:b/>
-                <w:sz w:val="14"/>
-              </w:rPr>
-            </w:pPr>
-          </w:p>
-          <w:p>
-            <w:pPr>
-              <w:pStyle w:val="TableParagraph"/>
-              <w:ind w:left="57"/>
-              <w:rPr>
-                <w:sz w:val="14"/>
-              </w:rPr>
-            </w:pPr>
-            <w:r>
-              <w:rPr>
-                <w:spacing w:val="-5"/>
-                <w:sz w:val="14"/>
-              </w:rPr>
-              <w:t>S/M</w:t>
-            </w:r>
-          </w:p>
-        </w:tc>
-        <w:tc>
-          <w:tcPr>
-            <w:tcW w:w="1109" w:type="dxa"/>
-          </w:tcPr>
-          <w:p>
-            <w:pPr>
-              <w:pStyle w:val="TableParagraph"/>
-              <w:spacing w:before="34"/>
-              <w:jc w:val="left"/>
-              <w:rPr>
-                <w:rFonts w:ascii="Arial"/>
-                <w:b/>
-                <w:sz w:val="14"/>
-              </w:rPr>
-            </w:pPr>
-          </w:p>
-          <w:p>
-            <w:pPr>
-              <w:pStyle w:val="TableParagraph"/>
-              <w:ind w:left="59"/>
-              <w:rPr>
-                <w:sz w:val="14"/>
-              </w:rPr>
-            </w:pPr>
-            <w:r>
-              <w:rPr>
-                <w:spacing w:val="-5"/>
-                <w:sz w:val="14"/>
-              </w:rPr>
-              <w:t>S/M</w:t>
-            </w:r>
-          </w:p>
-        </w:tc>
-        <w:tc>
-          <w:tcPr>
-            <w:tcW w:w="1064" w:type="dxa"/>
-          </w:tcPr>
-          <w:p>
-            <w:pPr>
-              <w:pStyle w:val="TableParagraph"/>
-              <w:spacing w:before="34"/>
-              <w:jc w:val="left"/>
-              <w:rPr>
-                <w:rFonts w:ascii="Arial"/>
-                <w:b/>
-                <w:sz w:val="14"/>
-              </w:rPr>
-            </w:pPr>
-          </w:p>
-          <w:p>
-            <w:pPr>
-              <w:pStyle w:val="TableParagraph"/>
-              <w:ind w:left="62"/>
-              <w:rPr>
-                <w:sz w:val="14"/>
-              </w:rPr>
-            </w:pPr>
-            <w:r>
-              <w:rPr>
-                <w:spacing w:val="-5"/>
-                <w:sz w:val="14"/>
-              </w:rPr>
-              <w:t>S/S</w:t>
-            </w:r>
-          </w:p>
-        </w:tc>
-        <w:tc>
-          <w:tcPr>
-            <w:tcW w:w="1075" w:type="dxa"/>
-          </w:tcPr>
-          <w:p>
-            <w:pPr>
-              <w:pStyle w:val="TableParagraph"/>
-              <w:spacing w:before="34"/>
-              <w:jc w:val="left"/>
-              <w:rPr>
-                <w:rFonts w:ascii="Arial"/>
-                <w:b/>
-                <w:sz w:val="14"/>
-              </w:rPr>
-            </w:pPr>
-          </w:p>
-          <w:p>
-            <w:pPr>
-              <w:pStyle w:val="TableParagraph"/>
-              <w:ind w:left="60"/>
-              <w:rPr>
-                <w:sz w:val="14"/>
-              </w:rPr>
-            </w:pPr>
-            <w:r>
-              <w:rPr>
-                <w:spacing w:val="-5"/>
-                <w:sz w:val="14"/>
-              </w:rPr>
-              <w:t>S/F</w:t>
-            </w:r>
-          </w:p>
-        </w:tc>
-        <w:tc>
-          <w:tcPr>
-            <w:tcW w:w="756" w:type="dxa"/>
-          </w:tcPr>
-          <w:p>
-            <w:pPr>
-              <w:pStyle w:val="TableParagraph"/>
-              <w:spacing w:before="34"/>
-              <w:jc w:val="left"/>
-              <w:rPr>
-                <w:rFonts w:ascii="Arial"/>
-                <w:b/>
-                <w:sz w:val="14"/>
-              </w:rPr>
-            </w:pPr>
-          </w:p>
-          <w:p>
-            <w:pPr>
-              <w:pStyle w:val="TableParagraph"/>
-              <w:ind w:left="69" w:right="27"/>
-              <w:rPr>
-                <w:sz w:val="14"/>
-              </w:rPr>
-            </w:pPr>
-            <w:r>
-              <w:rPr>
-                <w:spacing w:val="-2"/>
-                <w:sz w:val="14"/>
-              </w:rPr>
-              <w:t>BUENO</w:t>
-            </w:r>
-          </w:p>
-        </w:tc>
-      </w:tr>
-      <w:tr>
-        <w:trPr>
-          <w:trHeight w:val="565"/>
-        </w:trPr>
-        <w:tc>
-          <w:tcPr>
-            <w:tcW w:w="351" w:type="dxa"/>
-          </w:tcPr>
-          <w:p>
-            <w:pPr>
-              <w:pStyle w:val="TableParagraph"/>
-              <w:spacing w:before="31"/>
-              <w:jc w:val="left"/>
-              <w:rPr>
-                <w:rFonts w:ascii="Arial"/>
-                <w:b/>
-                <w:sz w:val="14"/>
-              </w:rPr>
-            </w:pPr>
-          </w:p>
-          <w:p>
-            <w:pPr>
-              <w:pStyle w:val="TableParagraph"/>
-              <w:spacing w:before="1"/>
-              <w:ind w:left="71"/>
-              <w:rPr>
-                <w:sz w:val="14"/>
-              </w:rPr>
-            </w:pPr>
-            <w:r>
-              <w:rPr>
-                <w:spacing w:val="-10"/>
-                <w:sz w:val="14"/>
-              </w:rPr>
-              <w:t>7</w:t>
-            </w:r>
-          </w:p>
-        </w:tc>
-        <w:tc>
-          <w:tcPr>
-            <w:tcW w:w="619" w:type="dxa"/>
-          </w:tcPr>
-          <w:p>
-            <w:pPr>
-              <w:pStyle w:val="TableParagraph"/>
-              <w:spacing w:before="31"/>
-              <w:jc w:val="left"/>
-              <w:rPr>
-                <w:rFonts w:ascii="Arial"/>
-                <w:b/>
-                <w:sz w:val="14"/>
-              </w:rPr>
-            </w:pPr>
-          </w:p>
-          <w:p>
-            <w:pPr>
-              <w:pStyle w:val="TableParagraph"/>
-              <w:spacing w:before="1"/>
-              <w:ind w:left="50"/>
-              <w:rPr>
-                <w:sz w:val="14"/>
-              </w:rPr>
-            </w:pPr>
-            <w:r>
-              <w:rPr>
-                <w:spacing w:val="-5"/>
-                <w:sz w:val="14"/>
-              </w:rPr>
-              <w:t>S/C</w:t>
-            </w:r>
-          </w:p>
-        </w:tc>
-        <w:tc>
-          <w:tcPr>
-            <w:tcW w:w="782" w:type="dxa"/>
-          </w:tcPr>
-          <w:p>
-            <w:pPr>
-              <w:pStyle w:val="TableParagraph"/>
-              <w:spacing w:before="31"/>
-              <w:jc w:val="left"/>
-              <w:rPr>
-                <w:rFonts w:ascii="Arial"/>
-                <w:b/>
-                <w:sz w:val="14"/>
-              </w:rPr>
-            </w:pPr>
-          </w:p>
-          <w:p>
-            <w:pPr>
-              <w:pStyle w:val="TableParagraph"/>
-              <w:spacing w:before="1"/>
-              <w:ind w:left="48" w:right="2"/>
-              <w:rPr>
-                <w:sz w:val="14"/>
-              </w:rPr>
-            </w:pPr>
-            <w:r>
-              <w:rPr>
-                <w:spacing w:val="-5"/>
-                <w:sz w:val="14"/>
-              </w:rPr>
-              <w:t>S/C</w:t>
-            </w:r>
-          </w:p>
-        </w:tc>
-        <w:tc>
-          <w:tcPr>
-            <w:tcW w:w="612" w:type="dxa"/>
-          </w:tcPr>
-          <w:p>
-            <w:pPr>
-              <w:pStyle w:val="TableParagraph"/>
-              <w:spacing w:before="31"/>
-              <w:jc w:val="left"/>
-              <w:rPr>
-                <w:rFonts w:ascii="Arial"/>
-                <w:b/>
-                <w:sz w:val="14"/>
-              </w:rPr>
-            </w:pPr>
-          </w:p>
-          <w:p>
-            <w:pPr>
-              <w:pStyle w:val="TableParagraph"/>
-              <w:spacing w:before="1"/>
-              <w:ind w:left="62" w:right="3"/>
-              <w:rPr>
-                <w:sz w:val="14"/>
-              </w:rPr>
-            </w:pPr>
-            <w:r>
-              <w:rPr>
-                <w:spacing w:val="-10"/>
-                <w:sz w:val="14"/>
-              </w:rPr>
-              <w:t>1</w:t>
-            </w:r>
-          </w:p>
-        </w:tc>
-        <w:tc>
-          <w:tcPr>
-            <w:tcW w:w="2888" w:type="dxa"/>
-          </w:tcPr>
-          <w:p>
-            <w:pPr>
-              <w:pStyle w:val="TableParagraph"/>
-              <w:spacing w:before="31"/>
-              <w:jc w:val="left"/>
-              <w:rPr>
-                <w:rFonts w:ascii="Arial"/>
-                <w:b/>
-                <w:sz w:val="14"/>
-              </w:rPr>
-            </w:pPr>
-          </w:p>
-          <w:p>
-            <w:pPr>
-              <w:pStyle w:val="TableParagraph"/>
-              <w:spacing w:before="1"/>
-              <w:ind w:left="60" w:right="3"/>
-              <w:rPr>
-                <w:sz w:val="14"/>
-              </w:rPr>
-            </w:pPr>
-            <w:r>
-              <w:rPr>
-                <w:w w:val="75"/>
-                <w:sz w:val="14"/>
-              </w:rPr>
-              <w:t>MESA</w:t>
-            </w:r>
-            <w:r>
-              <w:rPr>
-                <w:spacing w:val="-5"/>
-                <w:sz w:val="14"/>
-              </w:rPr>
-              <w:t xml:space="preserve"> </w:t>
-            </w:r>
-            <w:r>
-              <w:rPr>
-                <w:w w:val="75"/>
-                <w:sz w:val="14"/>
-              </w:rPr>
-              <w:t>TRAPEZOIDAL</w:t>
-            </w:r>
-            <w:r>
-              <w:rPr>
-                <w:spacing w:val="2"/>
-                <w:sz w:val="14"/>
-              </w:rPr>
-              <w:t xml:space="preserve"> </w:t>
-            </w:r>
-            <w:r>
-              <w:rPr>
-                <w:w w:val="75"/>
-                <w:sz w:val="14"/>
-              </w:rPr>
-              <w:t>COLOR</w:t>
-            </w:r>
-            <w:r>
-              <w:rPr>
-                <w:spacing w:val="9"/>
-                <w:sz w:val="14"/>
-              </w:rPr>
-              <w:t xml:space="preserve"> </w:t>
-            </w:r>
-            <w:r>
-              <w:rPr>
-                <w:spacing w:val="-4"/>
-                <w:w w:val="75"/>
-                <w:sz w:val="14"/>
-              </w:rPr>
-              <w:t>CAFÉ</w:t>
-            </w:r>
-          </w:p>
-        </w:tc>
-        <w:tc>
-          <w:tcPr>
-            <w:tcW w:w="641" w:type="dxa"/>
-          </w:tcPr>
-          <w:p>
-            <w:pPr>
-              <w:pStyle w:val="TableParagraph"/>
-              <w:spacing w:before="31"/>
-              <w:jc w:val="left"/>
-              <w:rPr>
-                <w:rFonts w:ascii="Arial"/>
-                <w:b/>
-                <w:sz w:val="14"/>
-              </w:rPr>
-            </w:pPr>
-          </w:p>
-          <w:p>
-            <w:pPr>
-              <w:pStyle w:val="TableParagraph"/>
-              <w:spacing w:before="1"/>
-              <w:ind w:left="57"/>
-              <w:rPr>
-                <w:sz w:val="14"/>
-              </w:rPr>
-            </w:pPr>
-            <w:r>
-              <w:rPr>
-                <w:spacing w:val="-5"/>
-                <w:sz w:val="14"/>
-              </w:rPr>
-              <w:t>S/M</w:t>
-            </w:r>
-          </w:p>
-        </w:tc>
-        <w:tc>
-          <w:tcPr>
-            <w:tcW w:w="1109" w:type="dxa"/>
-          </w:tcPr>
-          <w:p>
-            <w:pPr>
-              <w:pStyle w:val="TableParagraph"/>
-              <w:spacing w:before="31"/>
-              <w:jc w:val="left"/>
-              <w:rPr>
-                <w:rFonts w:ascii="Arial"/>
-                <w:b/>
-                <w:sz w:val="14"/>
-              </w:rPr>
-            </w:pPr>
-          </w:p>
-          <w:p>
-            <w:pPr>
-              <w:pStyle w:val="TableParagraph"/>
-              <w:spacing w:before="1"/>
-              <w:ind w:left="59"/>
-              <w:rPr>
-                <w:sz w:val="14"/>
-              </w:rPr>
-            </w:pPr>
-            <w:r>
-              <w:rPr>
-                <w:spacing w:val="-5"/>
-                <w:sz w:val="14"/>
-              </w:rPr>
-              <w:t>S/M</w:t>
-            </w:r>
-          </w:p>
-        </w:tc>
-        <w:tc>
-          <w:tcPr>
-            <w:tcW w:w="1064" w:type="dxa"/>
-          </w:tcPr>
-          <w:p>
-            <w:pPr>
-              <w:pStyle w:val="TableParagraph"/>
-              <w:spacing w:before="31"/>
-              <w:jc w:val="left"/>
-              <w:rPr>
-                <w:rFonts w:ascii="Arial"/>
-                <w:b/>
-                <w:sz w:val="14"/>
-              </w:rPr>
-            </w:pPr>
-          </w:p>
-          <w:p>
-            <w:pPr>
-              <w:pStyle w:val="TableParagraph"/>
-              <w:spacing w:before="1"/>
-              <w:ind w:left="62"/>
-              <w:rPr>
-                <w:sz w:val="14"/>
-              </w:rPr>
-            </w:pPr>
-            <w:r>
-              <w:rPr>
-                <w:spacing w:val="-5"/>
-                <w:sz w:val="14"/>
-              </w:rPr>
-              <w:t>S/S</w:t>
-            </w:r>
-          </w:p>
-        </w:tc>
-        <w:tc>
-          <w:tcPr>
-            <w:tcW w:w="1075" w:type="dxa"/>
-          </w:tcPr>
-          <w:p>
-            <w:pPr>
-              <w:pStyle w:val="TableParagraph"/>
-              <w:spacing w:before="31"/>
-              <w:jc w:val="left"/>
-              <w:rPr>
-                <w:rFonts w:ascii="Arial"/>
-                <w:b/>
-                <w:sz w:val="14"/>
-              </w:rPr>
-            </w:pPr>
-          </w:p>
-          <w:p>
-            <w:pPr>
-              <w:pStyle w:val="TableParagraph"/>
-              <w:spacing w:before="1"/>
-              <w:ind w:left="60"/>
-              <w:rPr>
-                <w:sz w:val="14"/>
-              </w:rPr>
-            </w:pPr>
-            <w:r>
-              <w:rPr>
-                <w:spacing w:val="-5"/>
-                <w:sz w:val="14"/>
-              </w:rPr>
-              <w:t>S/F</w:t>
-            </w:r>
-          </w:p>
-        </w:tc>
-        <w:tc>
-          <w:tcPr>
-            <w:tcW w:w="756" w:type="dxa"/>
-          </w:tcPr>
-          <w:p>
-            <w:pPr>
-              <w:pStyle w:val="TableParagraph"/>
-              <w:spacing w:before="31"/>
-              <w:jc w:val="left"/>
-              <w:rPr>
-                <w:rFonts w:ascii="Arial"/>
-                <w:b/>
-                <w:sz w:val="14"/>
-              </w:rPr>
-            </w:pPr>
-          </w:p>
-          <w:p>
-            <w:pPr>
-              <w:pStyle w:val="TableParagraph"/>
-              <w:spacing w:before="1"/>
-              <w:ind w:left="69" w:right="27"/>
-              <w:rPr>
-                <w:sz w:val="14"/>
-              </w:rPr>
-            </w:pPr>
-            <w:r>
-              <w:rPr>
-                <w:spacing w:val="-2"/>
-                <w:sz w:val="14"/>
-              </w:rPr>
-              <w:t>BUENO</w:t>
-            </w:r>
           </w:p>
         </w:tc>
       </w:tr>
     </w:tbl>
+    <w:p>
+      <w:pPr>
+        <w:pStyle w:val="Textoindependiente"/>
+        <w:spacing w:before="15"/>
+        <w:rPr>
+          <w:rFonts w:ascii="Arial"/>
+          <w:b/>
+        </w:rPr>
+      </w:pPr>
+    </w:p>
+    <w:p>
+      <w:pPr>
+        <w:pStyle w:val="Textoindependiente"/>
+        <w:spacing w:before="15"/>
+        <w:rPr>
+          <w:rFonts w:ascii="Arial"/>
+          <w:b/>
+        </w:rPr>
+      </w:pPr>
+      <w:r>
+        <w:rPr>
+          <w:rFonts w:ascii="Arial"/>
+          <w:b/>
+        </w:rPr>
+        <w:t xml:space="preserve">{{ </w:t>
+      </w:r>
+      <w:proofErr w:type="spellStart"/>
+      <w:r>
+        <w:rPr>
+          <w:rFonts w:ascii="Arial"/>
+          <w:b/>
+        </w:rPr>
+        <w:t>tabla_dinamica</w:t>
+      </w:r>
+      <w:proofErr w:type="spellEnd"/>
+      <w:r>
+        <w:rPr>
+          <w:rFonts w:ascii="Arial"/>
+          <w:b/>
+        </w:rPr>
+        <w:t xml:space="preserve"> }</w:t>
+      </w:r>
+      <w:r>
+        <w:rPr>
+          <w:rFonts w:ascii="Arial"/>
+          <w:b/>
+        </w:rPr>
+        <w:t>}</w:t>
+      </w:r>
+    </w:p>
     <w:p>
       <w:pPr>
         <w:pStyle w:val="Textoindependiente"/>
@@ -11737,7 +8831,15 @@
         <w:t xml:space="preserve"> </w:t>
       </w:r>
       <w:r>
-        <w:t>virtud de que los bienes no han sido codificados en años anteriores ni con los códigos de Activos Fijos ni con los códigos del Sistema de Bienes y Existencias Esbye, no es posible registrar los</w:t>
+        <w:t xml:space="preserve">virtud de que los bienes no han sido codificados en años anteriores ni con los códigos de Activos Fijos ni con los códigos del Sistema de Bienes y Existencias </w:t>
+      </w:r>
+      <w:proofErr w:type="spellStart"/>
+      <w:r>
+        <w:t>Esbye</w:t>
+      </w:r>
+      <w:proofErr w:type="spellEnd"/>
+      <w:r>
+        <w:t>, no es posible registrar los</w:t>
       </w:r>
       <w:r>
         <w:rPr>
@@ -12020,7 +9122,7 @@
         <mc:AlternateContent>
           <mc:Choice Requires="wps">
             <w:drawing>
-              <wp:anchor distT="0" distB="0" distL="0" distR="0" simplePos="0" relativeHeight="251657216" behindDoc="1" locked="0" layoutInCell="1" allowOverlap="1">
+              <wp:anchor distT="0" distB="0" distL="0" distR="0" simplePos="0" relativeHeight="251657216" behindDoc="1" locked="0" layoutInCell="1" allowOverlap="1" wp14:anchorId="27DFDF83" wp14:editId="528E63FA">
                 <wp:simplePos x="0" y="0"/>
                 <wp:positionH relativeFrom="page">
                   <wp:posOffset>2122170</wp:posOffset>
@@ -12834,7 +9936,7 @@
 </file>
 
 <file path=word/endnotes.xml><?xml version="1.0" encoding="utf-8"?>
-<w:endnotes xmlns:wpc="http://schemas.microsoft.com/office/word/2010/wordprocessingCanvas" xmlns:cx="http://schemas.microsoft.com/office/drawing/2014/chartex" xmlns:mc="http://schemas.openxmlformats.org/markup-compatibility/2006" xmlns:o="urn:schemas-microsoft-com:office:office" xmlns:r="http://schemas.openxmlformats.org/officeDocument/2006/relationships" xmlns:m="http://schemas.openxmlformats.org/officeDocument/2006/math" xmlns:v="urn:schemas-microsoft-com:vml" xmlns:wp14="http://schemas.microsoft.com/office/word/2010/wordprocessingDrawing" xmlns:wp="http://schemas.openxmlformats.org/drawingml/2006/wordprocessingDrawing" xmlns:w10="urn:schemas-microsoft-com:office:word" xmlns:w="http://schemas.openxmlformats.org/wordprocessingml/2006/main" xmlns:w14="http://schemas.microsoft.com/office/word/2010/wordml" xmlns:w15="http://schemas.microsoft.com/office/word/2012/wordml" xmlns:w16se="http://schemas.microsoft.com/office/word/2015/wordml/symex" xmlns:wpg="http://schemas.microsoft.com/office/word/2010/wordprocessingGroup" xmlns:wpi="http://schemas.microsoft.com/office/word/2010/wordprocessingInk" xmlns:wne="http://schemas.microsoft.com/office/word/2006/wordml" xmlns:wps="http://schemas.microsoft.com/office/word/2010/wordprocessingShape" mc:Ignorable="w14 w15 w16se wp14">
+<w:endnotes xmlns:wpc="http://schemas.microsoft.com/office/word/2010/wordprocessingCanvas" xmlns:cx="http://schemas.microsoft.com/office/drawing/2014/chartex" xmlns:cx1="http://schemas.microsoft.com/office/drawing/2015/9/8/chartex" xmlns:cx2="http://schemas.microsoft.com/office/drawing/2015/10/21/chartex" xmlns:cx3="http://schemas.microsoft.com/office/drawing/2016/5/9/chartex" xmlns:cx4="http://schemas.microsoft.com/office/drawing/2016/5/10/chartex" xmlns:cx5="http://schemas.microsoft.com/office/drawing/2016/5/11/chartex" xmlns:cx6="http://schemas.microsoft.com/office/drawing/2016/5/12/chartex" xmlns:cx7="http://schemas.microsoft.com/office/drawing/2016/5/13/chartex" xmlns:cx8="http://schemas.microsoft.com/office/drawing/2016/5/14/chartex" xmlns:mc="http://schemas.openxmlformats.org/markup-compatibility/2006" xmlns:aink="http://schemas.microsoft.com/office/drawing/2016/ink" xmlns:am3d="http://schemas.microsoft.com/office/drawing/2017/model3d" xmlns:o="urn:schemas-microsoft-com:office:office" xmlns:oel="http://schemas.microsoft.com/office/2019/extlst" xmlns:r="http://schemas.openxmlformats.org/officeDocument/2006/relationships" xmlns:m="http://schemas.openxmlformats.org/officeDocument/2006/math" xmlns:v="urn:schemas-microsoft-com:vml" xmlns:wp14="http://schemas.microsoft.com/office/word/2010/wordprocessingDrawing" xmlns:wp="http://schemas.openxmlformats.org/drawingml/2006/wordprocessingDrawing" xmlns:w10="urn:schemas-microsoft-com:office:word" xmlns:w="http://schemas.openxmlformats.org/wordprocessingml/2006/main" xmlns:w14="http://schemas.microsoft.com/office/word/2010/wordml" xmlns:w15="http://schemas.microsoft.com/office/word/2012/wordml" xmlns:w16cex="http://schemas.microsoft.com/office/word/2018/wordml/cex" xmlns:w16cid="http://schemas.microsoft.com/office/word/2016/wordml/cid" xmlns:w16="http://schemas.microsoft.com/office/word/2018/wordml" xmlns:w16du="http://schemas.microsoft.com/office/word/2023/wordml/word16du" xmlns:w16sdtdh="http://schemas.microsoft.com/office/word/2020/wordml/sdtdatahash" xmlns:w16sdtfl="http://schemas.microsoft.com/office/word/2024/wordml/sdtformatlock" xmlns:w16se="http://schemas.microsoft.com/office/word/2015/wordml/symex" xmlns:wpg="http://schemas.microsoft.com/office/word/2010/wordprocessingGroup" xmlns:wpi="http://schemas.microsoft.com/office/word/2010/wordprocessingInk" xmlns:wne="http://schemas.microsoft.com/office/word/2006/wordml" xmlns:wps="http://schemas.microsoft.com/office/word/2010/wordprocessingShape" mc:Ignorable="w14 w15 w16se w16cid w16 w16cex w16sdtdh w16sdtfl w16du wp14">
   <w:endnote w:type="separator" w:id="-1">
     <w:p>
       <w:r>
@@ -12853,7 +9955,7 @@
 </file>
 
 <file path=word/footer1.xml><?xml version="1.0" encoding="utf-8"?>
-<w:ftr xmlns:wpc="http://schemas.microsoft.com/office/word/2010/wordprocessingCanvas" xmlns:cx="http://schemas.microsoft.com/office/drawing/2014/chartex" xmlns:mc="http://schemas.openxmlformats.org/markup-compatibility/2006" xmlns:o="urn:schemas-microsoft-com:office:office" xmlns:r="http://schemas.openxmlformats.org/officeDocument/2006/relationships" xmlns:m="http://schemas.openxmlformats.org/officeDocument/2006/math" xmlns:v="urn:schemas-microsoft-com:vml" xmlns:wp14="http://schemas.microsoft.com/office/word/2010/wordprocessingDrawing" xmlns:wp="http://schemas.openxmlformats.org/drawingml/2006/wordprocessingDrawing" xmlns:w10="urn:schemas-microsoft-com:office:word" xmlns:w="http://schemas.openxmlformats.org/wordprocessingml/2006/main" xmlns:w14="http://schemas.microsoft.com/office/word/2010/wordml" xmlns:w15="http://schemas.microsoft.com/office/word/2012/wordml" xmlns:w16se="http://schemas.microsoft.com/office/word/2015/wordml/symex" xmlns:wpg="http://schemas.microsoft.com/office/word/2010/wordprocessingGroup" xmlns:wpi="http://schemas.microsoft.com/office/word/2010/wordprocessingInk" xmlns:wne="http://schemas.microsoft.com/office/word/2006/wordml" xmlns:wps="http://schemas.microsoft.com/office/word/2010/wordprocessingShape" mc:Ignorable="w14 w15 w16se wp14">
+<w:ftr xmlns:wpc="http://schemas.microsoft.com/office/word/2010/wordprocessingCanvas" xmlns:cx="http://schemas.microsoft.com/office/drawing/2014/chartex" xmlns:cx1="http://schemas.microsoft.com/office/drawing/2015/9/8/chartex" xmlns:cx2="http://schemas.microsoft.com/office/drawing/2015/10/21/chartex" xmlns:cx3="http://schemas.microsoft.com/office/drawing/2016/5/9/chartex" xmlns:cx4="http://schemas.microsoft.com/office/drawing/2016/5/10/chartex" xmlns:cx5="http://schemas.microsoft.com/office/drawing/2016/5/11/chartex" xmlns:cx6="http://schemas.microsoft.com/office/drawing/2016/5/12/chartex" xmlns:cx7="http://schemas.microsoft.com/office/drawing/2016/5/13/chartex" xmlns:cx8="http://schemas.microsoft.com/office/drawing/2016/5/14/chartex" xmlns:mc="http://schemas.openxmlformats.org/markup-compatibility/2006" xmlns:aink="http://schemas.microsoft.com/office/drawing/2016/ink" xmlns:am3d="http://schemas.microsoft.com/office/drawing/2017/model3d" xmlns:o="urn:schemas-microsoft-com:office:office" xmlns:oel="http://schemas.microsoft.com/office/2019/extlst" xmlns:r="http://schemas.openxmlformats.org/officeDocument/2006/relationships" xmlns:m="http://schemas.openxmlformats.org/officeDocument/2006/math" xmlns:v="urn:schemas-microsoft-com:vml" xmlns:wp14="http://schemas.microsoft.com/office/word/2010/wordprocessingDrawing" xmlns:wp="http://schemas.openxmlformats.org/drawingml/2006/wordprocessingDrawing" xmlns:w10="urn:schemas-microsoft-com:office:word" xmlns:w="http://schemas.openxmlformats.org/wordprocessingml/2006/main" xmlns:w14="http://schemas.microsoft.com/office/word/2010/wordml" xmlns:w15="http://schemas.microsoft.com/office/word/2012/wordml" xmlns:w16cex="http://schemas.microsoft.com/office/word/2018/wordml/cex" xmlns:w16cid="http://schemas.microsoft.com/office/word/2016/wordml/cid" xmlns:w16="http://schemas.microsoft.com/office/word/2018/wordml" xmlns:w16du="http://schemas.microsoft.com/office/word/2023/wordml/word16du" xmlns:w16sdtdh="http://schemas.microsoft.com/office/word/2020/wordml/sdtdatahash" xmlns:w16sdtfl="http://schemas.microsoft.com/office/word/2024/wordml/sdtformatlock" xmlns:w16se="http://schemas.microsoft.com/office/word/2015/wordml/symex" xmlns:wpg="http://schemas.microsoft.com/office/word/2010/wordprocessingGroup" xmlns:wpi="http://schemas.microsoft.com/office/word/2010/wordprocessingInk" xmlns:wne="http://schemas.microsoft.com/office/word/2006/wordml" xmlns:wps="http://schemas.microsoft.com/office/word/2010/wordprocessingShape" mc:Ignorable="w14 w15 w16se w16cid w16 w16cex w16sdtdh w16sdtfl w16du wp14">
   <w:p>
     <w:pPr>
       <w:pStyle w:val="Textoindependiente"/>
@@ -12867,7 +9969,7 @@
       <mc:AlternateContent>
         <mc:Choice Requires="wps">
           <w:drawing>
-            <wp:anchor distT="0" distB="0" distL="0" distR="0" simplePos="0" relativeHeight="251658752" behindDoc="1" locked="0" layoutInCell="1" allowOverlap="1">
+            <wp:anchor distT="0" distB="0" distL="0" distR="0" simplePos="0" relativeHeight="251658752" behindDoc="1" locked="0" layoutInCell="1" allowOverlap="1" wp14:anchorId="014C6CFB" wp14:editId="6BFD96D9">
               <wp:simplePos x="0" y="0"/>
               <wp:positionH relativeFrom="page">
                 <wp:posOffset>6311265</wp:posOffset>
@@ -13143,12 +10245,11 @@
         </mc:Choice>
         <mc:Fallback>
           <w:pict>
-            <v:shapetype id="_x0000_t202" coordsize="21600,21600" o:spt="202" path="m,l,21600r21600,l21600,xe">
+            <v:shapetype w14:anchorId="014C6CFB" id="_x0000_t202" coordsize="21600,21600" o:spt="202" path="m,l,21600r21600,l21600,xe">
               <v:stroke joinstyle="miter"/>
               <v:path gradientshapeok="t" o:connecttype="rect"/>
             </v:shapetype>
-            <v:shape id="Textbox 3" o:spid="_x0000_s1029" type="#_x0000_t202" style="position:absolute;margin-left:496.95pt;margin-top:740.8pt;width:77.6pt;height:14pt;z-index:-251657728;visibility:visible;mso-wrap-style:square;mso-width-percent:0;mso-height-percent:0;mso-wrap-distance-left:0;mso-wrap-distance-top:0;mso-wrap-distance-right:0;mso-wrap-distance-bottom:0;mso-position-horizontal:absolute;mso-position-horizontal-relative:page;mso-position-vertical:absolute;mso-position-vertical-relative:page;mso-width-percent:0;mso-height-percent:0;mso-width-relative:page;mso-height-relative:page;v-text-anchor:top" o:gfxdata="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" filled="f" stroked="f">
-              <v:path arrowok="t"/>
+            <v:shape id="Textbox 3" o:spid="_x0000_s1029" type="#_x0000_t202" style="position:absolute;margin-left:496.95pt;margin-top:740.8pt;width:77.6pt;height:14pt;z-index:-251657728;visibility:visible;mso-wrap-style:square;mso-width-percent:0;mso-height-percent:0;mso-wrap-distance-left:0;mso-wrap-distance-top:0;mso-wrap-distance-right:0;mso-wrap-distance-bottom:0;mso-position-horizontal:absolute;mso-position-horizontal-relative:page;mso-position-vertical:absolute;mso-position-vertical-relative:page;mso-width-percent:0;mso-height-percent:0;mso-width-relative:page;mso-height-relative:page;v-text-anchor:top" o:gfxdata="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" filled="f" stroked="f">
               <v:textbox inset="0,0,0,0">
                 <w:txbxContent>
                   <w:p>
@@ -13389,7 +10490,7 @@
 </file>
 
 <file path=word/footnotes.xml><?xml version="1.0" encoding="utf-8"?>
-<w:footnotes xmlns:wpc="http://schemas.microsoft.com/office/word/2010/wordprocessingCanvas" xmlns:cx="http://schemas.microsoft.com/office/drawing/2014/chartex" xmlns:mc="http://schemas.openxmlformats.org/markup-compatibility/2006" xmlns:o="urn:schemas-microsoft-com:office:office" xmlns:r="http://schemas.openxmlformats.org/officeDocument/2006/relationships" xmlns:m="http://schemas.openxmlformats.org/officeDocument/2006/math" xmlns:v="urn:schemas-microsoft-com:vml" xmlns:wp14="http://schemas.microsoft.com/office/word/2010/wordprocessingDrawing" xmlns:wp="http://schemas.openxmlformats.org/drawingml/2006/wordprocessingDrawing" xmlns:w10="urn:schemas-microsoft-com:office:word" xmlns:w="http://schemas.openxmlformats.org/wordprocessingml/2006/main" xmlns:w14="http://schemas.microsoft.com/office/word/2010/wordml" xmlns:w15="http://schemas.microsoft.com/office/word/2012/wordml" xmlns:w16se="http://schemas.microsoft.com/office/word/2015/wordml/symex" xmlns:wpg="http://schemas.microsoft.com/office/word/2010/wordprocessingGroup" xmlns:wpi="http://schemas.microsoft.com/office/word/2010/wordprocessingInk" xmlns:wne="http://schemas.microsoft.com/office/word/2006/wordml" xmlns:wps="http://schemas.microsoft.com/office/word/2010/wordprocessingShape" mc:Ignorable="w14 w15 w16se wp14">
+<w:footnotes xmlns:wpc="http://schemas.microsoft.com/office/word/2010/wordprocessingCanvas" xmlns:cx="http://schemas.microsoft.com/office/drawing/2014/chartex" xmlns:cx1="http://schemas.microsoft.com/office/drawing/2015/9/8/chartex" xmlns:cx2="http://schemas.microsoft.com/office/drawing/2015/10/21/chartex" xmlns:cx3="http://schemas.microsoft.com/office/drawing/2016/5/9/chartex" xmlns:cx4="http://schemas.microsoft.com/office/drawing/2016/5/10/chartex" xmlns:cx5="http://schemas.microsoft.com/office/drawing/2016/5/11/chartex" xmlns:cx6="http://schemas.microsoft.com/office/drawing/2016/5/12/chartex" xmlns:cx7="http://schemas.microsoft.com/office/drawing/2016/5/13/chartex" xmlns:cx8="http://schemas.microsoft.com/office/drawing/2016/5/14/chartex" xmlns:mc="http://schemas.openxmlformats.org/markup-compatibility/2006" xmlns:aink="http://schemas.microsoft.com/office/drawing/2016/ink" xmlns:am3d="http://schemas.microsoft.com/office/drawing/2017/model3d" xmlns:o="urn:schemas-microsoft-com:office:office" xmlns:oel="http://schemas.microsoft.com/office/2019/extlst" xmlns:r="http://schemas.openxmlformats.org/officeDocument/2006/relationships" xmlns:m="http://schemas.openxmlformats.org/officeDocument/2006/math" xmlns:v="urn:schemas-microsoft-com:vml" xmlns:wp14="http://schemas.microsoft.com/office/word/2010/wordprocessingDrawing" xmlns:wp="http://schemas.openxmlformats.org/drawingml/2006/wordprocessingDrawing" xmlns:w10="urn:schemas-microsoft-com:office:word" xmlns:w="http://schemas.openxmlformats.org/wordprocessingml/2006/main" xmlns:w14="http://schemas.microsoft.com/office/word/2010/wordml" xmlns:w15="http://schemas.microsoft.com/office/word/2012/wordml" xmlns:w16cex="http://schemas.microsoft.com/office/word/2018/wordml/cex" xmlns:w16cid="http://schemas.microsoft.com/office/word/2016/wordml/cid" xmlns:w16="http://schemas.microsoft.com/office/word/2018/wordml" xmlns:w16du="http://schemas.microsoft.com/office/word/2023/wordml/word16du" xmlns:w16sdtdh="http://schemas.microsoft.com/office/word/2020/wordml/sdtdatahash" xmlns:w16sdtfl="http://schemas.microsoft.com/office/word/2024/wordml/sdtformatlock" xmlns:w16se="http://schemas.microsoft.com/office/word/2015/wordml/symex" xmlns:wpg="http://schemas.microsoft.com/office/word/2010/wordprocessingGroup" xmlns:wpi="http://schemas.microsoft.com/office/word/2010/wordprocessingInk" xmlns:wne="http://schemas.microsoft.com/office/word/2006/wordml" xmlns:wps="http://schemas.microsoft.com/office/word/2010/wordprocessingShape" mc:Ignorable="w14 w15 w16se w16cid w16 w16cex w16sdtdh w16sdtfl w16du wp14">
   <w:footnote w:type="separator" w:id="-1">
     <w:p>
       <w:r>
@@ -13408,7 +10509,7 @@
 </file>
 
 <file path=word/header1.xml><?xml version="1.0" encoding="utf-8"?>
-<w:hdr xmlns:wpc="http://schemas.microsoft.com/office/word/2010/wordprocessingCanvas" xmlns:cx="http://schemas.microsoft.com/office/drawing/2014/chartex" xmlns:mc="http://schemas.openxmlformats.org/markup-compatibility/2006" xmlns:o="urn:schemas-microsoft-com:office:office" xmlns:r="http://schemas.openxmlformats.org/officeDocument/2006/relationships" xmlns:m="http://schemas.openxmlformats.org/officeDocument/2006/math" xmlns:v="urn:schemas-microsoft-com:vml" xmlns:wp14="http://schemas.microsoft.com/office/word/2010/wordprocessingDrawing" xmlns:wp="http://schemas.openxmlformats.org/drawingml/2006/wordprocessingDrawing" xmlns:w10="urn:schemas-microsoft-com:office:word" xmlns:w="http://schemas.openxmlformats.org/wordprocessingml/2006/main" xmlns:w14="http://schemas.microsoft.com/office/word/2010/wordml" xmlns:w15="http://schemas.microsoft.com/office/word/2012/wordml" xmlns:w16se="http://schemas.microsoft.com/office/word/2015/wordml/symex" xmlns:wpg="http://schemas.microsoft.com/office/word/2010/wordprocessingGroup" xmlns:wpi="http://schemas.microsoft.com/office/word/2010/wordprocessingInk" xmlns:wne="http://schemas.microsoft.com/office/word/2006/wordml" xmlns:wps="http://schemas.microsoft.com/office/word/2010/wordprocessingShape" mc:Ignorable="w14 w15 w16se wp14">
+<w:hdr xmlns:wpc="http://schemas.microsoft.com/office/word/2010/wordprocessingCanvas" xmlns:cx="http://schemas.microsoft.com/office/drawing/2014/chartex" xmlns:cx1="http://schemas.microsoft.com/office/drawing/2015/9/8/chartex" xmlns:cx2="http://schemas.microsoft.com/office/drawing/2015/10/21/chartex" xmlns:cx3="http://schemas.microsoft.com/office/drawing/2016/5/9/chartex" xmlns:cx4="http://schemas.microsoft.com/office/drawing/2016/5/10/chartex" xmlns:cx5="http://schemas.microsoft.com/office/drawing/2016/5/11/chartex" xmlns:cx6="http://schemas.microsoft.com/office/drawing/2016/5/12/chartex" xmlns:cx7="http://schemas.microsoft.com/office/drawing/2016/5/13/chartex" xmlns:cx8="http://schemas.microsoft.com/office/drawing/2016/5/14/chartex" xmlns:mc="http://schemas.openxmlformats.org/markup-compatibility/2006" xmlns:aink="http://schemas.microsoft.com/office/drawing/2016/ink" xmlns:am3d="http://schemas.microsoft.com/office/drawing/2017/model3d" xmlns:o="urn:schemas-microsoft-com:office:office" xmlns:oel="http://schemas.microsoft.com/office/2019/extlst" xmlns:r="http://schemas.openxmlformats.org/officeDocument/2006/relationships" xmlns:m="http://schemas.openxmlformats.org/officeDocument/2006/math" xmlns:v="urn:schemas-microsoft-com:vml" xmlns:wp14="http://schemas.microsoft.com/office/word/2010/wordprocessingDrawing" xmlns:wp="http://schemas.openxmlformats.org/drawingml/2006/wordprocessingDrawing" xmlns:w10="urn:schemas-microsoft-com:office:word" xmlns:w="http://schemas.openxmlformats.org/wordprocessingml/2006/main" xmlns:w14="http://schemas.microsoft.com/office/word/2010/wordml" xmlns:w15="http://schemas.microsoft.com/office/word/2012/wordml" xmlns:w16cex="http://schemas.microsoft.com/office/word/2018/wordml/cex" xmlns:w16cid="http://schemas.microsoft.com/office/word/2016/wordml/cid" xmlns:w16="http://schemas.microsoft.com/office/word/2018/wordml" xmlns:w16du="http://schemas.microsoft.com/office/word/2023/wordml/word16du" xmlns:w16sdtdh="http://schemas.microsoft.com/office/word/2020/wordml/sdtdatahash" xmlns:w16sdtfl="http://schemas.microsoft.com/office/word/2024/wordml/sdtformatlock" xmlns:w16se="http://schemas.microsoft.com/office/word/2015/wordml/symex" xmlns:wpg="http://schemas.microsoft.com/office/word/2010/wordprocessingGroup" xmlns:wpi="http://schemas.microsoft.com/office/word/2010/wordprocessingInk" xmlns:wne="http://schemas.microsoft.com/office/word/2006/wordml" xmlns:wps="http://schemas.microsoft.com/office/word/2010/wordprocessingShape" mc:Ignorable="w14 w15 w16se w16cid w16 w16cex w16sdtdh w16sdtfl w16du wp14">
   <w:p>
     <w:pPr>
       <w:pStyle w:val="Textoindependiente"/>
@@ -13420,7 +10521,7 @@
         <w:lang w:val="en-US"/>
       </w:rPr>
       <w:drawing>
-        <wp:anchor distT="0" distB="0" distL="0" distR="0" simplePos="0" relativeHeight="251656704" behindDoc="1" locked="0" layoutInCell="1" allowOverlap="1">
+        <wp:anchor distT="0" distB="0" distL="0" distR="0" simplePos="0" relativeHeight="251656704" behindDoc="1" locked="0" layoutInCell="1" allowOverlap="1" wp14:anchorId="53895555" wp14:editId="569B8787">
           <wp:simplePos x="0" y="0"/>
           <wp:positionH relativeFrom="page">
             <wp:posOffset>5452745</wp:posOffset>
@@ -13488,7 +10589,7 @@
         <w:lang w:val="en-US"/>
       </w:rPr>
       <w:drawing>
-        <wp:anchor distT="0" distB="0" distL="0" distR="0" simplePos="0" relativeHeight="251657728" behindDoc="1" locked="0" layoutInCell="1" allowOverlap="1">
+        <wp:anchor distT="0" distB="0" distL="0" distR="0" simplePos="0" relativeHeight="251657728" behindDoc="1" locked="0" layoutInCell="1" allowOverlap="1" wp14:anchorId="27AB243B" wp14:editId="6B99AB45">
           <wp:simplePos x="0" y="0"/>
           <wp:positionH relativeFrom="page">
             <wp:posOffset>862330</wp:posOffset>
@@ -13555,7 +10656,7 @@
 </file>
 
 <file path=word/numbering.xml><?xml version="1.0" encoding="utf-8"?>
-<w:numbering xmlns:wpc="http://schemas.microsoft.com/office/word/2010/wordprocessingCanvas" xmlns:cx="http://schemas.microsoft.com/office/drawing/2014/chartex" xmlns:mc="http://schemas.openxmlformats.org/markup-compatibility/2006" xmlns:o="urn:schemas-microsoft-com:office:office" xmlns:r="http://schemas.openxmlformats.org/officeDocument/2006/relationships" xmlns:m="http://schemas.openxmlformats.org/officeDocument/2006/math" xmlns:v="urn:schemas-microsoft-com:vml" xmlns:wp14="http://schemas.microsoft.com/office/word/2010/wordprocessingDrawing" xmlns:wp="http://schemas.openxmlformats.org/drawingml/2006/wordprocessingDrawing" xmlns:w10="urn:schemas-microsoft-com:office:word" xmlns:w="http://schemas.openxmlformats.org/wordprocessingml/2006/main" xmlns:w14="http://schemas.microsoft.com/office/word/2010/wordml" xmlns:w15="http://schemas.microsoft.com/office/word/2012/wordml" xmlns:w16se="http://schemas.microsoft.com/office/word/2015/wordml/symex" xmlns:wpg="http://schemas.microsoft.com/office/word/2010/wordprocessingGroup" xmlns:wpi="http://schemas.microsoft.com/office/word/2010/wordprocessingInk" xmlns:wne="http://schemas.microsoft.com/office/word/2006/wordml" xmlns:wps="http://schemas.microsoft.com/office/word/2010/wordprocessingShape" mc:Ignorable="w14 w15 w16se wp14">
+<w:numbering xmlns:wpc="http://schemas.microsoft.com/office/word/2010/wordprocessingCanvas" xmlns:cx="http://schemas.microsoft.com/office/drawing/2014/chartex" xmlns:cx1="http://schemas.microsoft.com/office/drawing/2015/9/8/chartex" xmlns:cx2="http://schemas.microsoft.com/office/drawing/2015/10/21/chartex" xmlns:cx3="http://schemas.microsoft.com/office/drawing/2016/5/9/chartex" xmlns:cx4="http://schemas.microsoft.com/office/drawing/2016/5/10/chartex" xmlns:cx5="http://schemas.microsoft.com/office/drawing/2016/5/11/chartex" xmlns:cx6="http://schemas.microsoft.com/office/drawing/2016/5/12/chartex" xmlns:cx7="http://schemas.microsoft.com/office/drawing/2016/5/13/chartex" xmlns:cx8="http://schemas.microsoft.com/office/drawing/2016/5/14/chartex" xmlns:mc="http://schemas.openxmlformats.org/markup-compatibility/2006" xmlns:aink="http://schemas.microsoft.com/office/drawing/2016/ink" xmlns:am3d="http://schemas.microsoft.com/office/drawing/2017/model3d" xmlns:o="urn:schemas-microsoft-com:office:office" xmlns:oel="http://schemas.microsoft.com/office/2019/extlst" xmlns:r="http://schemas.openxmlformats.org/officeDocument/2006/relationships" xmlns:m="http://schemas.openxmlformats.org/officeDocument/2006/math" xmlns:v="urn:schemas-microsoft-com:vml" xmlns:wp14="http://schemas.microsoft.com/office/word/2010/wordprocessingDrawing" xmlns:wp="http://schemas.openxmlformats.org/drawingml/2006/wordprocessingDrawing" xmlns:w10="urn:schemas-microsoft-com:office:word" xmlns:w="http://schemas.openxmlformats.org/wordprocessingml/2006/main" xmlns:w14="http://schemas.microsoft.com/office/word/2010/wordml" xmlns:w15="http://schemas.microsoft.com/office/word/2012/wordml" xmlns:w16cex="http://schemas.microsoft.com/office/word/2018/wordml/cex" xmlns:w16cid="http://schemas.microsoft.com/office/word/2016/wordml/cid" xmlns:w16="http://schemas.microsoft.com/office/word/2018/wordml" xmlns:w16du="http://schemas.microsoft.com/office/word/2023/wordml/word16du" xmlns:w16sdtdh="http://schemas.microsoft.com/office/word/2020/wordml/sdtdatahash" xmlns:w16sdtfl="http://schemas.microsoft.com/office/word/2024/wordml/sdtformatlock" xmlns:w16se="http://schemas.microsoft.com/office/word/2015/wordml/symex" xmlns:wpg="http://schemas.microsoft.com/office/word/2010/wordprocessingGroup" xmlns:wpi="http://schemas.microsoft.com/office/word/2010/wordprocessingInk" xmlns:wne="http://schemas.microsoft.com/office/word/2006/wordml" xmlns:wps="http://schemas.microsoft.com/office/word/2010/wordprocessingShape" mc:Ignorable="w14 w15 w16se w16cid w16 w16cex w16sdtdh w16sdtfl w16du wp14">
   <w:abstractNum w:abstractNumId="0" w15:restartNumberingAfterBreak="0">
     <w:nsid w:val="0053208E"/>
     <w:multiLevelType w:val="multilevel"/>
@@ -13678,14 +10779,14 @@
       </w:rPr>
     </w:lvl>
   </w:abstractNum>
-  <w:num w:numId="1">
+  <w:num w:numId="1" w16cid:durableId="1455097698">
     <w:abstractNumId w:val="0"/>
   </w:num>
 </w:numbering>
 </file>
 
 <file path=word/styles.xml><?xml version="1.0" encoding="utf-8"?>
-<w:styles xmlns:mc="http://schemas.openxmlformats.org/markup-compatibility/2006" xmlns:r="http://schemas.openxmlformats.org/officeDocument/2006/relationships" xmlns:w="http://schemas.openxmlformats.org/wordprocessingml/2006/main" xmlns:w14="http://schemas.microsoft.com/office/word/2010/wordml" xmlns:w15="http://schemas.microsoft.com/office/word/2012/wordml" xmlns:w16se="http://schemas.microsoft.com/office/word/2015/wordml/symex" mc:Ignorable="w14 w15 w16se">
+<w:styles xmlns:mc="http://schemas.openxmlformats.org/markup-compatibility/2006" xmlns:r="http://schemas.openxmlformats.org/officeDocument/2006/relationships" xmlns:w="http://schemas.openxmlformats.org/wordprocessingml/2006/main" xmlns:w14="http://schemas.microsoft.com/office/word/2010/wordml" xmlns:w15="http://schemas.microsoft.com/office/word/2012/wordml" xmlns:w16cex="http://schemas.microsoft.com/office/word/2018/wordml/cex" xmlns:w16cid="http://schemas.microsoft.com/office/word/2016/wordml/cid" xmlns:w16="http://schemas.microsoft.com/office/word/2018/wordml" xmlns:w16du="http://schemas.microsoft.com/office/word/2023/wordml/word16du" xmlns:w16sdtdh="http://schemas.microsoft.com/office/word/2020/wordml/sdtdatahash" xmlns:w16sdtfl="http://schemas.microsoft.com/office/word/2024/wordml/sdtformatlock" xmlns:w16se="http://schemas.microsoft.com/office/word/2015/wordml/symex" mc:Ignorable="w14 w15 w16se w16cid w16 w16cex w16sdtdh w16sdtfl w16du">
   <w:docDefaults>
     <w:rPrDefault>
       <w:rPr>
@@ -13695,7 +10796,7 @@
     </w:rPrDefault>
     <w:pPrDefault/>
   </w:docDefaults>
-  <w:latentStyles w:defLockedState="0" w:defUIPriority="0" w:defSemiHidden="0" w:defUnhideWhenUsed="0" w:defQFormat="0" w:count="371">
+  <w:latentStyles w:defLockedState="0" w:defUIPriority="0" w:defSemiHidden="0" w:defUnhideWhenUsed="0" w:defQFormat="0" w:count="376">
     <w:lsdException w:name="Normal" w:uiPriority="1" w:qFormat="1"/>
     <w:lsdException w:name="heading 1" w:qFormat="1"/>
     <w:lsdException w:name="heading 2" w:semiHidden="1" w:unhideWhenUsed="1" w:qFormat="1"/>
@@ -13715,11 +10816,54 @@
     <w:lsdException w:name="Emphasis" w:qFormat="1"/>
     <w:lsdException w:name="HTML Top of Form" w:semiHidden="1" w:uiPriority="99" w:unhideWhenUsed="1"/>
     <w:lsdException w:name="HTML Bottom of Form" w:semiHidden="1" w:uiPriority="99" w:unhideWhenUsed="1"/>
-    <w:lsdException w:name="Normal Table" w:semiHidden="1"/>
+    <w:lsdException w:name="Normal Table" w:semiHidden="1" w:unhideWhenUsed="1"/>
     <w:lsdException w:name="No List" w:semiHidden="1" w:uiPriority="99" w:unhideWhenUsed="1"/>
     <w:lsdException w:name="Outline List 1" w:semiHidden="1" w:uiPriority="99" w:unhideWhenUsed="1"/>
     <w:lsdException w:name="Outline List 2" w:semiHidden="1" w:uiPriority="99" w:unhideWhenUsed="1"/>
     <w:lsdException w:name="Outline List 3" w:semiHidden="1" w:uiPriority="99" w:unhideWhenUsed="1"/>
+    <w:lsdException w:name="Table Simple 1" w:semiHidden="1" w:unhideWhenUsed="1"/>
+    <w:lsdException w:name="Table Simple 2" w:semiHidden="1" w:unhideWhenUsed="1"/>
+    <w:lsdException w:name="Table Simple 3" w:semiHidden="1" w:unhideWhenUsed="1"/>
+    <w:lsdException w:name="Table Classic 1" w:semiHidden="1" w:unhideWhenUsed="1"/>
+    <w:lsdException w:name="Table Classic 2" w:semiHidden="1" w:unhideWhenUsed="1"/>
+    <w:lsdException w:name="Table Classic 3" w:semiHidden="1" w:unhideWhenUsed="1"/>
+    <w:lsdException w:name="Table Classic 4" w:semiHidden="1" w:unhideWhenUsed="1"/>
+    <w:lsdException w:name="Table Colorful 1" w:semiHidden="1" w:unhideWhenUsed="1"/>
+    <w:lsdException w:name="Table Colorful 2" w:semiHidden="1" w:unhideWhenUsed="1"/>
+    <w:lsdException w:name="Table Colorful 3" w:semiHidden="1" w:unhideWhenUsed="1"/>
+    <w:lsdException w:name="Table Columns 1" w:semiHidden="1" w:unhideWhenUsed="1"/>
+    <w:lsdException w:name="Table Columns 2" w:semiHidden="1" w:unhideWhenUsed="1"/>
+    <w:lsdException w:name="Table Columns 3" w:semiHidden="1" w:unhideWhenUsed="1"/>
+    <w:lsdException w:name="Table Columns 4" w:semiHidden="1" w:unhideWhenUsed="1"/>
+    <w:lsdException w:name="Table Columns 5" w:semiHidden="1" w:unhideWhenUsed="1"/>
+    <w:lsdException w:name="Table Grid 1" w:semiHidden="1" w:unhideWhenUsed="1"/>
+    <w:lsdException w:name="Table Grid 2" w:semiHidden="1" w:unhideWhenUsed="1"/>
+    <w:lsdException w:name="Table Grid 3" w:semiHidden="1" w:unhideWhenUsed="1"/>
+    <w:lsdException w:name="Table Grid 4" w:semiHidden="1" w:unhideWhenUsed="1"/>
+    <w:lsdException w:name="Table Grid 5" w:semiHidden="1" w:unhideWhenUsed="1"/>
+    <w:lsdException w:name="Table Grid 6" w:semiHidden="1" w:unhideWhenUsed="1"/>
+    <w:lsdException w:name="Table Grid 7" w:semiHidden="1" w:unhideWhenUsed="1"/>
+    <w:lsdException w:name="Table Grid 8" w:semiHidden="1" w:unhideWhenUsed="1"/>
+    <w:lsdException w:name="Table List 1" w:semiHidden="1" w:unhideWhenUsed="1"/>
+    <w:lsdException w:name="Table List 2" w:semiHidden="1" w:unhideWhenUsed="1"/>
+    <w:lsdException w:name="Table List 3" w:semiHidden="1" w:unhideWhenUsed="1"/>
+    <w:lsdException w:name="Table List 4" w:semiHidden="1" w:unhideWhenUsed="1"/>
+    <w:lsdException w:name="Table List 5" w:semiHidden="1" w:unhideWhenUsed="1"/>
+    <w:lsdException w:name="Table List 6" w:semiHidden="1" w:unhideWhenUsed="1"/>
+    <w:lsdException w:name="Table List 7" w:semiHidden="1" w:unhideWhenUsed="1"/>
+    <w:lsdException w:name="Table List 8" w:semiHidden="1" w:unhideWhenUsed="1"/>
+    <w:lsdException w:name="Table 3D effects 1" w:semiHidden="1" w:unhideWhenUsed="1"/>
+    <w:lsdException w:name="Table 3D effects 2" w:semiHidden="1" w:unhideWhenUsed="1"/>
+    <w:lsdException w:name="Table 3D effects 3" w:semiHidden="1" w:unhideWhenUsed="1"/>
+    <w:lsdException w:name="Table Contemporary" w:semiHidden="1" w:unhideWhenUsed="1"/>
+    <w:lsdException w:name="Table Elegant" w:semiHidden="1" w:unhideWhenUsed="1"/>
+    <w:lsdException w:name="Table Professional" w:semiHidden="1" w:unhideWhenUsed="1"/>
+    <w:lsdException w:name="Table Subtle 1" w:semiHidden="1" w:unhideWhenUsed="1"/>
+    <w:lsdException w:name="Table Subtle 2" w:semiHidden="1" w:unhideWhenUsed="1"/>
+    <w:lsdException w:name="Table Web 1" w:semiHidden="1" w:unhideWhenUsed="1"/>
+    <w:lsdException w:name="Table Web 2" w:semiHidden="1" w:unhideWhenUsed="1"/>
+    <w:lsdException w:name="Table Web 3" w:semiHidden="1" w:unhideWhenUsed="1"/>
+    <w:lsdException w:name="Table Theme" w:semiHidden="1" w:unhideWhenUsed="1"/>
     <w:lsdException w:name="Placeholder Text" w:semiHidden="1" w:uiPriority="99" w:unhideWhenUsed="1"/>
     <w:lsdException w:name="No Spacing" w:uiPriority="99" w:qFormat="1"/>
     <w:lsdException w:name="Light Shading" w:uiPriority="99"/>
@@ -13935,6 +11079,11 @@
     <w:lsdException w:name="List Table 5 Dark Accent 6" w:uiPriority="50"/>
     <w:lsdException w:name="List Table 6 Colorful Accent 6" w:uiPriority="51"/>
     <w:lsdException w:name="List Table 7 Colorful Accent 6" w:uiPriority="52"/>
+    <w:lsdException w:name="Mention" w:semiHidden="1" w:uiPriority="99" w:unhideWhenUsed="1"/>
+    <w:lsdException w:name="Smart Hyperlink" w:semiHidden="1" w:uiPriority="99" w:unhideWhenUsed="1"/>
+    <w:lsdException w:name="Hashtag" w:semiHidden="1" w:uiPriority="99" w:unhideWhenUsed="1"/>
+    <w:lsdException w:name="Unresolved Mention" w:semiHidden="1" w:uiPriority="99" w:unhideWhenUsed="1"/>
+    <w:lsdException w:name="Smart Link" w:semiHidden="1" w:uiPriority="99" w:unhideWhenUsed="1"/>
   </w:latentStyles>
   <w:style w:type="paragraph" w:default="1" w:styleId="Normal">
     <w:name w:val="Normal"/>
@@ -13955,12 +11104,16 @@
   <w:style w:type="character" w:default="1" w:styleId="Fuentedeprrafopredeter">
     <w:name w:val="Default Paragraph Font"/>
     <w:uiPriority w:val="1"/>
+    <w:semiHidden/>
     <w:unhideWhenUsed/>
   </w:style>
   <w:style w:type="table" w:default="1" w:styleId="Tablanormal">
     <w:name w:val="Normal Table"/>
+    <w:uiPriority w:val="99"/>
     <w:semiHidden/>
+    <w:unhideWhenUsed/>
     <w:tblPr>
+      <w:tblInd w:w="0" w:type="dxa"/>
       <w:tblCellMar>
         <w:top w:w="0" w:type="dxa"/>
         <w:left w:w="108" w:type="dxa"/>
@@ -14039,6 +11192,21 @@
     <w:rPr>
       <w:rFonts w:ascii="Calibri" w:eastAsia="Calibri" w:hAnsi="Calibri" w:cs="Calibri"/>
     </w:rPr>
+  </w:style>
+  <w:style w:type="table" w:styleId="Tablaconcuadrcula">
+    <w:name w:val="Table Grid"/>
+    <w:basedOn w:val="Tablanormal"/>
+    <w:rsid w:val="005D4167"/>
+    <w:tblPr>
+      <w:tblBorders>
+        <w:top w:val="single" w:sz="4" w:space="0" w:color="auto"/>
+        <w:left w:val="single" w:sz="4" w:space="0" w:color="auto"/>
+        <w:bottom w:val="single" w:sz="4" w:space="0" w:color="auto"/>
+        <w:right w:val="single" w:sz="4" w:space="0" w:color="auto"/>
+        <w:insideH w:val="single" w:sz="4" w:space="0" w:color="auto"/>
+        <w:insideV w:val="single" w:sz="4" w:space="0" w:color="auto"/>
+      </w:tblBorders>
+    </w:tblPr>
   </w:style>
 </w:styles>
 </file>

</xml_diff>

<commit_message>
nuevas generaciones de actas
</commit_message>
<xml_diff>
--- a/plantillas/entrega.docx
+++ b/plantillas/entrega.docx
@@ -1,6 +1,6 @@
 
 <file path=word/document.xml><?xml version="1.0" encoding="utf-8"?>
-<w:document xmlns:wpc="http://schemas.microsoft.com/office/word/2010/wordprocessingCanvas" xmlns:cx="http://schemas.microsoft.com/office/drawing/2014/chartex" xmlns:mc="http://schemas.openxmlformats.org/markup-compatibility/2006" xmlns:o="urn:schemas-microsoft-com:office:office" xmlns:r="http://schemas.openxmlformats.org/officeDocument/2006/relationships" xmlns:m="http://schemas.openxmlformats.org/officeDocument/2006/math" xmlns:v="urn:schemas-microsoft-com:vml" xmlns:wp14="http://schemas.microsoft.com/office/word/2010/wordprocessingDrawing" xmlns:wp="http://schemas.openxmlformats.org/drawingml/2006/wordprocessingDrawing" xmlns:w10="urn:schemas-microsoft-com:office:word" xmlns:w="http://schemas.openxmlformats.org/wordprocessingml/2006/main" xmlns:w14="http://schemas.microsoft.com/office/word/2010/wordml" xmlns:w15="http://schemas.microsoft.com/office/word/2012/wordml" xmlns:w16se="http://schemas.microsoft.com/office/word/2015/wordml/symex" xmlns:wpg="http://schemas.microsoft.com/office/word/2010/wordprocessingGroup" xmlns:wpi="http://schemas.microsoft.com/office/word/2010/wordprocessingInk" xmlns:wne="http://schemas.microsoft.com/office/word/2006/wordml" xmlns:wps="http://schemas.microsoft.com/office/word/2010/wordprocessingShape" mc:Ignorable="w14 w15 w16se wp14">
+<w:document xmlns:wpc="http://schemas.microsoft.com/office/word/2010/wordprocessingCanvas" xmlns:cx="http://schemas.microsoft.com/office/drawing/2014/chartex" xmlns:cx1="http://schemas.microsoft.com/office/drawing/2015/9/8/chartex" xmlns:cx2="http://schemas.microsoft.com/office/drawing/2015/10/21/chartex" xmlns:cx3="http://schemas.microsoft.com/office/drawing/2016/5/9/chartex" xmlns:cx4="http://schemas.microsoft.com/office/drawing/2016/5/10/chartex" xmlns:cx5="http://schemas.microsoft.com/office/drawing/2016/5/11/chartex" xmlns:cx6="http://schemas.microsoft.com/office/drawing/2016/5/12/chartex" xmlns:cx7="http://schemas.microsoft.com/office/drawing/2016/5/13/chartex" xmlns:cx8="http://schemas.microsoft.com/office/drawing/2016/5/14/chartex" xmlns:mc="http://schemas.openxmlformats.org/markup-compatibility/2006" xmlns:aink="http://schemas.microsoft.com/office/drawing/2016/ink" xmlns:am3d="http://schemas.microsoft.com/office/drawing/2017/model3d" xmlns:o="urn:schemas-microsoft-com:office:office" xmlns:oel="http://schemas.microsoft.com/office/2019/extlst" xmlns:r="http://schemas.openxmlformats.org/officeDocument/2006/relationships" xmlns:m="http://schemas.openxmlformats.org/officeDocument/2006/math" xmlns:v="urn:schemas-microsoft-com:vml" xmlns:wp14="http://schemas.microsoft.com/office/word/2010/wordprocessingDrawing" xmlns:wp="http://schemas.openxmlformats.org/drawingml/2006/wordprocessingDrawing" xmlns:w10="urn:schemas-microsoft-com:office:word" xmlns:w="http://schemas.openxmlformats.org/wordprocessingml/2006/main" xmlns:w14="http://schemas.microsoft.com/office/word/2010/wordml" xmlns:w15="http://schemas.microsoft.com/office/word/2012/wordml" xmlns:w16cex="http://schemas.microsoft.com/office/word/2018/wordml/cex" xmlns:w16cid="http://schemas.microsoft.com/office/word/2016/wordml/cid" xmlns:w16="http://schemas.microsoft.com/office/word/2018/wordml" xmlns:w16du="http://schemas.microsoft.com/office/word/2023/wordml/word16du" xmlns:w16sdtdh="http://schemas.microsoft.com/office/word/2020/wordml/sdtdatahash" xmlns:w16sdtfl="http://schemas.microsoft.com/office/word/2024/wordml/sdtformatlock" xmlns:w16se="http://schemas.microsoft.com/office/word/2015/wordml/symex" xmlns:wpg="http://schemas.microsoft.com/office/word/2010/wordprocessingGroup" xmlns:wpi="http://schemas.microsoft.com/office/word/2010/wordprocessingInk" xmlns:wne="http://schemas.microsoft.com/office/word/2006/wordml" xmlns:wps="http://schemas.microsoft.com/office/word/2010/wordprocessingShape" mc:Ignorable="w14 w15 w16se w16cid w16 w16cex w16sdtdh w16sdtfl w16du wp14">
   <w:body>
     <w:p>
       <w:pPr>
@@ -391,36 +391,6 @@
           <w:szCs w:val="20"/>
         </w:rPr>
         <w:t>,</w:t>
-      </w:r>
-      <w:r>
-        <w:rPr>
-          <w:sz w:val="20"/>
-          <w:szCs w:val="20"/>
-        </w:rPr>
-        <w:t xml:space="preserve"> </w:t>
-      </w:r>
-      <w:r>
-        <w:rPr>
-          <w:sz w:val="20"/>
-          <w:szCs w:val="20"/>
-        </w:rPr>
-        <w:t>{{</w:t>
-      </w:r>
-      <w:proofErr w:type="spellStart"/>
-      <w:r>
-        <w:rPr>
-          <w:sz w:val="20"/>
-          <w:szCs w:val="20"/>
-        </w:rPr>
-        <w:t>rol_recibe</w:t>
-      </w:r>
-      <w:proofErr w:type="spellEnd"/>
-      <w:r>
-        <w:rPr>
-          <w:sz w:val="20"/>
-          <w:szCs w:val="20"/>
-        </w:rPr>
-        <w:t>}}</w:t>
       </w:r>
       <w:r>
         <w:rPr>
@@ -1151,10 +1121,31 @@
           <w:lang w:eastAsia="en-US"/>
           <w14:ligatures w14:val="standardContextual"/>
         </w:rPr>
-        <w:t xml:space="preserve">Con los antecedentes expuestos en la cláusula anterior, se procede a detallar los bienes que se encuentran ubicados en la </w:t>
-      </w:r>
-      <w:r>
-        <w:rPr>
+        <w:t>C</w:t>
+      </w:r>
+      <w:r>
+        <w:rPr>
+          <w:rFonts w:ascii="Arial" w:eastAsiaTheme="minorHAnsi" w:hAnsi="Arial" w:cs="Arial"/>
+          <w:sz w:val="20"/>
+          <w:szCs w:val="20"/>
+          <w:lang w:eastAsia="en-US"/>
+          <w14:ligatures w14:val="standardContextual"/>
+        </w:rPr>
+        <w:t xml:space="preserve">on </w:t>
+      </w:r>
+      <w:r>
+        <w:rPr>
+          <w:rFonts w:ascii="Arial" w:eastAsiaTheme="minorHAnsi" w:hAnsi="Arial" w:cs="Arial"/>
+          <w:sz w:val="20"/>
+          <w:szCs w:val="20"/>
+          <w:lang w:eastAsia="en-US"/>
+          <w14:ligatures w14:val="standardContextual"/>
+        </w:rPr>
+        <w:t xml:space="preserve">los antecedentes expuestos en la cláusula anterior, se procede a detallar los bienes que se encuentran ubicados en la </w:t>
+      </w:r>
+      <w:r>
+        <w:rPr>
+          <w:rFonts w:ascii="Arial" w:hAnsi="Arial" w:cs="Arial"/>
           <w:sz w:val="20"/>
           <w:szCs w:val="20"/>
         </w:rPr>
@@ -1163,6 +1154,7 @@
       <w:proofErr w:type="spellStart"/>
       <w:r>
         <w:rPr>
+          <w:rFonts w:ascii="Arial" w:hAnsi="Arial" w:cs="Arial"/>
           <w:sz w:val="20"/>
           <w:szCs w:val="20"/>
         </w:rPr>
@@ -1170,6 +1162,7 @@
       </w:r>
       <w:r>
         <w:rPr>
+          <w:rFonts w:ascii="Arial" w:hAnsi="Arial" w:cs="Arial"/>
           <w:sz w:val="20"/>
           <w:szCs w:val="20"/>
         </w:rPr>
@@ -1178,6 +1171,7 @@
       <w:proofErr w:type="spellEnd"/>
       <w:r>
         <w:rPr>
+          <w:rFonts w:ascii="Arial" w:hAnsi="Arial" w:cs="Arial"/>
           <w:sz w:val="20"/>
           <w:szCs w:val="20"/>
         </w:rPr>
@@ -1216,6 +1210,7 @@
       </w:r>
       <w:r>
         <w:rPr>
+          <w:rFonts w:ascii="Arial" w:hAnsi="Arial" w:cs="Arial"/>
           <w:sz w:val="20"/>
           <w:szCs w:val="20"/>
         </w:rPr>
@@ -1233,6 +1228,7 @@
       </w:r>
       <w:r>
         <w:rPr>
+          <w:rFonts w:ascii="Arial" w:hAnsi="Arial" w:cs="Arial"/>
           <w:sz w:val="20"/>
           <w:szCs w:val="20"/>
         </w:rPr>
@@ -1250,11 +1246,11 @@
       </w:r>
       <w:r>
         <w:rPr>
-          <w:rFonts w:eastAsia="Calibri" w:cs="Calibri"/>
+          <w:rFonts w:ascii="Arial" w:eastAsia="Calibri" w:hAnsi="Arial" w:cs="Arial"/>
           <w:bCs/>
           <w:color w:val="000000"/>
-          <w:sz w:val="18"/>
-          <w:szCs w:val="18"/>
+          <w:sz w:val="20"/>
+          <w:szCs w:val="20"/>
           <w:lang w:val="es-MX"/>
         </w:rPr>
         <w:t>{{</w:t>
@@ -1262,11 +1258,11 @@
       <w:proofErr w:type="spellStart"/>
       <w:r>
         <w:rPr>
-          <w:rFonts w:eastAsia="Calibri" w:cs="Calibri"/>
+          <w:rFonts w:ascii="Arial" w:eastAsia="Calibri" w:hAnsi="Arial" w:cs="Arial"/>
           <w:bCs/>
           <w:color w:val="000000"/>
-          <w:sz w:val="18"/>
-          <w:szCs w:val="18"/>
+          <w:sz w:val="20"/>
+          <w:szCs w:val="20"/>
           <w:lang w:val="es-MX"/>
         </w:rPr>
         <w:t>recibido_por</w:t>
@@ -1274,11 +1270,11 @@
       <w:proofErr w:type="spellEnd"/>
       <w:r>
         <w:rPr>
-          <w:rFonts w:eastAsia="Calibri" w:cs="Calibri"/>
+          <w:rFonts w:ascii="Arial" w:eastAsia="Calibri" w:hAnsi="Arial" w:cs="Arial"/>
           <w:bCs/>
           <w:color w:val="000000"/>
-          <w:sz w:val="18"/>
-          <w:szCs w:val="18"/>
+          <w:sz w:val="20"/>
+          <w:szCs w:val="20"/>
           <w:lang w:val="es-MX"/>
         </w:rPr>
         <w:t>}}</w:t>
@@ -1305,11 +1301,11 @@
       </w:r>
       <w:r>
         <w:rPr>
-          <w:rFonts w:eastAsia="Calibri" w:cs="Calibri"/>
+          <w:rFonts w:ascii="Arial" w:eastAsia="Calibri" w:hAnsi="Arial" w:cs="Arial"/>
           <w:bCs/>
           <w:color w:val="000000"/>
-          <w:sz w:val="18"/>
-          <w:szCs w:val="18"/>
+          <w:sz w:val="20"/>
+          <w:szCs w:val="20"/>
           <w:lang w:val="es-MX"/>
         </w:rPr>
         <w:t>{{</w:t>
@@ -1317,11 +1313,11 @@
       <w:proofErr w:type="spellStart"/>
       <w:r>
         <w:rPr>
-          <w:rFonts w:eastAsia="Calibri" w:cs="Calibri"/>
+          <w:rFonts w:ascii="Arial" w:eastAsia="Calibri" w:hAnsi="Arial" w:cs="Arial"/>
           <w:bCs/>
           <w:color w:val="000000"/>
-          <w:sz w:val="18"/>
-          <w:szCs w:val="18"/>
+          <w:sz w:val="20"/>
+          <w:szCs w:val="20"/>
           <w:lang w:val="es-MX"/>
         </w:rPr>
         <w:t>rol_recibe</w:t>
@@ -1329,11 +1325,11 @@
       <w:proofErr w:type="spellEnd"/>
       <w:r>
         <w:rPr>
-          <w:rFonts w:eastAsia="Calibri" w:cs="Calibri"/>
+          <w:rFonts w:ascii="Arial" w:eastAsia="Calibri" w:hAnsi="Arial" w:cs="Arial"/>
           <w:bCs/>
           <w:color w:val="000000"/>
-          <w:sz w:val="18"/>
-          <w:szCs w:val="18"/>
+          <w:sz w:val="20"/>
+          <w:szCs w:val="20"/>
           <w:lang w:val="es-MX"/>
         </w:rPr>
         <w:t>}}</w:t>
@@ -1378,12 +1374,16 @@
         <w:pStyle w:val="Default"/>
         <w:jc w:val="both"/>
         <w:rPr>
+          <w:b/>
+          <w:bCs/>
           <w:sz w:val="20"/>
           <w:szCs w:val="20"/>
         </w:rPr>
       </w:pPr>
       <w:r>
         <w:rPr>
+          <w:b/>
+          <w:bCs/>
           <w:sz w:val="20"/>
           <w:szCs w:val="20"/>
         </w:rPr>
@@ -1391,6 +1391,8 @@
       </w:r>
       <w:r>
         <w:rPr>
+          <w:b/>
+          <w:bCs/>
           <w:sz w:val="20"/>
           <w:szCs w:val="20"/>
         </w:rPr>
@@ -1445,7 +1447,15 @@
           <w:sz w:val="20"/>
           <w:szCs w:val="20"/>
         </w:rPr>
-        <w:t>_dinamica</w:t>
+        <w:t>_</w:t>
+      </w:r>
+      <w:proofErr w:type="gramStart"/>
+      <w:r>
+        <w:rPr>
+          <w:sz w:val="20"/>
+          <w:szCs w:val="20"/>
+        </w:rPr>
+        <w:t>dinamica</w:t>
       </w:r>
       <w:proofErr w:type="spellEnd"/>
       <w:r>
@@ -1460,7 +1470,15 @@
           <w:sz w:val="20"/>
           <w:szCs w:val="20"/>
         </w:rPr>
-        <w:t>}}</w:t>
+        <w:t>}</w:t>
+      </w:r>
+      <w:proofErr w:type="gramEnd"/>
+      <w:r>
+        <w:rPr>
+          <w:sz w:val="20"/>
+          <w:szCs w:val="20"/>
+        </w:rPr>
+        <w:t>}</w:t>
       </w:r>
     </w:p>
     <w:p>
@@ -2025,18 +2043,7 @@
                 <w:sz w:val="18"/>
                 <w:lang w:val="es-MX"/>
               </w:rPr>
-              <w:t>{{rol_recibe</w:t>
-            </w:r>
-            <w:bookmarkStart w:id="0" w:name="_GoBack"/>
-            <w:bookmarkEnd w:id="0"/>
-            <w:r>
-              <w:rPr>
-                <w:rFonts w:ascii="Arial MT" w:hAnsi="Arial MT"/>
-                <w:b/>
-                <w:sz w:val="18"/>
-                <w:lang w:val="es-MX"/>
-              </w:rPr>
-              <w:t>}}</w:t>
+              <w:t>{{rol_recibe}}</w:t>
             </w:r>
           </w:p>
         </w:tc>
@@ -2214,7 +2221,7 @@
 </file>
 
 <file path=word/endnotes.xml><?xml version="1.0" encoding="utf-8"?>
-<w:endnotes xmlns:wpc="http://schemas.microsoft.com/office/word/2010/wordprocessingCanvas" xmlns:cx="http://schemas.microsoft.com/office/drawing/2014/chartex" xmlns:mc="http://schemas.openxmlformats.org/markup-compatibility/2006" xmlns:o="urn:schemas-microsoft-com:office:office" xmlns:r="http://schemas.openxmlformats.org/officeDocument/2006/relationships" xmlns:m="http://schemas.openxmlformats.org/officeDocument/2006/math" xmlns:v="urn:schemas-microsoft-com:vml" xmlns:wp14="http://schemas.microsoft.com/office/word/2010/wordprocessingDrawing" xmlns:wp="http://schemas.openxmlformats.org/drawingml/2006/wordprocessingDrawing" xmlns:w10="urn:schemas-microsoft-com:office:word" xmlns:w="http://schemas.openxmlformats.org/wordprocessingml/2006/main" xmlns:w14="http://schemas.microsoft.com/office/word/2010/wordml" xmlns:w15="http://schemas.microsoft.com/office/word/2012/wordml" xmlns:w16se="http://schemas.microsoft.com/office/word/2015/wordml/symex" xmlns:wpg="http://schemas.microsoft.com/office/word/2010/wordprocessingGroup" xmlns:wpi="http://schemas.microsoft.com/office/word/2010/wordprocessingInk" xmlns:wne="http://schemas.microsoft.com/office/word/2006/wordml" xmlns:wps="http://schemas.microsoft.com/office/word/2010/wordprocessingShape" mc:Ignorable="w14 w15 w16se wp14">
+<w:endnotes xmlns:wpc="http://schemas.microsoft.com/office/word/2010/wordprocessingCanvas" xmlns:cx="http://schemas.microsoft.com/office/drawing/2014/chartex" xmlns:cx1="http://schemas.microsoft.com/office/drawing/2015/9/8/chartex" xmlns:cx2="http://schemas.microsoft.com/office/drawing/2015/10/21/chartex" xmlns:cx3="http://schemas.microsoft.com/office/drawing/2016/5/9/chartex" xmlns:cx4="http://schemas.microsoft.com/office/drawing/2016/5/10/chartex" xmlns:cx5="http://schemas.microsoft.com/office/drawing/2016/5/11/chartex" xmlns:cx6="http://schemas.microsoft.com/office/drawing/2016/5/12/chartex" xmlns:cx7="http://schemas.microsoft.com/office/drawing/2016/5/13/chartex" xmlns:cx8="http://schemas.microsoft.com/office/drawing/2016/5/14/chartex" xmlns:mc="http://schemas.openxmlformats.org/markup-compatibility/2006" xmlns:aink="http://schemas.microsoft.com/office/drawing/2016/ink" xmlns:am3d="http://schemas.microsoft.com/office/drawing/2017/model3d" xmlns:o="urn:schemas-microsoft-com:office:office" xmlns:oel="http://schemas.microsoft.com/office/2019/extlst" xmlns:r="http://schemas.openxmlformats.org/officeDocument/2006/relationships" xmlns:m="http://schemas.openxmlformats.org/officeDocument/2006/math" xmlns:v="urn:schemas-microsoft-com:vml" xmlns:wp14="http://schemas.microsoft.com/office/word/2010/wordprocessingDrawing" xmlns:wp="http://schemas.openxmlformats.org/drawingml/2006/wordprocessingDrawing" xmlns:w10="urn:schemas-microsoft-com:office:word" xmlns:w="http://schemas.openxmlformats.org/wordprocessingml/2006/main" xmlns:w14="http://schemas.microsoft.com/office/word/2010/wordml" xmlns:w15="http://schemas.microsoft.com/office/word/2012/wordml" xmlns:w16cex="http://schemas.microsoft.com/office/word/2018/wordml/cex" xmlns:w16cid="http://schemas.microsoft.com/office/word/2016/wordml/cid" xmlns:w16="http://schemas.microsoft.com/office/word/2018/wordml" xmlns:w16du="http://schemas.microsoft.com/office/word/2023/wordml/word16du" xmlns:w16sdtdh="http://schemas.microsoft.com/office/word/2020/wordml/sdtdatahash" xmlns:w16sdtfl="http://schemas.microsoft.com/office/word/2024/wordml/sdtformatlock" xmlns:w16se="http://schemas.microsoft.com/office/word/2015/wordml/symex" xmlns:wpg="http://schemas.microsoft.com/office/word/2010/wordprocessingGroup" xmlns:wpi="http://schemas.microsoft.com/office/word/2010/wordprocessingInk" xmlns:wne="http://schemas.microsoft.com/office/word/2006/wordml" xmlns:wps="http://schemas.microsoft.com/office/word/2010/wordprocessingShape" mc:Ignorable="w14 w15 w16se w16cid w16 w16cex w16sdtdh w16sdtfl w16du wp14">
   <w:endnote w:type="separator" w:id="-1">
     <w:p>
       <w:pPr>
@@ -2239,7 +2246,7 @@
 </file>
 
 <file path=word/footer1.xml><?xml version="1.0" encoding="utf-8"?>
-<w:ftr xmlns:wpc="http://schemas.microsoft.com/office/word/2010/wordprocessingCanvas" xmlns:cx="http://schemas.microsoft.com/office/drawing/2014/chartex" xmlns:mc="http://schemas.openxmlformats.org/markup-compatibility/2006" xmlns:o="urn:schemas-microsoft-com:office:office" xmlns:r="http://schemas.openxmlformats.org/officeDocument/2006/relationships" xmlns:m="http://schemas.openxmlformats.org/officeDocument/2006/math" xmlns:v="urn:schemas-microsoft-com:vml" xmlns:wp14="http://schemas.microsoft.com/office/word/2010/wordprocessingDrawing" xmlns:wp="http://schemas.openxmlformats.org/drawingml/2006/wordprocessingDrawing" xmlns:w10="urn:schemas-microsoft-com:office:word" xmlns:w="http://schemas.openxmlformats.org/wordprocessingml/2006/main" xmlns:w14="http://schemas.microsoft.com/office/word/2010/wordml" xmlns:w15="http://schemas.microsoft.com/office/word/2012/wordml" xmlns:w16se="http://schemas.microsoft.com/office/word/2015/wordml/symex" xmlns:wpg="http://schemas.microsoft.com/office/word/2010/wordprocessingGroup" xmlns:wpi="http://schemas.microsoft.com/office/word/2010/wordprocessingInk" xmlns:wne="http://schemas.microsoft.com/office/word/2006/wordml" xmlns:wps="http://schemas.microsoft.com/office/word/2010/wordprocessingShape" mc:Ignorable="w14 w15 w16se wp14">
+<w:ftr xmlns:wpc="http://schemas.microsoft.com/office/word/2010/wordprocessingCanvas" xmlns:cx="http://schemas.microsoft.com/office/drawing/2014/chartex" xmlns:cx1="http://schemas.microsoft.com/office/drawing/2015/9/8/chartex" xmlns:cx2="http://schemas.microsoft.com/office/drawing/2015/10/21/chartex" xmlns:cx3="http://schemas.microsoft.com/office/drawing/2016/5/9/chartex" xmlns:cx4="http://schemas.microsoft.com/office/drawing/2016/5/10/chartex" xmlns:cx5="http://schemas.microsoft.com/office/drawing/2016/5/11/chartex" xmlns:cx6="http://schemas.microsoft.com/office/drawing/2016/5/12/chartex" xmlns:cx7="http://schemas.microsoft.com/office/drawing/2016/5/13/chartex" xmlns:cx8="http://schemas.microsoft.com/office/drawing/2016/5/14/chartex" xmlns:mc="http://schemas.openxmlformats.org/markup-compatibility/2006" xmlns:aink="http://schemas.microsoft.com/office/drawing/2016/ink" xmlns:am3d="http://schemas.microsoft.com/office/drawing/2017/model3d" xmlns:o="urn:schemas-microsoft-com:office:office" xmlns:oel="http://schemas.microsoft.com/office/2019/extlst" xmlns:r="http://schemas.openxmlformats.org/officeDocument/2006/relationships" xmlns:m="http://schemas.openxmlformats.org/officeDocument/2006/math" xmlns:v="urn:schemas-microsoft-com:vml" xmlns:wp14="http://schemas.microsoft.com/office/word/2010/wordprocessingDrawing" xmlns:wp="http://schemas.openxmlformats.org/drawingml/2006/wordprocessingDrawing" xmlns:w10="urn:schemas-microsoft-com:office:word" xmlns:w="http://schemas.openxmlformats.org/wordprocessingml/2006/main" xmlns:w14="http://schemas.microsoft.com/office/word/2010/wordml" xmlns:w15="http://schemas.microsoft.com/office/word/2012/wordml" xmlns:w16cex="http://schemas.microsoft.com/office/word/2018/wordml/cex" xmlns:w16cid="http://schemas.microsoft.com/office/word/2016/wordml/cid" xmlns:w16="http://schemas.microsoft.com/office/word/2018/wordml" xmlns:w16du="http://schemas.microsoft.com/office/word/2023/wordml/word16du" xmlns:w16sdtdh="http://schemas.microsoft.com/office/word/2020/wordml/sdtdatahash" xmlns:w16sdtfl="http://schemas.microsoft.com/office/word/2024/wordml/sdtformatlock" xmlns:w16se="http://schemas.microsoft.com/office/word/2015/wordml/symex" xmlns:wpg="http://schemas.microsoft.com/office/word/2010/wordprocessingGroup" xmlns:wpi="http://schemas.microsoft.com/office/word/2010/wordprocessingInk" xmlns:wne="http://schemas.microsoft.com/office/word/2006/wordml" xmlns:wps="http://schemas.microsoft.com/office/word/2010/wordprocessingShape" mc:Ignorable="w14 w15 w16se w16cid w16 w16cex w16sdtdh w16sdtfl w16du wp14">
   <w:p>
     <w:pPr>
       <w:ind w:right="-421"/>
@@ -2331,7 +2338,7 @@
 </file>
 
 <file path=word/footnotes.xml><?xml version="1.0" encoding="utf-8"?>
-<w:footnotes xmlns:wpc="http://schemas.microsoft.com/office/word/2010/wordprocessingCanvas" xmlns:cx="http://schemas.microsoft.com/office/drawing/2014/chartex" xmlns:mc="http://schemas.openxmlformats.org/markup-compatibility/2006" xmlns:o="urn:schemas-microsoft-com:office:office" xmlns:r="http://schemas.openxmlformats.org/officeDocument/2006/relationships" xmlns:m="http://schemas.openxmlformats.org/officeDocument/2006/math" xmlns:v="urn:schemas-microsoft-com:vml" xmlns:wp14="http://schemas.microsoft.com/office/word/2010/wordprocessingDrawing" xmlns:wp="http://schemas.openxmlformats.org/drawingml/2006/wordprocessingDrawing" xmlns:w10="urn:schemas-microsoft-com:office:word" xmlns:w="http://schemas.openxmlformats.org/wordprocessingml/2006/main" xmlns:w14="http://schemas.microsoft.com/office/word/2010/wordml" xmlns:w15="http://schemas.microsoft.com/office/word/2012/wordml" xmlns:w16se="http://schemas.microsoft.com/office/word/2015/wordml/symex" xmlns:wpg="http://schemas.microsoft.com/office/word/2010/wordprocessingGroup" xmlns:wpi="http://schemas.microsoft.com/office/word/2010/wordprocessingInk" xmlns:wne="http://schemas.microsoft.com/office/word/2006/wordml" xmlns:wps="http://schemas.microsoft.com/office/word/2010/wordprocessingShape" mc:Ignorable="w14 w15 w16se wp14">
+<w:footnotes xmlns:wpc="http://schemas.microsoft.com/office/word/2010/wordprocessingCanvas" xmlns:cx="http://schemas.microsoft.com/office/drawing/2014/chartex" xmlns:cx1="http://schemas.microsoft.com/office/drawing/2015/9/8/chartex" xmlns:cx2="http://schemas.microsoft.com/office/drawing/2015/10/21/chartex" xmlns:cx3="http://schemas.microsoft.com/office/drawing/2016/5/9/chartex" xmlns:cx4="http://schemas.microsoft.com/office/drawing/2016/5/10/chartex" xmlns:cx5="http://schemas.microsoft.com/office/drawing/2016/5/11/chartex" xmlns:cx6="http://schemas.microsoft.com/office/drawing/2016/5/12/chartex" xmlns:cx7="http://schemas.microsoft.com/office/drawing/2016/5/13/chartex" xmlns:cx8="http://schemas.microsoft.com/office/drawing/2016/5/14/chartex" xmlns:mc="http://schemas.openxmlformats.org/markup-compatibility/2006" xmlns:aink="http://schemas.microsoft.com/office/drawing/2016/ink" xmlns:am3d="http://schemas.microsoft.com/office/drawing/2017/model3d" xmlns:o="urn:schemas-microsoft-com:office:office" xmlns:oel="http://schemas.microsoft.com/office/2019/extlst" xmlns:r="http://schemas.openxmlformats.org/officeDocument/2006/relationships" xmlns:m="http://schemas.openxmlformats.org/officeDocument/2006/math" xmlns:v="urn:schemas-microsoft-com:vml" xmlns:wp14="http://schemas.microsoft.com/office/word/2010/wordprocessingDrawing" xmlns:wp="http://schemas.openxmlformats.org/drawingml/2006/wordprocessingDrawing" xmlns:w10="urn:schemas-microsoft-com:office:word" xmlns:w="http://schemas.openxmlformats.org/wordprocessingml/2006/main" xmlns:w14="http://schemas.microsoft.com/office/word/2010/wordml" xmlns:w15="http://schemas.microsoft.com/office/word/2012/wordml" xmlns:w16cex="http://schemas.microsoft.com/office/word/2018/wordml/cex" xmlns:w16cid="http://schemas.microsoft.com/office/word/2016/wordml/cid" xmlns:w16="http://schemas.microsoft.com/office/word/2018/wordml" xmlns:w16du="http://schemas.microsoft.com/office/word/2023/wordml/word16du" xmlns:w16sdtdh="http://schemas.microsoft.com/office/word/2020/wordml/sdtdatahash" xmlns:w16sdtfl="http://schemas.microsoft.com/office/word/2024/wordml/sdtformatlock" xmlns:w16se="http://schemas.microsoft.com/office/word/2015/wordml/symex" xmlns:wpg="http://schemas.microsoft.com/office/word/2010/wordprocessingGroup" xmlns:wpi="http://schemas.microsoft.com/office/word/2010/wordprocessingInk" xmlns:wne="http://schemas.microsoft.com/office/word/2006/wordml" xmlns:wps="http://schemas.microsoft.com/office/word/2010/wordprocessingShape" mc:Ignorable="w14 w15 w16se w16cid w16 w16cex w16sdtdh w16sdtfl w16du wp14">
   <w:footnote w:type="separator" w:id="-1">
     <w:p>
       <w:pPr>
@@ -2356,7 +2363,7 @@
 </file>
 
 <file path=word/header1.xml><?xml version="1.0" encoding="utf-8"?>
-<w:hdr xmlns:wpc="http://schemas.microsoft.com/office/word/2010/wordprocessingCanvas" xmlns:cx="http://schemas.microsoft.com/office/drawing/2014/chartex" xmlns:mc="http://schemas.openxmlformats.org/markup-compatibility/2006" xmlns:o="urn:schemas-microsoft-com:office:office" xmlns:r="http://schemas.openxmlformats.org/officeDocument/2006/relationships" xmlns:m="http://schemas.openxmlformats.org/officeDocument/2006/math" xmlns:v="urn:schemas-microsoft-com:vml" xmlns:wp14="http://schemas.microsoft.com/office/word/2010/wordprocessingDrawing" xmlns:wp="http://schemas.openxmlformats.org/drawingml/2006/wordprocessingDrawing" xmlns:w10="urn:schemas-microsoft-com:office:word" xmlns:w="http://schemas.openxmlformats.org/wordprocessingml/2006/main" xmlns:w14="http://schemas.microsoft.com/office/word/2010/wordml" xmlns:w15="http://schemas.microsoft.com/office/word/2012/wordml" xmlns:w16se="http://schemas.microsoft.com/office/word/2015/wordml/symex" xmlns:wpg="http://schemas.microsoft.com/office/word/2010/wordprocessingGroup" xmlns:wpi="http://schemas.microsoft.com/office/word/2010/wordprocessingInk" xmlns:wne="http://schemas.microsoft.com/office/word/2006/wordml" xmlns:wps="http://schemas.microsoft.com/office/word/2010/wordprocessingShape" mc:Ignorable="w14 w15 w16se wp14">
+<w:hdr xmlns:wpc="http://schemas.microsoft.com/office/word/2010/wordprocessingCanvas" xmlns:cx="http://schemas.microsoft.com/office/drawing/2014/chartex" xmlns:cx1="http://schemas.microsoft.com/office/drawing/2015/9/8/chartex" xmlns:cx2="http://schemas.microsoft.com/office/drawing/2015/10/21/chartex" xmlns:cx3="http://schemas.microsoft.com/office/drawing/2016/5/9/chartex" xmlns:cx4="http://schemas.microsoft.com/office/drawing/2016/5/10/chartex" xmlns:cx5="http://schemas.microsoft.com/office/drawing/2016/5/11/chartex" xmlns:cx6="http://schemas.microsoft.com/office/drawing/2016/5/12/chartex" xmlns:cx7="http://schemas.microsoft.com/office/drawing/2016/5/13/chartex" xmlns:cx8="http://schemas.microsoft.com/office/drawing/2016/5/14/chartex" xmlns:mc="http://schemas.openxmlformats.org/markup-compatibility/2006" xmlns:aink="http://schemas.microsoft.com/office/drawing/2016/ink" xmlns:am3d="http://schemas.microsoft.com/office/drawing/2017/model3d" xmlns:o="urn:schemas-microsoft-com:office:office" xmlns:oel="http://schemas.microsoft.com/office/2019/extlst" xmlns:r="http://schemas.openxmlformats.org/officeDocument/2006/relationships" xmlns:m="http://schemas.openxmlformats.org/officeDocument/2006/math" xmlns:v="urn:schemas-microsoft-com:vml" xmlns:wp14="http://schemas.microsoft.com/office/word/2010/wordprocessingDrawing" xmlns:wp="http://schemas.openxmlformats.org/drawingml/2006/wordprocessingDrawing" xmlns:w10="urn:schemas-microsoft-com:office:word" xmlns:w="http://schemas.openxmlformats.org/wordprocessingml/2006/main" xmlns:w14="http://schemas.microsoft.com/office/word/2010/wordml" xmlns:w15="http://schemas.microsoft.com/office/word/2012/wordml" xmlns:w16cex="http://schemas.microsoft.com/office/word/2018/wordml/cex" xmlns:w16cid="http://schemas.microsoft.com/office/word/2016/wordml/cid" xmlns:w16="http://schemas.microsoft.com/office/word/2018/wordml" xmlns:w16du="http://schemas.microsoft.com/office/word/2023/wordml/word16du" xmlns:w16sdtdh="http://schemas.microsoft.com/office/word/2020/wordml/sdtdatahash" xmlns:w16sdtfl="http://schemas.microsoft.com/office/word/2024/wordml/sdtformatlock" xmlns:w16se="http://schemas.microsoft.com/office/word/2015/wordml/symex" xmlns:wpg="http://schemas.microsoft.com/office/word/2010/wordprocessingGroup" xmlns:wpi="http://schemas.microsoft.com/office/word/2010/wordprocessingInk" xmlns:wne="http://schemas.microsoft.com/office/word/2006/wordml" xmlns:wps="http://schemas.microsoft.com/office/word/2010/wordprocessingShape" mc:Ignorable="w14 w15 w16se w16cid w16 w16cex w16sdtdh w16sdtfl w16du wp14">
   <w:p>
     <w:pPr>
       <w:pStyle w:val="Encabezado"/>
@@ -2382,7 +2389,7 @@
           <v:path o:extrusionok="f" gradientshapeok="t" o:connecttype="rect"/>
           <o:lock v:ext="edit" aspectratio="t"/>
         </v:shapetype>
-        <v:shape id="WordPictureWatermark404492063" o:spid="_x0000_s2050" type="#_x0000_t75" style="position:absolute;margin-left:0;margin-top:0;width:565.65pt;height:800pt;z-index:-251657216;mso-position-horizontal:center;mso-position-horizontal-relative:margin;mso-position-vertical:center;mso-position-vertical-relative:margin;mso-width-relative:page;mso-height-relative:page" o:allowincell="f">
+        <v:shape id="WordPictureWatermark404492063" o:spid="_x0000_s1026" type="#_x0000_t75" style="position:absolute;margin-left:0;margin-top:0;width:565.65pt;height:800pt;z-index:-251657216;mso-position-horizontal:center;mso-position-horizontal-relative:margin;mso-position-vertical:center;mso-position-vertical-relative:margin;mso-width-relative:page;mso-height-relative:page" o:allowincell="f">
           <v:imagedata r:id="rId1" o:title="Hoja Membretada - DirecciónAdmin"/>
           <w10:wrap anchorx="margin" anchory="margin"/>
         </v:shape>
@@ -2393,7 +2400,7 @@
 </file>
 
 <file path=word/header2.xml><?xml version="1.0" encoding="utf-8"?>
-<w:hdr xmlns:wpc="http://schemas.microsoft.com/office/word/2010/wordprocessingCanvas" xmlns:cx="http://schemas.microsoft.com/office/drawing/2014/chartex" xmlns:mc="http://schemas.openxmlformats.org/markup-compatibility/2006" xmlns:o="urn:schemas-microsoft-com:office:office" xmlns:r="http://schemas.openxmlformats.org/officeDocument/2006/relationships" xmlns:m="http://schemas.openxmlformats.org/officeDocument/2006/math" xmlns:v="urn:schemas-microsoft-com:vml" xmlns:wp14="http://schemas.microsoft.com/office/word/2010/wordprocessingDrawing" xmlns:wp="http://schemas.openxmlformats.org/drawingml/2006/wordprocessingDrawing" xmlns:w10="urn:schemas-microsoft-com:office:word" xmlns:w="http://schemas.openxmlformats.org/wordprocessingml/2006/main" xmlns:w14="http://schemas.microsoft.com/office/word/2010/wordml" xmlns:w15="http://schemas.microsoft.com/office/word/2012/wordml" xmlns:w16se="http://schemas.microsoft.com/office/word/2015/wordml/symex" xmlns:wpg="http://schemas.microsoft.com/office/word/2010/wordprocessingGroup" xmlns:wpi="http://schemas.microsoft.com/office/word/2010/wordprocessingInk" xmlns:wne="http://schemas.microsoft.com/office/word/2006/wordml" xmlns:wps="http://schemas.microsoft.com/office/word/2010/wordprocessingShape" mc:Ignorable="w14 w15 w16se wp14">
+<w:hdr xmlns:wpc="http://schemas.microsoft.com/office/word/2010/wordprocessingCanvas" xmlns:cx="http://schemas.microsoft.com/office/drawing/2014/chartex" xmlns:cx1="http://schemas.microsoft.com/office/drawing/2015/9/8/chartex" xmlns:cx2="http://schemas.microsoft.com/office/drawing/2015/10/21/chartex" xmlns:cx3="http://schemas.microsoft.com/office/drawing/2016/5/9/chartex" xmlns:cx4="http://schemas.microsoft.com/office/drawing/2016/5/10/chartex" xmlns:cx5="http://schemas.microsoft.com/office/drawing/2016/5/11/chartex" xmlns:cx6="http://schemas.microsoft.com/office/drawing/2016/5/12/chartex" xmlns:cx7="http://schemas.microsoft.com/office/drawing/2016/5/13/chartex" xmlns:cx8="http://schemas.microsoft.com/office/drawing/2016/5/14/chartex" xmlns:mc="http://schemas.openxmlformats.org/markup-compatibility/2006" xmlns:aink="http://schemas.microsoft.com/office/drawing/2016/ink" xmlns:am3d="http://schemas.microsoft.com/office/drawing/2017/model3d" xmlns:o="urn:schemas-microsoft-com:office:office" xmlns:oel="http://schemas.microsoft.com/office/2019/extlst" xmlns:r="http://schemas.openxmlformats.org/officeDocument/2006/relationships" xmlns:m="http://schemas.openxmlformats.org/officeDocument/2006/math" xmlns:v="urn:schemas-microsoft-com:vml" xmlns:wp14="http://schemas.microsoft.com/office/word/2010/wordprocessingDrawing" xmlns:wp="http://schemas.openxmlformats.org/drawingml/2006/wordprocessingDrawing" xmlns:w10="urn:schemas-microsoft-com:office:word" xmlns:w="http://schemas.openxmlformats.org/wordprocessingml/2006/main" xmlns:w14="http://schemas.microsoft.com/office/word/2010/wordml" xmlns:w15="http://schemas.microsoft.com/office/word/2012/wordml" xmlns:w16cex="http://schemas.microsoft.com/office/word/2018/wordml/cex" xmlns:w16cid="http://schemas.microsoft.com/office/word/2016/wordml/cid" xmlns:w16="http://schemas.microsoft.com/office/word/2018/wordml" xmlns:w16du="http://schemas.microsoft.com/office/word/2023/wordml/word16du" xmlns:w16sdtdh="http://schemas.microsoft.com/office/word/2020/wordml/sdtdatahash" xmlns:w16sdtfl="http://schemas.microsoft.com/office/word/2024/wordml/sdtformatlock" xmlns:w16se="http://schemas.microsoft.com/office/word/2015/wordml/symex" xmlns:wpg="http://schemas.microsoft.com/office/word/2010/wordprocessingGroup" xmlns:wpi="http://schemas.microsoft.com/office/word/2010/wordprocessingInk" xmlns:wne="http://schemas.microsoft.com/office/word/2006/wordml" xmlns:wps="http://schemas.microsoft.com/office/word/2010/wordprocessingShape" mc:Ignorable="w14 w15 w16se w16cid w16 w16cex w16sdtdh w16sdtfl w16du wp14">
   <w:p>
     <w:pPr>
       <w:pStyle w:val="Encabezado"/>
@@ -4519,7 +4526,7 @@
 </file>
 
 <file path=word/header3.xml><?xml version="1.0" encoding="utf-8"?>
-<w:hdr xmlns:wpc="http://schemas.microsoft.com/office/word/2010/wordprocessingCanvas" xmlns:cx="http://schemas.microsoft.com/office/drawing/2014/chartex" xmlns:mc="http://schemas.openxmlformats.org/markup-compatibility/2006" xmlns:o="urn:schemas-microsoft-com:office:office" xmlns:r="http://schemas.openxmlformats.org/officeDocument/2006/relationships" xmlns:m="http://schemas.openxmlformats.org/officeDocument/2006/math" xmlns:v="urn:schemas-microsoft-com:vml" xmlns:wp14="http://schemas.microsoft.com/office/word/2010/wordprocessingDrawing" xmlns:wp="http://schemas.openxmlformats.org/drawingml/2006/wordprocessingDrawing" xmlns:w10="urn:schemas-microsoft-com:office:word" xmlns:w="http://schemas.openxmlformats.org/wordprocessingml/2006/main" xmlns:w14="http://schemas.microsoft.com/office/word/2010/wordml" xmlns:w15="http://schemas.microsoft.com/office/word/2012/wordml" xmlns:w16se="http://schemas.microsoft.com/office/word/2015/wordml/symex" xmlns:wpg="http://schemas.microsoft.com/office/word/2010/wordprocessingGroup" xmlns:wpi="http://schemas.microsoft.com/office/word/2010/wordprocessingInk" xmlns:wne="http://schemas.microsoft.com/office/word/2006/wordml" xmlns:wps="http://schemas.microsoft.com/office/word/2010/wordprocessingShape" mc:Ignorable="w14 w15 w16se wp14">
+<w:hdr xmlns:wpc="http://schemas.microsoft.com/office/word/2010/wordprocessingCanvas" xmlns:cx="http://schemas.microsoft.com/office/drawing/2014/chartex" xmlns:cx1="http://schemas.microsoft.com/office/drawing/2015/9/8/chartex" xmlns:cx2="http://schemas.microsoft.com/office/drawing/2015/10/21/chartex" xmlns:cx3="http://schemas.microsoft.com/office/drawing/2016/5/9/chartex" xmlns:cx4="http://schemas.microsoft.com/office/drawing/2016/5/10/chartex" xmlns:cx5="http://schemas.microsoft.com/office/drawing/2016/5/11/chartex" xmlns:cx6="http://schemas.microsoft.com/office/drawing/2016/5/12/chartex" xmlns:cx7="http://schemas.microsoft.com/office/drawing/2016/5/13/chartex" xmlns:cx8="http://schemas.microsoft.com/office/drawing/2016/5/14/chartex" xmlns:mc="http://schemas.openxmlformats.org/markup-compatibility/2006" xmlns:aink="http://schemas.microsoft.com/office/drawing/2016/ink" xmlns:am3d="http://schemas.microsoft.com/office/drawing/2017/model3d" xmlns:o="urn:schemas-microsoft-com:office:office" xmlns:oel="http://schemas.microsoft.com/office/2019/extlst" xmlns:r="http://schemas.openxmlformats.org/officeDocument/2006/relationships" xmlns:m="http://schemas.openxmlformats.org/officeDocument/2006/math" xmlns:v="urn:schemas-microsoft-com:vml" xmlns:wp14="http://schemas.microsoft.com/office/word/2010/wordprocessingDrawing" xmlns:wp="http://schemas.openxmlformats.org/drawingml/2006/wordprocessingDrawing" xmlns:w10="urn:schemas-microsoft-com:office:word" xmlns:w="http://schemas.openxmlformats.org/wordprocessingml/2006/main" xmlns:w14="http://schemas.microsoft.com/office/word/2010/wordml" xmlns:w15="http://schemas.microsoft.com/office/word/2012/wordml" xmlns:w16cex="http://schemas.microsoft.com/office/word/2018/wordml/cex" xmlns:w16cid="http://schemas.microsoft.com/office/word/2016/wordml/cid" xmlns:w16="http://schemas.microsoft.com/office/word/2018/wordml" xmlns:w16du="http://schemas.microsoft.com/office/word/2023/wordml/word16du" xmlns:w16sdtdh="http://schemas.microsoft.com/office/word/2020/wordml/sdtdatahash" xmlns:w16sdtfl="http://schemas.microsoft.com/office/word/2024/wordml/sdtformatlock" xmlns:w16se="http://schemas.microsoft.com/office/word/2015/wordml/symex" xmlns:wpg="http://schemas.microsoft.com/office/word/2010/wordprocessingGroup" xmlns:wpi="http://schemas.microsoft.com/office/word/2010/wordprocessingInk" xmlns:wne="http://schemas.microsoft.com/office/word/2006/wordml" xmlns:wps="http://schemas.microsoft.com/office/word/2010/wordprocessingShape" mc:Ignorable="w14 w15 w16se w16cid w16 w16cex w16sdtdh w16sdtfl w16du wp14">
   <w:p>
     <w:pPr>
       <w:pStyle w:val="Encabezado"/>
@@ -4545,7 +4552,7 @@
           <v:path o:extrusionok="f" gradientshapeok="t" o:connecttype="rect"/>
           <o:lock v:ext="edit" aspectratio="t"/>
         </v:shapetype>
-        <v:shape id="WordPictureWatermark404492062" o:spid="_x0000_s2049" type="#_x0000_t75" style="position:absolute;margin-left:0;margin-top:0;width:565.65pt;height:800pt;z-index:-251656192;mso-position-horizontal:center;mso-position-horizontal-relative:margin;mso-position-vertical:center;mso-position-vertical-relative:margin;mso-width-relative:page;mso-height-relative:page" o:allowincell="f">
+        <v:shape id="WordPictureWatermark404492062" o:spid="_x0000_s1025" type="#_x0000_t75" style="position:absolute;margin-left:0;margin-top:0;width:565.65pt;height:800pt;z-index:-251656192;mso-position-horizontal:center;mso-position-horizontal-relative:margin;mso-position-vertical:center;mso-position-vertical-relative:margin;mso-width-relative:page;mso-height-relative:page" o:allowincell="f">
           <v:imagedata r:id="rId1" o:title="Hoja Membretada - DirecciónAdmin"/>
           <w10:wrap anchorx="margin" anchory="margin"/>
         </v:shape>
@@ -4556,7 +4563,7 @@
 </file>
 
 <file path=word/styles.xml><?xml version="1.0" encoding="utf-8"?>
-<w:styles xmlns:mc="http://schemas.openxmlformats.org/markup-compatibility/2006" xmlns:r="http://schemas.openxmlformats.org/officeDocument/2006/relationships" xmlns:w="http://schemas.openxmlformats.org/wordprocessingml/2006/main" xmlns:w14="http://schemas.microsoft.com/office/word/2010/wordml" xmlns:w15="http://schemas.microsoft.com/office/word/2012/wordml" xmlns:w16se="http://schemas.microsoft.com/office/word/2015/wordml/symex" mc:Ignorable="w14 w15 w16se">
+<w:styles xmlns:mc="http://schemas.openxmlformats.org/markup-compatibility/2006" xmlns:r="http://schemas.openxmlformats.org/officeDocument/2006/relationships" xmlns:w="http://schemas.openxmlformats.org/wordprocessingml/2006/main" xmlns:w14="http://schemas.microsoft.com/office/word/2010/wordml" xmlns:w15="http://schemas.microsoft.com/office/word/2012/wordml" xmlns:w16cex="http://schemas.microsoft.com/office/word/2018/wordml/cex" xmlns:w16cid="http://schemas.microsoft.com/office/word/2016/wordml/cid" xmlns:w16="http://schemas.microsoft.com/office/word/2018/wordml" xmlns:w16du="http://schemas.microsoft.com/office/word/2023/wordml/word16du" xmlns:w16sdtdh="http://schemas.microsoft.com/office/word/2020/wordml/sdtdatahash" xmlns:w16sdtfl="http://schemas.microsoft.com/office/word/2024/wordml/sdtformatlock" xmlns:w16se="http://schemas.microsoft.com/office/word/2015/wordml/symex" mc:Ignorable="w14 w15 w16se w16cid w16 w16cex w16sdtdh w16sdtfl w16du">
   <w:docDefaults>
     <w:rPrDefault>
       <w:rPr>
@@ -4566,7 +4573,7 @@
     </w:rPrDefault>
     <w:pPrDefault/>
   </w:docDefaults>
-  <w:latentStyles w:defLockedState="0" w:defUIPriority="99" w:defSemiHidden="0" w:defUnhideWhenUsed="0" w:defQFormat="0" w:count="371">
+  <w:latentStyles w:defLockedState="0" w:defUIPriority="99" w:defSemiHidden="0" w:defUnhideWhenUsed="0" w:defQFormat="0" w:count="376">
     <w:lsdException w:name="Normal" w:uiPriority="0" w:qFormat="1"/>
     <w:lsdException w:name="heading 1" w:uiPriority="9" w:qFormat="1"/>
     <w:lsdException w:name="heading 2" w:semiHidden="1" w:uiPriority="9" w:unhideWhenUsed="1" w:qFormat="1"/>
@@ -4938,6 +4945,11 @@
     <w:lsdException w:name="List Table 5 Dark Accent 6" w:uiPriority="50"/>
     <w:lsdException w:name="List Table 6 Colorful Accent 6" w:uiPriority="51"/>
     <w:lsdException w:name="List Table 7 Colorful Accent 6" w:uiPriority="52"/>
+    <w:lsdException w:name="Mention" w:semiHidden="1" w:unhideWhenUsed="1"/>
+    <w:lsdException w:name="Smart Hyperlink" w:semiHidden="1" w:unhideWhenUsed="1"/>
+    <w:lsdException w:name="Hashtag" w:semiHidden="1" w:unhideWhenUsed="1"/>
+    <w:lsdException w:name="Unresolved Mention" w:semiHidden="1" w:unhideWhenUsed="1"/>
+    <w:lsdException w:name="Smart Link" w:semiHidden="1" w:unhideWhenUsed="1"/>
   </w:latentStyles>
   <w:style w:type="paragraph" w:default="1" w:styleId="Normal">
     <w:name w:val="Normal"/>

</xml_diff>